<commit_message>
01_use_case_spec.docx 재생성 (최신 md 반영, 모든 셀 경계 실선)
- UC-01~UC-06 6개 테이블, 각 셀 4방향 single 실선 경계
- Main/Alternative Flow 단계별 줄바꿈, 헤더/라벨 셀 음영 처리
- UC-03 보안 격리, UC-06 Pre-Condition 등 최신 수정 반영

Co-Authored-By: Claude Opus 4.8 <noreply@anthropic.com>
</commit_message>
<xml_diff>
--- a/docs/01_use_case_spec.docx
+++ b/docs/01_use_case_spec.docx
@@ -5,55 +5,44 @@
     <w:p>
       <w:pPr>
         <w:pStyle w:val="Heading1"/>
-        <w:jc w:val="center"/>
       </w:pPr>
       <w:r>
         <w:rPr>
-          <w:rFonts w:ascii="Malgun Gothic" w:hAnsi="Malgun Gothic" w:eastAsia="Malgun Gothic"/>
+          <w:rFonts w:ascii="맑은 고딕" w:hAnsi="맑은 고딕" w:eastAsia="맑은 고딕"/>
         </w:rPr>
         <w:t>유즈케이스 명세</w:t>
       </w:r>
     </w:p>
+    <w:p/>
     <w:tbl>
       <w:tblPr>
-        <w:tblStyle w:val="TableGrid"/>
         <w:tblW w:type="auto" w:w="0"/>
-        <w:tblLayout w:type="autofit"/>
+        <w:tblLayout w:type="fixed"/>
         <w:tblLook w:firstColumn="1" w:firstRow="1" w:lastColumn="0" w:lastRow="0" w:noHBand="0" w:noVBand="1" w:val="04A0"/>
-        <w:tblBorders>
-          <w:top w:val="single" w:sz="8" w:space="0" w:color="000000"/>
-          <w:left w:val="single" w:sz="8" w:space="0" w:color="000000"/>
-          <w:bottom w:val="single" w:sz="8" w:space="0" w:color="000000"/>
-          <w:right w:val="single" w:sz="8" w:space="0" w:color="000000"/>
-          <w:insideH w:val="single" w:sz="8" w:space="0" w:color="000000"/>
-          <w:insideV w:val="single" w:sz="8" w:space="0" w:color="000000"/>
-        </w:tblBorders>
       </w:tblPr>
       <w:tblGrid>
-        <w:gridCol w:w="5100"/>
-        <w:gridCol w:w="5100"/>
+        <w:gridCol w:w="4320"/>
+        <w:gridCol w:w="4320"/>
       </w:tblGrid>
       <w:tr>
         <w:tc>
           <w:tcPr>
-            <w:tcW w:type="dxa" w:w="2268"/>
-            <w:vAlign w:val="center"/>
-            <w:shd w:fill="EDEDED"/>
+            <w:tcW w:type="dxa" w:w="2200"/>
+            <w:shd w:val="clear" w:color="auto" w:fill="D9E2F3"/>
+            <w:tcBorders>
+              <w:top w:val="single" w:sz="8" w:space="0" w:color="000000"/>
+              <w:left w:val="single" w:sz="8" w:space="0" w:color="000000"/>
+              <w:bottom w:val="single" w:sz="8" w:space="0" w:color="000000"/>
+              <w:right w:val="single" w:sz="8" w:space="0" w:color="000000"/>
+            </w:tcBorders>
           </w:tcPr>
           <w:p>
             <w:pPr>
-              <w:spacing w:after="0" w:line="276" w:lineRule="auto"/>
-              <w:ind w:left="0"/>
-              <w:jc w:val="center"/>
+              <w:spacing w:after="40" w:before="0"/>
             </w:pPr>
             <w:r>
               <w:rPr>
-                <w:b/>
-              </w:rPr>
-            </w:r>
-            <w:r>
-              <w:rPr>
-                <w:rFonts w:ascii="Malgun Gothic" w:hAnsi="Malgun Gothic"/>
+                <w:rFonts w:ascii="맑은 고딕" w:hAnsi="맑은 고딕" w:eastAsia="맑은 고딕"/>
                 <w:b/>
                 <w:sz w:val="20"/>
               </w:rPr>
@@ -63,24 +52,22 @@
         </w:tc>
         <w:tc>
           <w:tcPr>
-            <w:tcW w:type="dxa" w:w="7371"/>
-            <w:vAlign w:val="center"/>
-            <w:shd w:fill="EDEDED"/>
+            <w:tcW w:type="dxa" w:w="7200"/>
+            <w:shd w:val="clear" w:color="auto" w:fill="D9E2F3"/>
+            <w:tcBorders>
+              <w:top w:val="single" w:sz="8" w:space="0" w:color="000000"/>
+              <w:left w:val="single" w:sz="8" w:space="0" w:color="000000"/>
+              <w:bottom w:val="single" w:sz="8" w:space="0" w:color="000000"/>
+              <w:right w:val="single" w:sz="8" w:space="0" w:color="000000"/>
+            </w:tcBorders>
           </w:tcPr>
           <w:p>
             <w:pPr>
-              <w:spacing w:after="0" w:line="276" w:lineRule="auto"/>
-              <w:ind w:left="0"/>
-              <w:jc w:val="center"/>
+              <w:spacing w:after="40" w:before="0"/>
             </w:pPr>
             <w:r>
               <w:rPr>
-                <w:b/>
-              </w:rPr>
-            </w:r>
-            <w:r>
-              <w:rPr>
-                <w:rFonts w:ascii="Malgun Gothic" w:hAnsi="Malgun Gothic"/>
+                <w:rFonts w:ascii="맑은 고딕" w:hAnsi="맑은 고딕" w:eastAsia="맑은 고딕"/>
                 <w:b/>
                 <w:sz w:val="20"/>
               </w:rPr>
@@ -92,23 +79,22 @@
       <w:tr>
         <w:tc>
           <w:tcPr>
-            <w:tcW w:type="dxa" w:w="2268"/>
-            <w:vAlign w:val="center"/>
-            <w:shd w:fill="EDEDED"/>
+            <w:tcW w:type="dxa" w:w="2200"/>
+            <w:shd w:val="clear" w:color="auto" w:fill="F2F2F2"/>
+            <w:tcBorders>
+              <w:top w:val="single" w:sz="8" w:space="0" w:color="000000"/>
+              <w:left w:val="single" w:sz="8" w:space="0" w:color="000000"/>
+              <w:bottom w:val="single" w:sz="8" w:space="0" w:color="000000"/>
+              <w:right w:val="single" w:sz="8" w:space="0" w:color="000000"/>
+            </w:tcBorders>
           </w:tcPr>
           <w:p>
             <w:pPr>
-              <w:spacing w:after="0" w:line="276" w:lineRule="auto"/>
-              <w:ind w:left="0"/>
+              <w:spacing w:after="40" w:before="0"/>
             </w:pPr>
             <w:r>
               <w:rPr>
-                <w:b/>
-              </w:rPr>
-            </w:r>
-            <w:r>
-              <w:rPr>
-                <w:rFonts w:ascii="Malgun Gothic" w:hAnsi="Malgun Gothic"/>
+                <w:rFonts w:ascii="맑은 고딕" w:hAnsi="맑은 고딕" w:eastAsia="맑은 고딕"/>
                 <w:b/>
                 <w:sz w:val="20"/>
               </w:rPr>
@@ -118,21 +104,25 @@
         </w:tc>
         <w:tc>
           <w:tcPr>
-            <w:tcW w:type="dxa" w:w="7371"/>
-            <w:vAlign w:val="center"/>
+            <w:tcW w:type="dxa" w:w="7200"/>
+            <w:tcBorders>
+              <w:top w:val="single" w:sz="8" w:space="0" w:color="000000"/>
+              <w:left w:val="single" w:sz="8" w:space="0" w:color="000000"/>
+              <w:bottom w:val="single" w:sz="8" w:space="0" w:color="000000"/>
+              <w:right w:val="single" w:sz="8" w:space="0" w:color="000000"/>
+            </w:tcBorders>
           </w:tcPr>
           <w:p>
             <w:pPr>
-              <w:spacing w:after="0" w:line="276" w:lineRule="auto"/>
-              <w:ind w:left="0"/>
+              <w:spacing w:after="40" w:before="0"/>
             </w:pPr>
-            <w:r/>
             <w:r>
               <w:rPr>
-                <w:rFonts w:ascii="Malgun Gothic" w:hAnsi="Malgun Gothic"/>
+                <w:rFonts w:ascii="맑은 고딕" w:hAnsi="맑은 고딕" w:eastAsia="맑은 고딕"/>
+                <w:b w:val="0"/>
                 <w:sz w:val="20"/>
               </w:rPr>
-              <w:t>사용자</w:t>
+              <w:t>Host Application</w:t>
             </w:r>
           </w:p>
         </w:tc>
@@ -140,23 +130,22 @@
       <w:tr>
         <w:tc>
           <w:tcPr>
-            <w:tcW w:type="dxa" w:w="2268"/>
-            <w:vAlign w:val="center"/>
-            <w:shd w:fill="EDEDED"/>
+            <w:tcW w:type="dxa" w:w="2200"/>
+            <w:shd w:val="clear" w:color="auto" w:fill="F2F2F2"/>
+            <w:tcBorders>
+              <w:top w:val="single" w:sz="8" w:space="0" w:color="000000"/>
+              <w:left w:val="single" w:sz="8" w:space="0" w:color="000000"/>
+              <w:bottom w:val="single" w:sz="8" w:space="0" w:color="000000"/>
+              <w:right w:val="single" w:sz="8" w:space="0" w:color="000000"/>
+            </w:tcBorders>
           </w:tcPr>
           <w:p>
             <w:pPr>
-              <w:spacing w:after="0" w:line="276" w:lineRule="auto"/>
-              <w:ind w:left="0"/>
+              <w:spacing w:after="40" w:before="0"/>
             </w:pPr>
             <w:r>
               <w:rPr>
-                <w:b/>
-              </w:rPr>
-            </w:r>
-            <w:r>
-              <w:rPr>
-                <w:rFonts w:ascii="Malgun Gothic" w:hAnsi="Malgun Gothic"/>
+                <w:rFonts w:ascii="맑은 고딕" w:hAnsi="맑은 고딕" w:eastAsia="맑은 고딕"/>
                 <w:b/>
                 <w:sz w:val="20"/>
               </w:rPr>
@@ -166,18 +155,22 @@
         </w:tc>
         <w:tc>
           <w:tcPr>
-            <w:tcW w:type="dxa" w:w="7371"/>
-            <w:vAlign w:val="center"/>
+            <w:tcW w:type="dxa" w:w="7200"/>
+            <w:tcBorders>
+              <w:top w:val="single" w:sz="8" w:space="0" w:color="000000"/>
+              <w:left w:val="single" w:sz="8" w:space="0" w:color="000000"/>
+              <w:bottom w:val="single" w:sz="8" w:space="0" w:color="000000"/>
+              <w:right w:val="single" w:sz="8" w:space="0" w:color="000000"/>
+            </w:tcBorders>
           </w:tcPr>
           <w:p>
             <w:pPr>
-              <w:spacing w:after="0" w:line="276" w:lineRule="auto"/>
-              <w:ind w:left="0"/>
+              <w:spacing w:after="40" w:before="0"/>
             </w:pPr>
-            <w:r/>
             <w:r>
               <w:rPr>
-                <w:rFonts w:ascii="Malgun Gothic" w:hAnsi="Malgun Gothic"/>
+                <w:rFonts w:ascii="맑은 고딕" w:hAnsi="맑은 고딕" w:eastAsia="맑은 고딕"/>
+                <w:b w:val="0"/>
                 <w:sz w:val="20"/>
               </w:rPr>
               <w:t>시스템이 부팅되어 있고 pVM 이미지가 서명된 상태로 준비되어 있다</w:t>
@@ -188,23 +181,22 @@
       <w:tr>
         <w:tc>
           <w:tcPr>
-            <w:tcW w:type="dxa" w:w="2268"/>
-            <w:vAlign w:val="center"/>
-            <w:shd w:fill="EDEDED"/>
+            <w:tcW w:type="dxa" w:w="2200"/>
+            <w:shd w:val="clear" w:color="auto" w:fill="F2F2F2"/>
+            <w:tcBorders>
+              <w:top w:val="single" w:sz="8" w:space="0" w:color="000000"/>
+              <w:left w:val="single" w:sz="8" w:space="0" w:color="000000"/>
+              <w:bottom w:val="single" w:sz="8" w:space="0" w:color="000000"/>
+              <w:right w:val="single" w:sz="8" w:space="0" w:color="000000"/>
+            </w:tcBorders>
           </w:tcPr>
           <w:p>
             <w:pPr>
-              <w:spacing w:after="0" w:line="276" w:lineRule="auto"/>
-              <w:ind w:left="0"/>
+              <w:spacing w:after="40" w:before="0"/>
             </w:pPr>
             <w:r>
               <w:rPr>
-                <w:b/>
-              </w:rPr>
-            </w:r>
-            <w:r>
-              <w:rPr>
-                <w:rFonts w:ascii="Malgun Gothic" w:hAnsi="Malgun Gothic"/>
+                <w:rFonts w:ascii="맑은 고딕" w:hAnsi="맑은 고딕" w:eastAsia="맑은 고딕"/>
                 <w:b/>
                 <w:sz w:val="20"/>
               </w:rPr>
@@ -214,18 +206,22 @@
         </w:tc>
         <w:tc>
           <w:tcPr>
-            <w:tcW w:type="dxa" w:w="7371"/>
-            <w:vAlign w:val="center"/>
+            <w:tcW w:type="dxa" w:w="7200"/>
+            <w:tcBorders>
+              <w:top w:val="single" w:sz="8" w:space="0" w:color="000000"/>
+              <w:left w:val="single" w:sz="8" w:space="0" w:color="000000"/>
+              <w:bottom w:val="single" w:sz="8" w:space="0" w:color="000000"/>
+              <w:right w:val="single" w:sz="8" w:space="0" w:color="000000"/>
+            </w:tcBorders>
           </w:tcPr>
           <w:p>
             <w:pPr>
-              <w:spacing w:after="0" w:line="276" w:lineRule="auto"/>
-              <w:ind w:left="0"/>
+              <w:spacing w:after="40" w:before="0"/>
             </w:pPr>
-            <w:r/>
             <w:r>
               <w:rPr>
-                <w:rFonts w:ascii="Malgun Gothic" w:hAnsi="Malgun Gothic"/>
+                <w:rFonts w:ascii="맑은 고딕" w:hAnsi="맑은 고딕" w:eastAsia="맑은 고딕"/>
+                <w:b w:val="0"/>
                 <w:sz w:val="20"/>
               </w:rPr>
               <w:t>pVM이 요청된 상태(Running 또는 Stopped)로 전환되었다</w:t>
@@ -236,23 +232,22 @@
       <w:tr>
         <w:tc>
           <w:tcPr>
-            <w:tcW w:type="dxa" w:w="2268"/>
-            <w:vAlign w:val="center"/>
-            <w:shd w:fill="EDEDED"/>
+            <w:tcW w:type="dxa" w:w="2200"/>
+            <w:shd w:val="clear" w:color="auto" w:fill="F2F2F2"/>
+            <w:tcBorders>
+              <w:top w:val="single" w:sz="8" w:space="0" w:color="000000"/>
+              <w:left w:val="single" w:sz="8" w:space="0" w:color="000000"/>
+              <w:bottom w:val="single" w:sz="8" w:space="0" w:color="000000"/>
+              <w:right w:val="single" w:sz="8" w:space="0" w:color="000000"/>
+            </w:tcBorders>
           </w:tcPr>
           <w:p>
             <w:pPr>
-              <w:spacing w:after="0" w:line="276" w:lineRule="auto"/>
-              <w:ind w:left="0"/>
+              <w:spacing w:after="40" w:before="0"/>
             </w:pPr>
             <w:r>
               <w:rPr>
-                <w:b/>
-              </w:rPr>
-            </w:r>
-            <w:r>
-              <w:rPr>
-                <w:rFonts w:ascii="Malgun Gothic" w:hAnsi="Malgun Gothic"/>
+                <w:rFonts w:ascii="맑은 고딕" w:hAnsi="맑은 고딕" w:eastAsia="맑은 고딕"/>
                 <w:b/>
                 <w:sz w:val="20"/>
               </w:rPr>
@@ -262,86 +257,90 @@
         </w:tc>
         <w:tc>
           <w:tcPr>
-            <w:tcW w:type="dxa" w:w="7371"/>
-            <w:vAlign w:val="center"/>
+            <w:tcW w:type="dxa" w:w="7200"/>
+            <w:tcBorders>
+              <w:top w:val="single" w:sz="8" w:space="0" w:color="000000"/>
+              <w:left w:val="single" w:sz="8" w:space="0" w:color="000000"/>
+              <w:bottom w:val="single" w:sz="8" w:space="0" w:color="000000"/>
+              <w:right w:val="single" w:sz="8" w:space="0" w:color="000000"/>
+            </w:tcBorders>
           </w:tcPr>
           <w:p>
             <w:pPr>
-              <w:spacing w:after="0" w:line="276" w:lineRule="auto"/>
-              <w:ind w:left="0"/>
+              <w:spacing w:after="40" w:before="0"/>
             </w:pPr>
-            <w:r/>
             <w:r>
               <w:rPr>
-                <w:rFonts w:ascii="Malgun Gothic" w:hAnsi="Malgun Gothic"/>
+                <w:rFonts w:ascii="맑은 고딕" w:hAnsi="맑은 고딕" w:eastAsia="맑은 고딕"/>
+                <w:b w:val="0"/>
                 <w:sz w:val="20"/>
               </w:rPr>
-              <w:t>1. 사용자가 pVM API로 pVM 생성을 요청한다</w:t>
+              <w:t>1. Host Application이 pVM API로 pVM 생성을 요청한다</w:t>
             </w:r>
           </w:p>
           <w:p>
             <w:pPr>
-              <w:spacing w:after="0" w:line="276" w:lineRule="auto"/>
-              <w:ind w:left="0"/>
+              <w:spacing w:after="40" w:before="0"/>
             </w:pPr>
             <w:r>
               <w:rPr>
-                <w:rFonts w:ascii="Malgun Gothic" w:hAnsi="Malgun Gothic"/>
+                <w:rFonts w:ascii="맑은 고딕" w:hAnsi="맑은 고딕" w:eastAsia="맑은 고딕"/>
+                <w:b w:val="0"/>
                 <w:sz w:val="20"/>
               </w:rPr>
-              <w:t>2. 시스템이 메모리/CPU 자원을 할당하고 pVM 인스턴스를 초기화한다</w:t>
+              <w:t>2. 시스템은 메모리/CPU 자원을 할당하고 pVM 인스턴스를 초기화한다</w:t>
             </w:r>
           </w:p>
           <w:p>
             <w:pPr>
-              <w:spacing w:after="0" w:line="276" w:lineRule="auto"/>
-              <w:ind w:left="0"/>
+              <w:spacing w:after="40" w:before="0"/>
             </w:pPr>
             <w:r>
               <w:rPr>
-                <w:rFonts w:ascii="Malgun Gothic" w:hAnsi="Malgun Gothic"/>
+                <w:rFonts w:ascii="맑은 고딕" w:hAnsi="맑은 고딕" w:eastAsia="맑은 고딕"/>
+                <w:b w:val="0"/>
                 <w:sz w:val="20"/>
               </w:rPr>
-              <w:t>3. 사용자가 pVM 시작 명령을 호출한다</w:t>
+              <w:t>3. Host Application이 pVM 시작 명령을 호출한다</w:t>
             </w:r>
           </w:p>
           <w:p>
             <w:pPr>
-              <w:spacing w:after="0" w:line="276" w:lineRule="auto"/>
-              <w:ind w:left="0"/>
+              <w:spacing w:after="40" w:before="0"/>
             </w:pPr>
             <w:r>
               <w:rPr>
-                <w:rFonts w:ascii="Malgun Gothic" w:hAnsi="Malgun Gothic"/>
+                <w:rFonts w:ascii="맑은 고딕" w:hAnsi="맑은 고딕" w:eastAsia="맑은 고딕"/>
+                <w:b w:val="0"/>
                 <w:sz w:val="20"/>
               </w:rPr>
-              <w:t>4. pVM이 격리된 상태로 Running 상태가 된다</w:t>
+              <w:t>4. 시스템은 pVM을 Running 상태로 전환한다</w:t>
             </w:r>
           </w:p>
           <w:p>
             <w:pPr>
-              <w:spacing w:after="0" w:line="276" w:lineRule="auto"/>
-              <w:ind w:left="0"/>
+              <w:spacing w:after="40" w:before="0"/>
             </w:pPr>
             <w:r>
               <w:rPr>
-                <w:rFonts w:ascii="Malgun Gothic" w:hAnsi="Malgun Gothic"/>
+                <w:rFonts w:ascii="맑은 고딕" w:hAnsi="맑은 고딕" w:eastAsia="맑은 고딕"/>
+                <w:b w:val="0"/>
                 <w:sz w:val="20"/>
               </w:rPr>
-              <w:t>5. 사용자가 pVM 정지 명령을 호출한다</w:t>
+              <w:t>5. Host Application이 pVM 정지 명령을 호출한다</w:t>
             </w:r>
           </w:p>
           <w:p>
             <w:pPr>
-              <w:spacing w:after="0" w:line="276" w:lineRule="auto"/>
-              <w:ind w:left="0"/>
+              <w:spacing w:after="40" w:before="0"/>
             </w:pPr>
             <w:r>
               <w:rPr>
-                <w:rFonts w:ascii="Malgun Gothic" w:hAnsi="Malgun Gothic"/>
+                <w:rFonts w:ascii="맑은 고딕" w:hAnsi="맑은 고딕" w:eastAsia="맑은 고딕"/>
+                <w:b w:val="0"/>
                 <w:sz w:val="20"/>
               </w:rPr>
-              <w:t>6. 시스템이 pVM을 종료하고 할당 자원을 회수한다</w:t>
+              <w:t>6. 시스템은 pVM을 종료하고 할당 자원을 회수한다</w:t>
             </w:r>
           </w:p>
         </w:tc>
@@ -349,23 +348,22 @@
       <w:tr>
         <w:tc>
           <w:tcPr>
-            <w:tcW w:type="dxa" w:w="2268"/>
-            <w:vAlign w:val="center"/>
-            <w:shd w:fill="EDEDED"/>
+            <w:tcW w:type="dxa" w:w="2200"/>
+            <w:shd w:val="clear" w:color="auto" w:fill="F2F2F2"/>
+            <w:tcBorders>
+              <w:top w:val="single" w:sz="8" w:space="0" w:color="000000"/>
+              <w:left w:val="single" w:sz="8" w:space="0" w:color="000000"/>
+              <w:bottom w:val="single" w:sz="8" w:space="0" w:color="000000"/>
+              <w:right w:val="single" w:sz="8" w:space="0" w:color="000000"/>
+            </w:tcBorders>
           </w:tcPr>
           <w:p>
             <w:pPr>
-              <w:spacing w:after="0" w:line="276" w:lineRule="auto"/>
-              <w:ind w:left="0"/>
+              <w:spacing w:after="40" w:before="0"/>
             </w:pPr>
             <w:r>
               <w:rPr>
-                <w:b/>
-              </w:rPr>
-            </w:r>
-            <w:r>
-              <w:rPr>
-                <w:rFonts w:ascii="Malgun Gothic" w:hAnsi="Malgun Gothic"/>
+                <w:rFonts w:ascii="맑은 고딕" w:hAnsi="맑은 고딕" w:eastAsia="맑은 고딕"/>
                 <w:b/>
                 <w:sz w:val="20"/>
               </w:rPr>
@@ -375,21 +373,51 @@
         </w:tc>
         <w:tc>
           <w:tcPr>
-            <w:tcW w:type="dxa" w:w="7371"/>
-            <w:vAlign w:val="center"/>
+            <w:tcW w:type="dxa" w:w="7200"/>
+            <w:tcBorders>
+              <w:top w:val="single" w:sz="8" w:space="0" w:color="000000"/>
+              <w:left w:val="single" w:sz="8" w:space="0" w:color="000000"/>
+              <w:bottom w:val="single" w:sz="8" w:space="0" w:color="000000"/>
+              <w:right w:val="single" w:sz="8" w:space="0" w:color="000000"/>
+            </w:tcBorders>
           </w:tcPr>
           <w:p>
             <w:pPr>
-              <w:spacing w:after="0" w:line="276" w:lineRule="auto"/>
-              <w:ind w:left="0"/>
+              <w:spacing w:after="40" w:before="0"/>
             </w:pPr>
-            <w:r/>
             <w:r>
               <w:rPr>
-                <w:rFonts w:ascii="Malgun Gothic" w:hAnsi="Malgun Gothic"/>
+                <w:rFonts w:ascii="맑은 고딕" w:hAnsi="맑은 고딕" w:eastAsia="맑은 고딕"/>
+                <w:b w:val="0"/>
                 <w:sz w:val="20"/>
               </w:rPr>
-              <w:t>pVM생성 실패 시 pVM 생성을 중단하고 사용자에게 오류를 반환한다</w:t>
+              <w:t>1. 시스템은 pVM 생성 실패 시 생성을 중단하고 Host Application에 오류를 반환한다</w:t>
+            </w:r>
+          </w:p>
+          <w:p>
+            <w:pPr>
+              <w:spacing w:after="40" w:before="0"/>
+            </w:pPr>
+            <w:r>
+              <w:rPr>
+                <w:rFonts w:ascii="맑은 고딕" w:hAnsi="맑은 고딕" w:eastAsia="맑은 고딕"/>
+                <w:b w:val="0"/>
+                <w:sz w:val="20"/>
+              </w:rPr>
+              <w:t>2. 시스템은 pVM 시작 실패 시 할당 자원을 회수하고 Host Application에 실패 상태를 반환한다</w:t>
+            </w:r>
+          </w:p>
+          <w:p>
+            <w:pPr>
+              <w:spacing w:after="40" w:before="0"/>
+            </w:pPr>
+            <w:r>
+              <w:rPr>
+                <w:rFonts w:ascii="맑은 고딕" w:hAnsi="맑은 고딕" w:eastAsia="맑은 고딕"/>
+                <w:b w:val="0"/>
+                <w:sz w:val="20"/>
+              </w:rPr>
+              <w:t>3. 시스템은 pVM 정지 명령이 시간 내 완료되지 않으면 강제 종료 절차를 수행하고 결과를 기록한다</w:t>
             </w:r>
           </w:p>
         </w:tc>
@@ -398,44 +426,33 @@
     <w:p/>
     <w:tbl>
       <w:tblPr>
-        <w:tblStyle w:val="TableGrid"/>
         <w:tblW w:type="auto" w:w="0"/>
-        <w:tblLayout w:type="autofit"/>
+        <w:tblLayout w:type="fixed"/>
         <w:tblLook w:firstColumn="1" w:firstRow="1" w:lastColumn="0" w:lastRow="0" w:noHBand="0" w:noVBand="1" w:val="04A0"/>
-        <w:tblBorders>
-          <w:top w:val="single" w:sz="8" w:space="0" w:color="000000"/>
-          <w:left w:val="single" w:sz="8" w:space="0" w:color="000000"/>
-          <w:bottom w:val="single" w:sz="8" w:space="0" w:color="000000"/>
-          <w:right w:val="single" w:sz="8" w:space="0" w:color="000000"/>
-          <w:insideH w:val="single" w:sz="8" w:space="0" w:color="000000"/>
-          <w:insideV w:val="single" w:sz="8" w:space="0" w:color="000000"/>
-        </w:tblBorders>
       </w:tblPr>
       <w:tblGrid>
-        <w:gridCol w:w="5100"/>
-        <w:gridCol w:w="5100"/>
+        <w:gridCol w:w="4320"/>
+        <w:gridCol w:w="4320"/>
       </w:tblGrid>
       <w:tr>
         <w:tc>
           <w:tcPr>
-            <w:tcW w:type="dxa" w:w="2268"/>
-            <w:vAlign w:val="center"/>
-            <w:shd w:fill="EDEDED"/>
+            <w:tcW w:type="dxa" w:w="2200"/>
+            <w:shd w:val="clear" w:color="auto" w:fill="D9E2F3"/>
+            <w:tcBorders>
+              <w:top w:val="single" w:sz="8" w:space="0" w:color="000000"/>
+              <w:left w:val="single" w:sz="8" w:space="0" w:color="000000"/>
+              <w:bottom w:val="single" w:sz="8" w:space="0" w:color="000000"/>
+              <w:right w:val="single" w:sz="8" w:space="0" w:color="000000"/>
+            </w:tcBorders>
           </w:tcPr>
           <w:p>
             <w:pPr>
-              <w:spacing w:after="0" w:line="276" w:lineRule="auto"/>
-              <w:ind w:left="0"/>
-              <w:jc w:val="center"/>
+              <w:spacing w:after="40" w:before="0"/>
             </w:pPr>
             <w:r>
               <w:rPr>
-                <w:b/>
-              </w:rPr>
-            </w:r>
-            <w:r>
-              <w:rPr>
-                <w:rFonts w:ascii="Malgun Gothic" w:hAnsi="Malgun Gothic"/>
+                <w:rFonts w:ascii="맑은 고딕" w:hAnsi="맑은 고딕" w:eastAsia="맑은 고딕"/>
                 <w:b/>
                 <w:sz w:val="20"/>
               </w:rPr>
@@ -445,24 +462,22 @@
         </w:tc>
         <w:tc>
           <w:tcPr>
-            <w:tcW w:type="dxa" w:w="7371"/>
-            <w:vAlign w:val="center"/>
-            <w:shd w:fill="EDEDED"/>
+            <w:tcW w:type="dxa" w:w="7200"/>
+            <w:shd w:val="clear" w:color="auto" w:fill="D9E2F3"/>
+            <w:tcBorders>
+              <w:top w:val="single" w:sz="8" w:space="0" w:color="000000"/>
+              <w:left w:val="single" w:sz="8" w:space="0" w:color="000000"/>
+              <w:bottom w:val="single" w:sz="8" w:space="0" w:color="000000"/>
+              <w:right w:val="single" w:sz="8" w:space="0" w:color="000000"/>
+            </w:tcBorders>
           </w:tcPr>
           <w:p>
             <w:pPr>
-              <w:spacing w:after="0" w:line="276" w:lineRule="auto"/>
-              <w:ind w:left="0"/>
-              <w:jc w:val="center"/>
+              <w:spacing w:after="40" w:before="0"/>
             </w:pPr>
             <w:r>
               <w:rPr>
-                <w:b/>
-              </w:rPr>
-            </w:r>
-            <w:r>
-              <w:rPr>
-                <w:rFonts w:ascii="Malgun Gothic" w:hAnsi="Malgun Gothic"/>
+                <w:rFonts w:ascii="맑은 고딕" w:hAnsi="맑은 고딕" w:eastAsia="맑은 고딕"/>
                 <w:b/>
                 <w:sz w:val="20"/>
               </w:rPr>
@@ -474,23 +489,22 @@
       <w:tr>
         <w:tc>
           <w:tcPr>
-            <w:tcW w:type="dxa" w:w="2268"/>
-            <w:vAlign w:val="center"/>
-            <w:shd w:fill="EDEDED"/>
+            <w:tcW w:type="dxa" w:w="2200"/>
+            <w:shd w:val="clear" w:color="auto" w:fill="F2F2F2"/>
+            <w:tcBorders>
+              <w:top w:val="single" w:sz="8" w:space="0" w:color="000000"/>
+              <w:left w:val="single" w:sz="8" w:space="0" w:color="000000"/>
+              <w:bottom w:val="single" w:sz="8" w:space="0" w:color="000000"/>
+              <w:right w:val="single" w:sz="8" w:space="0" w:color="000000"/>
+            </w:tcBorders>
           </w:tcPr>
           <w:p>
             <w:pPr>
-              <w:spacing w:after="0" w:line="276" w:lineRule="auto"/>
-              <w:ind w:left="0"/>
+              <w:spacing w:after="40" w:before="0"/>
             </w:pPr>
             <w:r>
               <w:rPr>
-                <w:b/>
-              </w:rPr>
-            </w:r>
-            <w:r>
-              <w:rPr>
-                <w:rFonts w:ascii="Malgun Gothic" w:hAnsi="Malgun Gothic"/>
+                <w:rFonts w:ascii="맑은 고딕" w:hAnsi="맑은 고딕" w:eastAsia="맑은 고딕"/>
                 <w:b/>
                 <w:sz w:val="20"/>
               </w:rPr>
@@ -500,21 +514,25 @@
         </w:tc>
         <w:tc>
           <w:tcPr>
-            <w:tcW w:type="dxa" w:w="7371"/>
-            <w:vAlign w:val="center"/>
+            <w:tcW w:type="dxa" w:w="7200"/>
+            <w:tcBorders>
+              <w:top w:val="single" w:sz="8" w:space="0" w:color="000000"/>
+              <w:left w:val="single" w:sz="8" w:space="0" w:color="000000"/>
+              <w:bottom w:val="single" w:sz="8" w:space="0" w:color="000000"/>
+              <w:right w:val="single" w:sz="8" w:space="0" w:color="000000"/>
+            </w:tcBorders>
           </w:tcPr>
           <w:p>
             <w:pPr>
-              <w:spacing w:after="0" w:line="276" w:lineRule="auto"/>
-              <w:ind w:left="0"/>
+              <w:spacing w:after="40" w:before="0"/>
             </w:pPr>
-            <w:r/>
             <w:r>
               <w:rPr>
-                <w:rFonts w:ascii="Malgun Gothic" w:hAnsi="Malgun Gothic"/>
+                <w:rFonts w:ascii="맑은 고딕" w:hAnsi="맑은 고딕" w:eastAsia="맑은 고딕"/>
+                <w:b w:val="0"/>
                 <w:sz w:val="20"/>
               </w:rPr>
-              <w:t>사용자</w:t>
+              <w:t>Host Application</w:t>
             </w:r>
           </w:p>
         </w:tc>
@@ -522,23 +540,22 @@
       <w:tr>
         <w:tc>
           <w:tcPr>
-            <w:tcW w:type="dxa" w:w="2268"/>
-            <w:vAlign w:val="center"/>
-            <w:shd w:fill="EDEDED"/>
+            <w:tcW w:type="dxa" w:w="2200"/>
+            <w:shd w:val="clear" w:color="auto" w:fill="F2F2F2"/>
+            <w:tcBorders>
+              <w:top w:val="single" w:sz="8" w:space="0" w:color="000000"/>
+              <w:left w:val="single" w:sz="8" w:space="0" w:color="000000"/>
+              <w:bottom w:val="single" w:sz="8" w:space="0" w:color="000000"/>
+              <w:right w:val="single" w:sz="8" w:space="0" w:color="000000"/>
+            </w:tcBorders>
           </w:tcPr>
           <w:p>
             <w:pPr>
-              <w:spacing w:after="0" w:line="276" w:lineRule="auto"/>
-              <w:ind w:left="0"/>
+              <w:spacing w:after="40" w:before="0"/>
             </w:pPr>
             <w:r>
               <w:rPr>
-                <w:b/>
-              </w:rPr>
-            </w:r>
-            <w:r>
-              <w:rPr>
-                <w:rFonts w:ascii="Malgun Gothic" w:hAnsi="Malgun Gothic"/>
+                <w:rFonts w:ascii="맑은 고딕" w:hAnsi="맑은 고딕" w:eastAsia="맑은 고딕"/>
                 <w:b/>
                 <w:sz w:val="20"/>
               </w:rPr>
@@ -548,18 +565,22 @@
         </w:tc>
         <w:tc>
           <w:tcPr>
-            <w:tcW w:type="dxa" w:w="7371"/>
-            <w:vAlign w:val="center"/>
+            <w:tcW w:type="dxa" w:w="7200"/>
+            <w:tcBorders>
+              <w:top w:val="single" w:sz="8" w:space="0" w:color="000000"/>
+              <w:left w:val="single" w:sz="8" w:space="0" w:color="000000"/>
+              <w:bottom w:val="single" w:sz="8" w:space="0" w:color="000000"/>
+              <w:right w:val="single" w:sz="8" w:space="0" w:color="000000"/>
+            </w:tcBorders>
           </w:tcPr>
           <w:p>
             <w:pPr>
-              <w:spacing w:after="0" w:line="276" w:lineRule="auto"/>
-              <w:ind w:left="0"/>
+              <w:spacing w:after="40" w:before="0"/>
             </w:pPr>
-            <w:r/>
             <w:r>
               <w:rPr>
-                <w:rFonts w:ascii="Malgun Gothic" w:hAnsi="Malgun Gothic"/>
+                <w:rFonts w:ascii="맑은 고딕" w:hAnsi="맑은 고딕" w:eastAsia="맑은 고딕"/>
+                <w:b w:val="0"/>
                 <w:sz w:val="20"/>
               </w:rPr>
               <w:t>Secure Camera pVM과 Secure AI pVM 이미지가 준비되어 있다</w:t>
@@ -570,23 +591,22 @@
       <w:tr>
         <w:tc>
           <w:tcPr>
-            <w:tcW w:type="dxa" w:w="2268"/>
-            <w:vAlign w:val="center"/>
-            <w:shd w:fill="EDEDED"/>
+            <w:tcW w:type="dxa" w:w="2200"/>
+            <w:shd w:val="clear" w:color="auto" w:fill="F2F2F2"/>
+            <w:tcBorders>
+              <w:top w:val="single" w:sz="8" w:space="0" w:color="000000"/>
+              <w:left w:val="single" w:sz="8" w:space="0" w:color="000000"/>
+              <w:bottom w:val="single" w:sz="8" w:space="0" w:color="000000"/>
+              <w:right w:val="single" w:sz="8" w:space="0" w:color="000000"/>
+            </w:tcBorders>
           </w:tcPr>
           <w:p>
             <w:pPr>
-              <w:spacing w:after="0" w:line="276" w:lineRule="auto"/>
-              <w:ind w:left="0"/>
+              <w:spacing w:after="40" w:before="0"/>
             </w:pPr>
             <w:r>
               <w:rPr>
-                <w:b/>
-              </w:rPr>
-            </w:r>
-            <w:r>
-              <w:rPr>
-                <w:rFonts w:ascii="Malgun Gothic" w:hAnsi="Malgun Gothic"/>
+                <w:rFonts w:ascii="맑은 고딕" w:hAnsi="맑은 고딕" w:eastAsia="맑은 고딕"/>
                 <w:b/>
                 <w:sz w:val="20"/>
               </w:rPr>
@@ -596,18 +616,22 @@
         </w:tc>
         <w:tc>
           <w:tcPr>
-            <w:tcW w:type="dxa" w:w="7371"/>
-            <w:vAlign w:val="center"/>
+            <w:tcW w:type="dxa" w:w="7200"/>
+            <w:tcBorders>
+              <w:top w:val="single" w:sz="8" w:space="0" w:color="000000"/>
+              <w:left w:val="single" w:sz="8" w:space="0" w:color="000000"/>
+              <w:bottom w:val="single" w:sz="8" w:space="0" w:color="000000"/>
+              <w:right w:val="single" w:sz="8" w:space="0" w:color="000000"/>
+            </w:tcBorders>
           </w:tcPr>
           <w:p>
             <w:pPr>
-              <w:spacing w:after="0" w:line="276" w:lineRule="auto"/>
-              <w:ind w:left="0"/>
+              <w:spacing w:after="40" w:before="0"/>
             </w:pPr>
-            <w:r/>
             <w:r>
               <w:rPr>
-                <w:rFonts w:ascii="Malgun Gothic" w:hAnsi="Malgun Gothic"/>
+                <w:rFonts w:ascii="맑은 고딕" w:hAnsi="맑은 고딕" w:eastAsia="맑은 고딕"/>
+                <w:b w:val="0"/>
                 <w:sz w:val="20"/>
               </w:rPr>
               <w:t>복수의 pVM이 격리된 상태로 독립적으로 동시 운용 중이다</w:t>
@@ -618,23 +642,22 @@
       <w:tr>
         <w:tc>
           <w:tcPr>
-            <w:tcW w:type="dxa" w:w="2268"/>
-            <w:vAlign w:val="center"/>
-            <w:shd w:fill="EDEDED"/>
+            <w:tcW w:type="dxa" w:w="2200"/>
+            <w:shd w:val="clear" w:color="auto" w:fill="F2F2F2"/>
+            <w:tcBorders>
+              <w:top w:val="single" w:sz="8" w:space="0" w:color="000000"/>
+              <w:left w:val="single" w:sz="8" w:space="0" w:color="000000"/>
+              <w:bottom w:val="single" w:sz="8" w:space="0" w:color="000000"/>
+              <w:right w:val="single" w:sz="8" w:space="0" w:color="000000"/>
+            </w:tcBorders>
           </w:tcPr>
           <w:p>
             <w:pPr>
-              <w:spacing w:after="0" w:line="276" w:lineRule="auto"/>
-              <w:ind w:left="0"/>
+              <w:spacing w:after="40" w:before="0"/>
             </w:pPr>
             <w:r>
               <w:rPr>
-                <w:b/>
-              </w:rPr>
-            </w:r>
-            <w:r>
-              <w:rPr>
-                <w:rFonts w:ascii="Malgun Gothic" w:hAnsi="Malgun Gothic"/>
+                <w:rFonts w:ascii="맑은 고딕" w:hAnsi="맑은 고딕" w:eastAsia="맑은 고딕"/>
                 <w:b/>
                 <w:sz w:val="20"/>
               </w:rPr>
@@ -644,47 +667,77 @@
         </w:tc>
         <w:tc>
           <w:tcPr>
-            <w:tcW w:type="dxa" w:w="7371"/>
-            <w:vAlign w:val="center"/>
+            <w:tcW w:type="dxa" w:w="7200"/>
+            <w:tcBorders>
+              <w:top w:val="single" w:sz="8" w:space="0" w:color="000000"/>
+              <w:left w:val="single" w:sz="8" w:space="0" w:color="000000"/>
+              <w:bottom w:val="single" w:sz="8" w:space="0" w:color="000000"/>
+              <w:right w:val="single" w:sz="8" w:space="0" w:color="000000"/>
+            </w:tcBorders>
           </w:tcPr>
           <w:p>
             <w:pPr>
-              <w:spacing w:after="0" w:line="276" w:lineRule="auto"/>
-              <w:ind w:left="0"/>
+              <w:spacing w:after="40" w:before="0"/>
             </w:pPr>
-            <w:r/>
             <w:r>
               <w:rPr>
-                <w:rFonts w:ascii="Malgun Gothic" w:hAnsi="Malgun Gothic"/>
+                <w:rFonts w:ascii="맑은 고딕" w:hAnsi="맑은 고딕" w:eastAsia="맑은 고딕"/>
+                <w:b w:val="0"/>
                 <w:sz w:val="20"/>
               </w:rPr>
-              <w:t>1. 사용자가 Secure Camera pVM을 생성하고 시작한다</w:t>
+              <w:t>1. Host Application이 Secure Camera pVM 생성을 요청한다</w:t>
             </w:r>
           </w:p>
           <w:p>
             <w:pPr>
-              <w:spacing w:after="0" w:line="276" w:lineRule="auto"/>
-              <w:ind w:left="0"/>
+              <w:spacing w:after="40" w:before="0"/>
             </w:pPr>
             <w:r>
               <w:rPr>
-                <w:rFonts w:ascii="Malgun Gothic" w:hAnsi="Malgun Gothic"/>
+                <w:rFonts w:ascii="맑은 고딕" w:hAnsi="맑은 고딕" w:eastAsia="맑은 고딕"/>
+                <w:b w:val="0"/>
                 <w:sz w:val="20"/>
               </w:rPr>
-              <w:t>2. 사용자가 Secure AI pVM을 생성하고 시작한다</w:t>
+              <w:t>2. 시스템은 Secure Camera pVM을 생성하고 시작한다</w:t>
             </w:r>
           </w:p>
           <w:p>
             <w:pPr>
-              <w:spacing w:after="0" w:line="276" w:lineRule="auto"/>
-              <w:ind w:left="0"/>
+              <w:spacing w:after="40" w:before="0"/>
             </w:pPr>
             <w:r>
               <w:rPr>
-                <w:rFonts w:ascii="Malgun Gothic" w:hAnsi="Malgun Gothic"/>
+                <w:rFonts w:ascii="맑은 고딕" w:hAnsi="맑은 고딕" w:eastAsia="맑은 고딕"/>
+                <w:b w:val="0"/>
                 <w:sz w:val="20"/>
               </w:rPr>
-              <w:t>3. 두 pVM이 독립된 메모리 공간에서 동시에 실행된다</w:t>
+              <w:t>3. Host Application이 Secure AI pVM 생성을 요청한다</w:t>
+            </w:r>
+          </w:p>
+          <w:p>
+            <w:pPr>
+              <w:spacing w:after="40" w:before="0"/>
+            </w:pPr>
+            <w:r>
+              <w:rPr>
+                <w:rFonts w:ascii="맑은 고딕" w:hAnsi="맑은 고딕" w:eastAsia="맑은 고딕"/>
+                <w:b w:val="0"/>
+                <w:sz w:val="20"/>
+              </w:rPr>
+              <w:t>4. 시스템은 Secure AI pVM을 생성하고 시작한다</w:t>
+            </w:r>
+          </w:p>
+          <w:p>
+            <w:pPr>
+              <w:spacing w:after="40" w:before="0"/>
+            </w:pPr>
+            <w:r>
+              <w:rPr>
+                <w:rFonts w:ascii="맑은 고딕" w:hAnsi="맑은 고딕" w:eastAsia="맑은 고딕"/>
+                <w:b w:val="0"/>
+                <w:sz w:val="20"/>
+              </w:rPr>
+              <w:t>5. 시스템은 두 pVM을 독립된 메모리 공간에서 동시에 실행한다</w:t>
             </w:r>
           </w:p>
         </w:tc>
@@ -692,23 +745,22 @@
       <w:tr>
         <w:tc>
           <w:tcPr>
-            <w:tcW w:type="dxa" w:w="2268"/>
-            <w:vAlign w:val="center"/>
-            <w:shd w:fill="EDEDED"/>
+            <w:tcW w:type="dxa" w:w="2200"/>
+            <w:shd w:val="clear" w:color="auto" w:fill="F2F2F2"/>
+            <w:tcBorders>
+              <w:top w:val="single" w:sz="8" w:space="0" w:color="000000"/>
+              <w:left w:val="single" w:sz="8" w:space="0" w:color="000000"/>
+              <w:bottom w:val="single" w:sz="8" w:space="0" w:color="000000"/>
+              <w:right w:val="single" w:sz="8" w:space="0" w:color="000000"/>
+            </w:tcBorders>
           </w:tcPr>
           <w:p>
             <w:pPr>
-              <w:spacing w:after="0" w:line="276" w:lineRule="auto"/>
-              <w:ind w:left="0"/>
+              <w:spacing w:after="40" w:before="0"/>
             </w:pPr>
             <w:r>
               <w:rPr>
-                <w:b/>
-              </w:rPr>
-            </w:r>
-            <w:r>
-              <w:rPr>
-                <w:rFonts w:ascii="Malgun Gothic" w:hAnsi="Malgun Gothic"/>
+                <w:rFonts w:ascii="맑은 고딕" w:hAnsi="맑은 고딕" w:eastAsia="맑은 고딕"/>
                 <w:b/>
                 <w:sz w:val="20"/>
               </w:rPr>
@@ -718,21 +770,51 @@
         </w:tc>
         <w:tc>
           <w:tcPr>
-            <w:tcW w:type="dxa" w:w="7371"/>
-            <w:vAlign w:val="center"/>
+            <w:tcW w:type="dxa" w:w="7200"/>
+            <w:tcBorders>
+              <w:top w:val="single" w:sz="8" w:space="0" w:color="000000"/>
+              <w:left w:val="single" w:sz="8" w:space="0" w:color="000000"/>
+              <w:bottom w:val="single" w:sz="8" w:space="0" w:color="000000"/>
+              <w:right w:val="single" w:sz="8" w:space="0" w:color="000000"/>
+            </w:tcBorders>
           </w:tcPr>
           <w:p>
             <w:pPr>
-              <w:spacing w:after="0" w:line="276" w:lineRule="auto"/>
-              <w:ind w:left="0"/>
+              <w:spacing w:after="40" w:before="0"/>
             </w:pPr>
-            <w:r/>
             <w:r>
               <w:rPr>
-                <w:rFonts w:ascii="Malgun Gothic" w:hAnsi="Malgun Gothic"/>
+                <w:rFonts w:ascii="맑은 고딕" w:hAnsi="맑은 고딕" w:eastAsia="맑은 고딕"/>
+                <w:b w:val="0"/>
                 <w:sz w:val="20"/>
               </w:rPr>
-              <w:t>pVM 중 하나가 종료 혹은 Crash되어도 나머지 pVM은 영향받지 않고 계속 동작한다</w:t>
+              <w:t>1. 시스템은 pVM 중 하나가 종료 혹은 Crash되어도 나머지 pVM을 계속 실행한다</w:t>
+            </w:r>
+          </w:p>
+          <w:p>
+            <w:pPr>
+              <w:spacing w:after="40" w:before="0"/>
+            </w:pPr>
+            <w:r>
+              <w:rPr>
+                <w:rFonts w:ascii="맑은 고딕" w:hAnsi="맑은 고딕" w:eastAsia="맑은 고딕"/>
+                <w:b w:val="0"/>
+                <w:sz w:val="20"/>
+              </w:rPr>
+              <w:t>2. 시스템은 두 번째 pVM 생성에 필요한 자원이 부족하면 기존 pVM을 유지하고 Host Application에 신규 생성 실패를 반환한다</w:t>
+            </w:r>
+          </w:p>
+          <w:p>
+            <w:pPr>
+              <w:spacing w:after="40" w:before="0"/>
+            </w:pPr>
+            <w:r>
+              <w:rPr>
+                <w:rFonts w:ascii="맑은 고딕" w:hAnsi="맑은 고딕" w:eastAsia="맑은 고딕"/>
+                <w:b w:val="0"/>
+                <w:sz w:val="20"/>
+              </w:rPr>
+              <w:t>3. 시스템은 pVM 간 격리 검증이 실패하면 실패한 pVM을 시작하지 않고 Host Application에 오류를 반환한다</w:t>
             </w:r>
           </w:p>
         </w:tc>
@@ -741,44 +823,33 @@
     <w:p/>
     <w:tbl>
       <w:tblPr>
-        <w:tblStyle w:val="TableGrid"/>
         <w:tblW w:type="auto" w:w="0"/>
-        <w:tblLayout w:type="autofit"/>
+        <w:tblLayout w:type="fixed"/>
         <w:tblLook w:firstColumn="1" w:firstRow="1" w:lastColumn="0" w:lastRow="0" w:noHBand="0" w:noVBand="1" w:val="04A0"/>
-        <w:tblBorders>
-          <w:top w:val="single" w:sz="8" w:space="0" w:color="000000"/>
-          <w:left w:val="single" w:sz="8" w:space="0" w:color="000000"/>
-          <w:bottom w:val="single" w:sz="8" w:space="0" w:color="000000"/>
-          <w:right w:val="single" w:sz="8" w:space="0" w:color="000000"/>
-          <w:insideH w:val="single" w:sz="8" w:space="0" w:color="000000"/>
-          <w:insideV w:val="single" w:sz="8" w:space="0" w:color="000000"/>
-        </w:tblBorders>
       </w:tblPr>
       <w:tblGrid>
-        <w:gridCol w:w="5100"/>
-        <w:gridCol w:w="5100"/>
+        <w:gridCol w:w="4320"/>
+        <w:gridCol w:w="4320"/>
       </w:tblGrid>
       <w:tr>
         <w:tc>
           <w:tcPr>
-            <w:tcW w:type="dxa" w:w="2268"/>
-            <w:vAlign w:val="center"/>
-            <w:shd w:fill="EDEDED"/>
+            <w:tcW w:type="dxa" w:w="2200"/>
+            <w:shd w:val="clear" w:color="auto" w:fill="D9E2F3"/>
+            <w:tcBorders>
+              <w:top w:val="single" w:sz="8" w:space="0" w:color="000000"/>
+              <w:left w:val="single" w:sz="8" w:space="0" w:color="000000"/>
+              <w:bottom w:val="single" w:sz="8" w:space="0" w:color="000000"/>
+              <w:right w:val="single" w:sz="8" w:space="0" w:color="000000"/>
+            </w:tcBorders>
           </w:tcPr>
           <w:p>
             <w:pPr>
-              <w:spacing w:after="0" w:line="276" w:lineRule="auto"/>
-              <w:ind w:left="0"/>
-              <w:jc w:val="center"/>
+              <w:spacing w:after="40" w:before="0"/>
             </w:pPr>
             <w:r>
               <w:rPr>
-                <w:b/>
-              </w:rPr>
-            </w:r>
-            <w:r>
-              <w:rPr>
-                <w:rFonts w:ascii="Malgun Gothic" w:hAnsi="Malgun Gothic"/>
+                <w:rFonts w:ascii="맑은 고딕" w:hAnsi="맑은 고딕" w:eastAsia="맑은 고딕"/>
                 <w:b/>
                 <w:sz w:val="20"/>
               </w:rPr>
@@ -788,24 +859,22 @@
         </w:tc>
         <w:tc>
           <w:tcPr>
-            <w:tcW w:type="dxa" w:w="7371"/>
-            <w:vAlign w:val="center"/>
-            <w:shd w:fill="EDEDED"/>
+            <w:tcW w:type="dxa" w:w="7200"/>
+            <w:shd w:val="clear" w:color="auto" w:fill="D9E2F3"/>
+            <w:tcBorders>
+              <w:top w:val="single" w:sz="8" w:space="0" w:color="000000"/>
+              <w:left w:val="single" w:sz="8" w:space="0" w:color="000000"/>
+              <w:bottom w:val="single" w:sz="8" w:space="0" w:color="000000"/>
+              <w:right w:val="single" w:sz="8" w:space="0" w:color="000000"/>
+            </w:tcBorders>
           </w:tcPr>
           <w:p>
             <w:pPr>
-              <w:spacing w:after="0" w:line="276" w:lineRule="auto"/>
-              <w:ind w:left="0"/>
-              <w:jc w:val="center"/>
+              <w:spacing w:after="40" w:before="0"/>
             </w:pPr>
             <w:r>
               <w:rPr>
-                <w:b/>
-              </w:rPr>
-            </w:r>
-            <w:r>
-              <w:rPr>
-                <w:rFonts w:ascii="Malgun Gothic" w:hAnsi="Malgun Gothic"/>
+                <w:rFonts w:ascii="맑은 고딕" w:hAnsi="맑은 고딕" w:eastAsia="맑은 고딕"/>
                 <w:b/>
                 <w:sz w:val="20"/>
               </w:rPr>
@@ -817,23 +886,22 @@
       <w:tr>
         <w:tc>
           <w:tcPr>
-            <w:tcW w:type="dxa" w:w="2268"/>
-            <w:vAlign w:val="center"/>
-            <w:shd w:fill="EDEDED"/>
+            <w:tcW w:type="dxa" w:w="2200"/>
+            <w:shd w:val="clear" w:color="auto" w:fill="F2F2F2"/>
+            <w:tcBorders>
+              <w:top w:val="single" w:sz="8" w:space="0" w:color="000000"/>
+              <w:left w:val="single" w:sz="8" w:space="0" w:color="000000"/>
+              <w:bottom w:val="single" w:sz="8" w:space="0" w:color="000000"/>
+              <w:right w:val="single" w:sz="8" w:space="0" w:color="000000"/>
+            </w:tcBorders>
           </w:tcPr>
           <w:p>
             <w:pPr>
-              <w:spacing w:after="0" w:line="276" w:lineRule="auto"/>
-              <w:ind w:left="0"/>
+              <w:spacing w:after="40" w:before="0"/>
             </w:pPr>
             <w:r>
               <w:rPr>
-                <w:b/>
-              </w:rPr>
-            </w:r>
-            <w:r>
-              <w:rPr>
-                <w:rFonts w:ascii="Malgun Gothic" w:hAnsi="Malgun Gothic"/>
+                <w:rFonts w:ascii="맑은 고딕" w:hAnsi="맑은 고딕" w:eastAsia="맑은 고딕"/>
                 <w:b/>
                 <w:sz w:val="20"/>
               </w:rPr>
@@ -843,21 +911,25 @@
         </w:tc>
         <w:tc>
           <w:tcPr>
-            <w:tcW w:type="dxa" w:w="7371"/>
-            <w:vAlign w:val="center"/>
+            <w:tcW w:type="dxa" w:w="7200"/>
+            <w:tcBorders>
+              <w:top w:val="single" w:sz="8" w:space="0" w:color="000000"/>
+              <w:left w:val="single" w:sz="8" w:space="0" w:color="000000"/>
+              <w:bottom w:val="single" w:sz="8" w:space="0" w:color="000000"/>
+              <w:right w:val="single" w:sz="8" w:space="0" w:color="000000"/>
+            </w:tcBorders>
           </w:tcPr>
           <w:p>
             <w:pPr>
-              <w:spacing w:after="0" w:line="276" w:lineRule="auto"/>
-              <w:ind w:left="0"/>
+              <w:spacing w:after="40" w:before="0"/>
             </w:pPr>
-            <w:r/>
             <w:r>
               <w:rPr>
-                <w:rFonts w:ascii="Malgun Gothic" w:hAnsi="Malgun Gothic"/>
+                <w:rFonts w:ascii="맑은 고딕" w:hAnsi="맑은 고딕" w:eastAsia="맑은 고딕"/>
+                <w:b w:val="0"/>
                 <w:sz w:val="20"/>
               </w:rPr>
-              <w:t>사용자</w:t>
+              <w:t>Workload(Camera/AI), Normal Camera Application</w:t>
             </w:r>
           </w:p>
         </w:tc>
@@ -865,23 +937,22 @@
       <w:tr>
         <w:tc>
           <w:tcPr>
-            <w:tcW w:type="dxa" w:w="2268"/>
-            <w:vAlign w:val="center"/>
-            <w:shd w:fill="EDEDED"/>
+            <w:tcW w:type="dxa" w:w="2200"/>
+            <w:shd w:val="clear" w:color="auto" w:fill="F2F2F2"/>
+            <w:tcBorders>
+              <w:top w:val="single" w:sz="8" w:space="0" w:color="000000"/>
+              <w:left w:val="single" w:sz="8" w:space="0" w:color="000000"/>
+              <w:bottom w:val="single" w:sz="8" w:space="0" w:color="000000"/>
+              <w:right w:val="single" w:sz="8" w:space="0" w:color="000000"/>
+            </w:tcBorders>
           </w:tcPr>
           <w:p>
             <w:pPr>
-              <w:spacing w:after="0" w:line="276" w:lineRule="auto"/>
-              <w:ind w:left="0"/>
+              <w:spacing w:after="40" w:before="0"/>
             </w:pPr>
             <w:r>
               <w:rPr>
-                <w:b/>
-              </w:rPr>
-            </w:r>
-            <w:r>
-              <w:rPr>
-                <w:rFonts w:ascii="Malgun Gothic" w:hAnsi="Malgun Gothic"/>
+                <w:rFonts w:ascii="맑은 고딕" w:hAnsi="맑은 고딕" w:eastAsia="맑은 고딕"/>
                 <w:b/>
                 <w:sz w:val="20"/>
               </w:rPr>
@@ -891,21 +962,25 @@
         </w:tc>
         <w:tc>
           <w:tcPr>
-            <w:tcW w:type="dxa" w:w="7371"/>
-            <w:vAlign w:val="center"/>
+            <w:tcW w:type="dxa" w:w="7200"/>
+            <w:tcBorders>
+              <w:top w:val="single" w:sz="8" w:space="0" w:color="000000"/>
+              <w:left w:val="single" w:sz="8" w:space="0" w:color="000000"/>
+              <w:bottom w:val="single" w:sz="8" w:space="0" w:color="000000"/>
+              <w:right w:val="single" w:sz="8" w:space="0" w:color="000000"/>
+            </w:tcBorders>
           </w:tcPr>
           <w:p>
             <w:pPr>
-              <w:spacing w:after="0" w:line="276" w:lineRule="auto"/>
-              <w:ind w:left="0"/>
+              <w:spacing w:after="40" w:before="0"/>
             </w:pPr>
-            <w:r/>
             <w:r>
               <w:rPr>
-                <w:rFonts w:ascii="Malgun Gothic" w:hAnsi="Malgun Gothic"/>
+                <w:rFonts w:ascii="맑은 고딕" w:hAnsi="맑은 고딕" w:eastAsia="맑은 고딕"/>
+                <w:b w:val="0"/>
                 <w:sz w:val="20"/>
               </w:rPr>
-              <w:t>Secure Camera pVM과 Host가 모두 실행 중이다</w:t>
+              <w:t>Workload(Camera/AI)가 실행 중이고 Normal Camera Application이 Camera HW 사용을 요청할 수 있다</w:t>
             </w:r>
           </w:p>
         </w:tc>
@@ -913,23 +988,22 @@
       <w:tr>
         <w:tc>
           <w:tcPr>
-            <w:tcW w:type="dxa" w:w="2268"/>
-            <w:vAlign w:val="center"/>
-            <w:shd w:fill="EDEDED"/>
+            <w:tcW w:type="dxa" w:w="2200"/>
+            <w:shd w:val="clear" w:color="auto" w:fill="F2F2F2"/>
+            <w:tcBorders>
+              <w:top w:val="single" w:sz="8" w:space="0" w:color="000000"/>
+              <w:left w:val="single" w:sz="8" w:space="0" w:color="000000"/>
+              <w:bottom w:val="single" w:sz="8" w:space="0" w:color="000000"/>
+              <w:right w:val="single" w:sz="8" w:space="0" w:color="000000"/>
+            </w:tcBorders>
           </w:tcPr>
           <w:p>
             <w:pPr>
-              <w:spacing w:after="0" w:line="276" w:lineRule="auto"/>
-              <w:ind w:left="0"/>
+              <w:spacing w:after="40" w:before="0"/>
             </w:pPr>
             <w:r>
               <w:rPr>
-                <w:b/>
-              </w:rPr>
-            </w:r>
-            <w:r>
-              <w:rPr>
-                <w:rFonts w:ascii="Malgun Gothic" w:hAnsi="Malgun Gothic"/>
+                <w:rFonts w:ascii="맑은 고딕" w:hAnsi="맑은 고딕" w:eastAsia="맑은 고딕"/>
                 <w:b/>
                 <w:sz w:val="20"/>
               </w:rPr>
@@ -939,21 +1013,25 @@
         </w:tc>
         <w:tc>
           <w:tcPr>
-            <w:tcW w:type="dxa" w:w="7371"/>
-            <w:vAlign w:val="center"/>
+            <w:tcW w:type="dxa" w:w="7200"/>
+            <w:tcBorders>
+              <w:top w:val="single" w:sz="8" w:space="0" w:color="000000"/>
+              <w:left w:val="single" w:sz="8" w:space="0" w:color="000000"/>
+              <w:bottom w:val="single" w:sz="8" w:space="0" w:color="000000"/>
+              <w:right w:val="single" w:sz="8" w:space="0" w:color="000000"/>
+            </w:tcBorders>
           </w:tcPr>
           <w:p>
             <w:pPr>
-              <w:spacing w:after="0" w:line="276" w:lineRule="auto"/>
-              <w:ind w:left="0"/>
+              <w:spacing w:after="40" w:before="0"/>
             </w:pPr>
-            <w:r/>
             <w:r>
               <w:rPr>
-                <w:rFonts w:ascii="Malgun Gothic" w:hAnsi="Malgun Gothic"/>
+                <w:rFonts w:ascii="맑은 고딕" w:hAnsi="맑은 고딕" w:eastAsia="맑은 고딕"/>
+                <w:b w:val="0"/>
                 <w:sz w:val="20"/>
               </w:rPr>
-              <w:t>사용자가 Camera/AI HW를 충돌/데이터 유출 없이 사용했다</w:t>
+              <w:t>Workload(Camera/AI)와 Normal Camera Application이 Camera/AI HW를 충돌/데이터 유출 없이 사용했다</w:t>
             </w:r>
           </w:p>
         </w:tc>
@@ -961,23 +1039,22 @@
       <w:tr>
         <w:tc>
           <w:tcPr>
-            <w:tcW w:type="dxa" w:w="2268"/>
-            <w:vAlign w:val="center"/>
-            <w:shd w:fill="EDEDED"/>
+            <w:tcW w:type="dxa" w:w="2200"/>
+            <w:shd w:val="clear" w:color="auto" w:fill="F2F2F2"/>
+            <w:tcBorders>
+              <w:top w:val="single" w:sz="8" w:space="0" w:color="000000"/>
+              <w:left w:val="single" w:sz="8" w:space="0" w:color="000000"/>
+              <w:bottom w:val="single" w:sz="8" w:space="0" w:color="000000"/>
+              <w:right w:val="single" w:sz="8" w:space="0" w:color="000000"/>
+            </w:tcBorders>
           </w:tcPr>
           <w:p>
             <w:pPr>
-              <w:spacing w:after="0" w:line="276" w:lineRule="auto"/>
-              <w:ind w:left="0"/>
+              <w:spacing w:after="40" w:before="0"/>
             </w:pPr>
             <w:r>
               <w:rPr>
-                <w:b/>
-              </w:rPr>
-            </w:r>
-            <w:r>
-              <w:rPr>
-                <w:rFonts w:ascii="Malgun Gothic" w:hAnsi="Malgun Gothic"/>
+                <w:rFonts w:ascii="맑은 고딕" w:hAnsi="맑은 고딕" w:eastAsia="맑은 고딕"/>
                 <w:b/>
                 <w:sz w:val="20"/>
               </w:rPr>
@@ -987,73 +1064,90 @@
         </w:tc>
         <w:tc>
           <w:tcPr>
-            <w:tcW w:type="dxa" w:w="7371"/>
-            <w:vAlign w:val="center"/>
+            <w:tcW w:type="dxa" w:w="7200"/>
+            <w:tcBorders>
+              <w:top w:val="single" w:sz="8" w:space="0" w:color="000000"/>
+              <w:left w:val="single" w:sz="8" w:space="0" w:color="000000"/>
+              <w:bottom w:val="single" w:sz="8" w:space="0" w:color="000000"/>
+              <w:right w:val="single" w:sz="8" w:space="0" w:color="000000"/>
+            </w:tcBorders>
           </w:tcPr>
           <w:p>
             <w:pPr>
-              <w:spacing w:after="0" w:line="276" w:lineRule="auto"/>
-              <w:ind w:left="0"/>
+              <w:spacing w:after="40" w:before="0"/>
             </w:pPr>
-            <w:r/>
             <w:r>
               <w:rPr>
-                <w:rFonts w:ascii="Malgun Gothic" w:hAnsi="Malgun Gothic"/>
+                <w:rFonts w:ascii="맑은 고딕" w:hAnsi="맑은 고딕" w:eastAsia="맑은 고딕"/>
+                <w:b w:val="0"/>
                 <w:sz w:val="20"/>
               </w:rPr>
-              <w:t>1. Secure Camera pVM이 Camera HW 사용을 요청한다</w:t>
+              <w:t>1. Workload(Camera/AI)가 Camera/AI HW 사용을 요청한다</w:t>
             </w:r>
           </w:p>
           <w:p>
             <w:pPr>
-              <w:spacing w:after="0" w:line="276" w:lineRule="auto"/>
-              <w:ind w:left="0"/>
+              <w:spacing w:after="40" w:before="0"/>
             </w:pPr>
             <w:r>
               <w:rPr>
-                <w:rFonts w:ascii="Malgun Gothic" w:hAnsi="Malgun Gothic"/>
+                <w:rFonts w:ascii="맑은 고딕" w:hAnsi="맑은 고딕" w:eastAsia="맑은 고딕"/>
+                <w:b w:val="0"/>
                 <w:sz w:val="20"/>
               </w:rPr>
-              <w:t>2. 시스템이 S2MPU를 통해 Camera HW 접근 권한을 Secure Camera pVM에 전용 할당한다</w:t>
+              <w:t>2. 시스템은 S2MPU를 통해 요청한 HW 접근 권한을 Workload(Camera/AI)에 전용 할당한다</w:t>
             </w:r>
           </w:p>
           <w:p>
             <w:pPr>
-              <w:spacing w:after="0" w:line="276" w:lineRule="auto"/>
-              <w:ind w:left="0"/>
+              <w:spacing w:after="40" w:before="0"/>
             </w:pPr>
             <w:r>
               <w:rPr>
-                <w:rFonts w:ascii="Malgun Gothic" w:hAnsi="Malgun Gothic"/>
+                <w:rFonts w:ascii="맑은 고딕" w:hAnsi="맑은 고딕" w:eastAsia="맑은 고딕"/>
+                <w:b w:val="0"/>
                 <w:sz w:val="20"/>
               </w:rPr>
-              <w:t>3. Secure Camera pVM이 Camera HW로 영상을 처리한다</w:t>
+              <w:t>3. Workload(Camera/AI)는 Camera/AI HW로 보안 데이터를 처리한다</w:t>
             </w:r>
           </w:p>
           <w:p>
             <w:pPr>
-              <w:spacing w:after="0" w:line="276" w:lineRule="auto"/>
-              <w:ind w:left="0"/>
+              <w:spacing w:after="40" w:before="0"/>
             </w:pPr>
             <w:r>
               <w:rPr>
-                <w:rFonts w:ascii="Malgun Gothic" w:hAnsi="Malgun Gothic"/>
+                <w:rFonts w:ascii="맑은 고딕" w:hAnsi="맑은 고딕" w:eastAsia="맑은 고딕"/>
+                <w:b w:val="0"/>
                 <w:sz w:val="20"/>
               </w:rPr>
-              <w:t>4. 처리 완료 후 시스템이 Camera HW 버퍼의 잔류 데이터를 삭제하고 접근 권한을 반환한다</w:t>
+              <w:t>4. 시스템은 처리 완료 후 HW 버퍼의 잔류 데이터를 보안 격리하고 접근 권한을 반환한다</w:t>
             </w:r>
           </w:p>
           <w:p>
             <w:pPr>
-              <w:spacing w:after="0" w:line="276" w:lineRule="auto"/>
-              <w:ind w:left="0"/>
+              <w:spacing w:after="40" w:before="0"/>
             </w:pPr>
             <w:r>
               <w:rPr>
-                <w:rFonts w:ascii="Malgun Gothic" w:hAnsi="Malgun Gothic"/>
+                <w:rFonts w:ascii="맑은 고딕" w:hAnsi="맑은 고딕" w:eastAsia="맑은 고딕"/>
+                <w:b w:val="0"/>
                 <w:sz w:val="20"/>
               </w:rPr>
-              <w:t>5. Host의 일반 카메라 기능이 동일한 Camera HW를 이어서 사용한다</w:t>
+              <w:t>5. Normal Camera Application이 Camera HW 사용을 요청한다</w:t>
+            </w:r>
+          </w:p>
+          <w:p>
+            <w:pPr>
+              <w:spacing w:after="40" w:before="0"/>
+            </w:pPr>
+            <w:r>
+              <w:rPr>
+                <w:rFonts w:ascii="맑은 고딕" w:hAnsi="맑은 고딕" w:eastAsia="맑은 고딕"/>
+                <w:b w:val="0"/>
+                <w:sz w:val="20"/>
+              </w:rPr>
+              <w:t>6. 시스템은 Camera HW 접근 권한을 Normal Camera Application에 할당한다</w:t>
             </w:r>
           </w:p>
         </w:tc>
@@ -1061,23 +1155,22 @@
       <w:tr>
         <w:tc>
           <w:tcPr>
-            <w:tcW w:type="dxa" w:w="2268"/>
-            <w:vAlign w:val="center"/>
-            <w:shd w:fill="EDEDED"/>
+            <w:tcW w:type="dxa" w:w="2200"/>
+            <w:shd w:val="clear" w:color="auto" w:fill="F2F2F2"/>
+            <w:tcBorders>
+              <w:top w:val="single" w:sz="8" w:space="0" w:color="000000"/>
+              <w:left w:val="single" w:sz="8" w:space="0" w:color="000000"/>
+              <w:bottom w:val="single" w:sz="8" w:space="0" w:color="000000"/>
+              <w:right w:val="single" w:sz="8" w:space="0" w:color="000000"/>
+            </w:tcBorders>
           </w:tcPr>
           <w:p>
             <w:pPr>
-              <w:spacing w:after="0" w:line="276" w:lineRule="auto"/>
-              <w:ind w:left="0"/>
+              <w:spacing w:after="40" w:before="0"/>
             </w:pPr>
             <w:r>
               <w:rPr>
-                <w:b/>
-              </w:rPr>
-            </w:r>
-            <w:r>
-              <w:rPr>
-                <w:rFonts w:ascii="Malgun Gothic" w:hAnsi="Malgun Gothic"/>
+                <w:rFonts w:ascii="맑은 고딕" w:hAnsi="맑은 고딕" w:eastAsia="맑은 고딕"/>
                 <w:b/>
                 <w:sz w:val="20"/>
               </w:rPr>
@@ -1087,21 +1180,51 @@
         </w:tc>
         <w:tc>
           <w:tcPr>
-            <w:tcW w:type="dxa" w:w="7371"/>
-            <w:vAlign w:val="center"/>
+            <w:tcW w:type="dxa" w:w="7200"/>
+            <w:tcBorders>
+              <w:top w:val="single" w:sz="8" w:space="0" w:color="000000"/>
+              <w:left w:val="single" w:sz="8" w:space="0" w:color="000000"/>
+              <w:bottom w:val="single" w:sz="8" w:space="0" w:color="000000"/>
+              <w:right w:val="single" w:sz="8" w:space="0" w:color="000000"/>
+            </w:tcBorders>
           </w:tcPr>
           <w:p>
             <w:pPr>
-              <w:spacing w:after="0" w:line="276" w:lineRule="auto"/>
-              <w:ind w:left="0"/>
+              <w:spacing w:after="40" w:before="0"/>
             </w:pPr>
-            <w:r/>
             <w:r>
               <w:rPr>
-                <w:rFonts w:ascii="Malgun Gothic" w:hAnsi="Malgun Gothic"/>
+                <w:rFonts w:ascii="맑은 고딕" w:hAnsi="맑은 고딕" w:eastAsia="맑은 고딕"/>
+                <w:b w:val="0"/>
                 <w:sz w:val="20"/>
               </w:rPr>
-              <w:t>HW IP 접근 충돌 발생 시 요청을 큐에 대기시키고 현재 사용 완료 후 순차 처리한다</w:t>
+              <w:t>1. 시스템은 HW IP 접근 충돌 발생 시 요청을 큐에 대기시키고 현재 사용 완료 후 순차 처리한다</w:t>
+            </w:r>
+          </w:p>
+          <w:p>
+            <w:pPr>
+              <w:spacing w:after="40" w:before="0"/>
+            </w:pPr>
+            <w:r>
+              <w:rPr>
+                <w:rFonts w:ascii="맑은 고딕" w:hAnsi="맑은 고딕" w:eastAsia="맑은 고딕"/>
+                <w:b w:val="0"/>
+                <w:sz w:val="20"/>
+              </w:rPr>
+              <w:t>2. 시스템은 Camera/AI HW 사용 주체 전환 전 잔류 데이터 보안 격리가 실패하면 접근 권한 반환을 중단하고 오류를 기록한다</w:t>
+            </w:r>
+          </w:p>
+          <w:p>
+            <w:pPr>
+              <w:spacing w:after="40" w:before="0"/>
+            </w:pPr>
+            <w:r>
+              <w:rPr>
+                <w:rFonts w:ascii="맑은 고딕" w:hAnsi="맑은 고딕" w:eastAsia="맑은 고딕"/>
+                <w:b w:val="0"/>
+                <w:sz w:val="20"/>
+              </w:rPr>
+              <w:t>3. 시스템은 허가되지 않은 pVM 또는 애플리케이션이 Camera/AI HW 접근을 요청하면 S2MPU 정책으로 접근을 차단한다</w:t>
             </w:r>
           </w:p>
         </w:tc>
@@ -1110,44 +1233,33 @@
     <w:p/>
     <w:tbl>
       <w:tblPr>
-        <w:tblStyle w:val="TableGrid"/>
         <w:tblW w:type="auto" w:w="0"/>
-        <w:tblLayout w:type="autofit"/>
+        <w:tblLayout w:type="fixed"/>
         <w:tblLook w:firstColumn="1" w:firstRow="1" w:lastColumn="0" w:lastRow="0" w:noHBand="0" w:noVBand="1" w:val="04A0"/>
-        <w:tblBorders>
-          <w:top w:val="single" w:sz="8" w:space="0" w:color="000000"/>
-          <w:left w:val="single" w:sz="8" w:space="0" w:color="000000"/>
-          <w:bottom w:val="single" w:sz="8" w:space="0" w:color="000000"/>
-          <w:right w:val="single" w:sz="8" w:space="0" w:color="000000"/>
-          <w:insideH w:val="single" w:sz="8" w:space="0" w:color="000000"/>
-          <w:insideV w:val="single" w:sz="8" w:space="0" w:color="000000"/>
-        </w:tblBorders>
       </w:tblPr>
       <w:tblGrid>
-        <w:gridCol w:w="5100"/>
-        <w:gridCol w:w="5100"/>
+        <w:gridCol w:w="4320"/>
+        <w:gridCol w:w="4320"/>
       </w:tblGrid>
       <w:tr>
         <w:tc>
           <w:tcPr>
-            <w:tcW w:type="dxa" w:w="2268"/>
-            <w:vAlign w:val="center"/>
-            <w:shd w:fill="EDEDED"/>
+            <w:tcW w:type="dxa" w:w="2200"/>
+            <w:shd w:val="clear" w:color="auto" w:fill="D9E2F3"/>
+            <w:tcBorders>
+              <w:top w:val="single" w:sz="8" w:space="0" w:color="000000"/>
+              <w:left w:val="single" w:sz="8" w:space="0" w:color="000000"/>
+              <w:bottom w:val="single" w:sz="8" w:space="0" w:color="000000"/>
+              <w:right w:val="single" w:sz="8" w:space="0" w:color="000000"/>
+            </w:tcBorders>
           </w:tcPr>
           <w:p>
             <w:pPr>
-              <w:spacing w:after="0" w:line="276" w:lineRule="auto"/>
-              <w:ind w:left="0"/>
-              <w:jc w:val="center"/>
+              <w:spacing w:after="40" w:before="0"/>
             </w:pPr>
             <w:r>
               <w:rPr>
-                <w:b/>
-              </w:rPr>
-            </w:r>
-            <w:r>
-              <w:rPr>
-                <w:rFonts w:ascii="Malgun Gothic" w:hAnsi="Malgun Gothic"/>
+                <w:rFonts w:ascii="맑은 고딕" w:hAnsi="맑은 고딕" w:eastAsia="맑은 고딕"/>
                 <w:b/>
                 <w:sz w:val="20"/>
               </w:rPr>
@@ -1157,28 +1269,26 @@
         </w:tc>
         <w:tc>
           <w:tcPr>
-            <w:tcW w:type="dxa" w:w="7371"/>
-            <w:vAlign w:val="center"/>
-            <w:shd w:fill="EDEDED"/>
+            <w:tcW w:type="dxa" w:w="7200"/>
+            <w:shd w:val="clear" w:color="auto" w:fill="D9E2F3"/>
+            <w:tcBorders>
+              <w:top w:val="single" w:sz="8" w:space="0" w:color="000000"/>
+              <w:left w:val="single" w:sz="8" w:space="0" w:color="000000"/>
+              <w:bottom w:val="single" w:sz="8" w:space="0" w:color="000000"/>
+              <w:right w:val="single" w:sz="8" w:space="0" w:color="000000"/>
+            </w:tcBorders>
           </w:tcPr>
           <w:p>
             <w:pPr>
-              <w:spacing w:after="0" w:line="276" w:lineRule="auto"/>
-              <w:ind w:left="0"/>
-              <w:jc w:val="center"/>
+              <w:spacing w:after="40" w:before="0"/>
             </w:pPr>
             <w:r>
               <w:rPr>
-                <w:b/>
-              </w:rPr>
-            </w:r>
-            <w:r>
-              <w:rPr>
-                <w:rFonts w:ascii="Malgun Gothic" w:hAnsi="Malgun Gothic"/>
+                <w:rFonts w:ascii="맑은 고딕" w:hAnsi="맑은 고딕" w:eastAsia="맑은 고딕"/>
                 <w:b/>
                 <w:sz w:val="20"/>
               </w:rPr>
-              <w:t>격리 도메인 간 보안 데이터 전송</w:t>
+              <w:t>도메인 간 보안 데이터 전송</w:t>
             </w:r>
           </w:p>
         </w:tc>
@@ -1186,23 +1296,22 @@
       <w:tr>
         <w:tc>
           <w:tcPr>
-            <w:tcW w:type="dxa" w:w="2268"/>
-            <w:vAlign w:val="center"/>
-            <w:shd w:fill="EDEDED"/>
+            <w:tcW w:type="dxa" w:w="2200"/>
+            <w:shd w:val="clear" w:color="auto" w:fill="F2F2F2"/>
+            <w:tcBorders>
+              <w:top w:val="single" w:sz="8" w:space="0" w:color="000000"/>
+              <w:left w:val="single" w:sz="8" w:space="0" w:color="000000"/>
+              <w:bottom w:val="single" w:sz="8" w:space="0" w:color="000000"/>
+              <w:right w:val="single" w:sz="8" w:space="0" w:color="000000"/>
+            </w:tcBorders>
           </w:tcPr>
           <w:p>
             <w:pPr>
-              <w:spacing w:after="0" w:line="276" w:lineRule="auto"/>
-              <w:ind w:left="0"/>
+              <w:spacing w:after="40" w:before="0"/>
             </w:pPr>
             <w:r>
               <w:rPr>
-                <w:b/>
-              </w:rPr>
-            </w:r>
-            <w:r>
-              <w:rPr>
-                <w:rFonts w:ascii="Malgun Gothic" w:hAnsi="Malgun Gothic"/>
+                <w:rFonts w:ascii="맑은 고딕" w:hAnsi="맑은 고딕" w:eastAsia="맑은 고딕"/>
                 <w:b/>
                 <w:sz w:val="20"/>
               </w:rPr>
@@ -1212,21 +1321,25 @@
         </w:tc>
         <w:tc>
           <w:tcPr>
-            <w:tcW w:type="dxa" w:w="7371"/>
-            <w:vAlign w:val="center"/>
+            <w:tcW w:type="dxa" w:w="7200"/>
+            <w:tcBorders>
+              <w:top w:val="single" w:sz="8" w:space="0" w:color="000000"/>
+              <w:left w:val="single" w:sz="8" w:space="0" w:color="000000"/>
+              <w:bottom w:val="single" w:sz="8" w:space="0" w:color="000000"/>
+              <w:right w:val="single" w:sz="8" w:space="0" w:color="000000"/>
+            </w:tcBorders>
           </w:tcPr>
           <w:p>
             <w:pPr>
-              <w:spacing w:after="0" w:line="276" w:lineRule="auto"/>
-              <w:ind w:left="0"/>
+              <w:spacing w:after="40" w:before="0"/>
             </w:pPr>
-            <w:r/>
             <w:r>
               <w:rPr>
-                <w:rFonts w:ascii="Malgun Gothic" w:hAnsi="Malgun Gothic"/>
+                <w:rFonts w:ascii="맑은 고딕" w:hAnsi="맑은 고딕" w:eastAsia="맑은 고딕"/>
+                <w:b w:val="0"/>
                 <w:sz w:val="20"/>
               </w:rPr>
-              <w:t>사용자</w:t>
+              <w:t>Host Application, Workload(Camera/AI)</w:t>
             </w:r>
           </w:p>
         </w:tc>
@@ -1234,23 +1347,22 @@
       <w:tr>
         <w:tc>
           <w:tcPr>
-            <w:tcW w:type="dxa" w:w="2268"/>
-            <w:vAlign w:val="center"/>
-            <w:shd w:fill="EDEDED"/>
+            <w:tcW w:type="dxa" w:w="2200"/>
+            <w:shd w:val="clear" w:color="auto" w:fill="F2F2F2"/>
+            <w:tcBorders>
+              <w:top w:val="single" w:sz="8" w:space="0" w:color="000000"/>
+              <w:left w:val="single" w:sz="8" w:space="0" w:color="000000"/>
+              <w:bottom w:val="single" w:sz="8" w:space="0" w:color="000000"/>
+              <w:right w:val="single" w:sz="8" w:space="0" w:color="000000"/>
+            </w:tcBorders>
           </w:tcPr>
           <w:p>
             <w:pPr>
-              <w:spacing w:after="0" w:line="276" w:lineRule="auto"/>
-              <w:ind w:left="0"/>
+              <w:spacing w:after="40" w:before="0"/>
             </w:pPr>
             <w:r>
               <w:rPr>
-                <w:b/>
-              </w:rPr>
-            </w:r>
-            <w:r>
-              <w:rPr>
-                <w:rFonts w:ascii="Malgun Gothic" w:hAnsi="Malgun Gothic"/>
+                <w:rFonts w:ascii="맑은 고딕" w:hAnsi="맑은 고딕" w:eastAsia="맑은 고딕"/>
                 <w:b/>
                 <w:sz w:val="20"/>
               </w:rPr>
@@ -1260,21 +1372,25 @@
         </w:tc>
         <w:tc>
           <w:tcPr>
-            <w:tcW w:type="dxa" w:w="7371"/>
-            <w:vAlign w:val="center"/>
+            <w:tcW w:type="dxa" w:w="7200"/>
+            <w:tcBorders>
+              <w:top w:val="single" w:sz="8" w:space="0" w:color="000000"/>
+              <w:left w:val="single" w:sz="8" w:space="0" w:color="000000"/>
+              <w:bottom w:val="single" w:sz="8" w:space="0" w:color="000000"/>
+              <w:right w:val="single" w:sz="8" w:space="0" w:color="000000"/>
+            </w:tcBorders>
           </w:tcPr>
           <w:p>
             <w:pPr>
-              <w:spacing w:after="0" w:line="276" w:lineRule="auto"/>
-              <w:ind w:left="0"/>
+              <w:spacing w:after="40" w:before="0"/>
             </w:pPr>
-            <w:r/>
             <w:r>
               <w:rPr>
-                <w:rFonts w:ascii="Malgun Gothic" w:hAnsi="Malgun Gothic"/>
+                <w:rFonts w:ascii="맑은 고딕" w:hAnsi="맑은 고딕" w:eastAsia="맑은 고딕"/>
+                <w:b w:val="0"/>
                 <w:sz w:val="20"/>
               </w:rPr>
-              <w:t>Secure Camera pVM과 Secure AI pVM이 모두 실행 중이다</w:t>
+              <w:t>Host Application이 데이터 전송을 요청할 수 있고 Workload(Camera/AI)가 실행 중이다</w:t>
             </w:r>
           </w:p>
         </w:tc>
@@ -1282,23 +1398,22 @@
       <w:tr>
         <w:tc>
           <w:tcPr>
-            <w:tcW w:type="dxa" w:w="2268"/>
-            <w:vAlign w:val="center"/>
-            <w:shd w:fill="EDEDED"/>
+            <w:tcW w:type="dxa" w:w="2200"/>
+            <w:shd w:val="clear" w:color="auto" w:fill="F2F2F2"/>
+            <w:tcBorders>
+              <w:top w:val="single" w:sz="8" w:space="0" w:color="000000"/>
+              <w:left w:val="single" w:sz="8" w:space="0" w:color="000000"/>
+              <w:bottom w:val="single" w:sz="8" w:space="0" w:color="000000"/>
+              <w:right w:val="single" w:sz="8" w:space="0" w:color="000000"/>
+            </w:tcBorders>
           </w:tcPr>
           <w:p>
             <w:pPr>
-              <w:spacing w:after="0" w:line="276" w:lineRule="auto"/>
-              <w:ind w:left="0"/>
+              <w:spacing w:after="40" w:before="0"/>
             </w:pPr>
             <w:r>
               <w:rPr>
-                <w:b/>
-              </w:rPr>
-            </w:r>
-            <w:r>
-              <w:rPr>
-                <w:rFonts w:ascii="Malgun Gothic" w:hAnsi="Malgun Gothic"/>
+                <w:rFonts w:ascii="맑은 고딕" w:hAnsi="맑은 고딕" w:eastAsia="맑은 고딕"/>
                 <w:b/>
                 <w:sz w:val="20"/>
               </w:rPr>
@@ -1308,21 +1423,25 @@
         </w:tc>
         <w:tc>
           <w:tcPr>
-            <w:tcW w:type="dxa" w:w="7371"/>
-            <w:vAlign w:val="center"/>
+            <w:tcW w:type="dxa" w:w="7200"/>
+            <w:tcBorders>
+              <w:top w:val="single" w:sz="8" w:space="0" w:color="000000"/>
+              <w:left w:val="single" w:sz="8" w:space="0" w:color="000000"/>
+              <w:bottom w:val="single" w:sz="8" w:space="0" w:color="000000"/>
+              <w:right w:val="single" w:sz="8" w:space="0" w:color="000000"/>
+            </w:tcBorders>
           </w:tcPr>
           <w:p>
             <w:pPr>
-              <w:spacing w:after="0" w:line="276" w:lineRule="auto"/>
-              <w:ind w:left="0"/>
+              <w:spacing w:after="40" w:before="0"/>
             </w:pPr>
-            <w:r/>
             <w:r>
               <w:rPr>
-                <w:rFonts w:ascii="Malgun Gothic" w:hAnsi="Malgun Gothic"/>
+                <w:rFonts w:ascii="맑은 고딕" w:hAnsi="맑은 고딕" w:eastAsia="맑은 고딕"/>
+                <w:b w:val="0"/>
                 <w:sz w:val="20"/>
               </w:rPr>
-              <w:t>영상 데이터가 Host에 노출되지 않고 Secure AI pVM에 전달되었다</w:t>
+              <w:t>데이터가 Host에 노출되지 않고 대상 도메인에 전달되었다</w:t>
             </w:r>
           </w:p>
         </w:tc>
@@ -1330,23 +1449,22 @@
       <w:tr>
         <w:tc>
           <w:tcPr>
-            <w:tcW w:type="dxa" w:w="2268"/>
-            <w:vAlign w:val="center"/>
-            <w:shd w:fill="EDEDED"/>
+            <w:tcW w:type="dxa" w:w="2200"/>
+            <w:shd w:val="clear" w:color="auto" w:fill="F2F2F2"/>
+            <w:tcBorders>
+              <w:top w:val="single" w:sz="8" w:space="0" w:color="000000"/>
+              <w:left w:val="single" w:sz="8" w:space="0" w:color="000000"/>
+              <w:bottom w:val="single" w:sz="8" w:space="0" w:color="000000"/>
+              <w:right w:val="single" w:sz="8" w:space="0" w:color="000000"/>
+            </w:tcBorders>
           </w:tcPr>
           <w:p>
             <w:pPr>
-              <w:spacing w:after="0" w:line="276" w:lineRule="auto"/>
-              <w:ind w:left="0"/>
+              <w:spacing w:after="40" w:before="0"/>
             </w:pPr>
             <w:r>
               <w:rPr>
-                <w:b/>
-              </w:rPr>
-            </w:r>
-            <w:r>
-              <w:rPr>
-                <w:rFonts w:ascii="Malgun Gothic" w:hAnsi="Malgun Gothic"/>
+                <w:rFonts w:ascii="맑은 고딕" w:hAnsi="맑은 고딕" w:eastAsia="맑은 고딕"/>
                 <w:b/>
                 <w:sz w:val="20"/>
               </w:rPr>
@@ -1356,60 +1474,77 @@
         </w:tc>
         <w:tc>
           <w:tcPr>
-            <w:tcW w:type="dxa" w:w="7371"/>
-            <w:vAlign w:val="center"/>
+            <w:tcW w:type="dxa" w:w="7200"/>
+            <w:tcBorders>
+              <w:top w:val="single" w:sz="8" w:space="0" w:color="000000"/>
+              <w:left w:val="single" w:sz="8" w:space="0" w:color="000000"/>
+              <w:bottom w:val="single" w:sz="8" w:space="0" w:color="000000"/>
+              <w:right w:val="single" w:sz="8" w:space="0" w:color="000000"/>
+            </w:tcBorders>
           </w:tcPr>
           <w:p>
             <w:pPr>
-              <w:spacing w:after="0" w:line="276" w:lineRule="auto"/>
-              <w:ind w:left="0"/>
+              <w:spacing w:after="40" w:before="0"/>
             </w:pPr>
-            <w:r/>
             <w:r>
               <w:rPr>
-                <w:rFonts w:ascii="Malgun Gothic" w:hAnsi="Malgun Gothic"/>
+                <w:rFonts w:ascii="맑은 고딕" w:hAnsi="맑은 고딕" w:eastAsia="맑은 고딕"/>
+                <w:b w:val="0"/>
                 <w:sz w:val="20"/>
               </w:rPr>
-              <w:t>1. Secure Camera pVM이 영상 프레임 데이터를 보안 공유 버퍼에 기록한다</w:t>
+              <w:t>1. Host Application이 도메인 간 보안 데이터 전송을 요청한다</w:t>
             </w:r>
           </w:p>
           <w:p>
             <w:pPr>
-              <w:spacing w:after="0" w:line="276" w:lineRule="auto"/>
-              <w:ind w:left="0"/>
+              <w:spacing w:after="40" w:before="0"/>
             </w:pPr>
             <w:r>
               <w:rPr>
-                <w:rFonts w:ascii="Malgun Gothic" w:hAnsi="Malgun Gothic"/>
+                <w:rFonts w:ascii="맑은 고딕" w:hAnsi="맑은 고딕" w:eastAsia="맑은 고딕"/>
+                <w:b w:val="0"/>
                 <w:sz w:val="20"/>
               </w:rPr>
-              <w:t>2. 공유 버퍼는 두 pVM만 접근 가능하며 Host는 직접 읽을 수 없다</w:t>
+              <w:t>2. 시스템은 송신/수신 도메인에만 접근 가능한 보안 공유 버퍼를 생성한다</w:t>
             </w:r>
           </w:p>
           <w:p>
             <w:pPr>
-              <w:spacing w:after="0" w:line="276" w:lineRule="auto"/>
-              <w:ind w:left="0"/>
+              <w:spacing w:after="40" w:before="0"/>
             </w:pPr>
             <w:r>
               <w:rPr>
-                <w:rFonts w:ascii="Malgun Gothic" w:hAnsi="Malgun Gothic"/>
+                <w:rFonts w:ascii="맑은 고딕" w:hAnsi="맑은 고딕" w:eastAsia="맑은 고딕"/>
+                <w:b w:val="0"/>
                 <w:sz w:val="20"/>
               </w:rPr>
-              <w:t>3. Secure AI pVM이 공유 버퍼에서 데이터를 읽어 NPU 추론 입력으로 사용한다</w:t>
+              <w:t>3. Workload(Camera/AI)는 데이터를 보안 공유 버퍼에 기록한다</w:t>
             </w:r>
           </w:p>
           <w:p>
             <w:pPr>
-              <w:spacing w:after="0" w:line="276" w:lineRule="auto"/>
-              <w:ind w:left="0"/>
+              <w:spacing w:after="40" w:before="0"/>
             </w:pPr>
             <w:r>
               <w:rPr>
-                <w:rFonts w:ascii="Malgun Gothic" w:hAnsi="Malgun Gothic"/>
+                <w:rFonts w:ascii="맑은 고딕" w:hAnsi="맑은 고딕" w:eastAsia="맑은 고딕"/>
+                <w:b w:val="0"/>
                 <w:sz w:val="20"/>
               </w:rPr>
-              <w:t>4. 전송 완료 후 공유 버퍼가 초기화된다</w:t>
+              <w:t>4. Workload(Camera/AI)는 대상 도메인에서 공유 버퍼의 데이터를 읽어 처리한다</w:t>
+            </w:r>
+          </w:p>
+          <w:p>
+            <w:pPr>
+              <w:spacing w:after="40" w:before="0"/>
+            </w:pPr>
+            <w:r>
+              <w:rPr>
+                <w:rFonts w:ascii="맑은 고딕" w:hAnsi="맑은 고딕" w:eastAsia="맑은 고딕"/>
+                <w:b w:val="0"/>
+                <w:sz w:val="20"/>
+              </w:rPr>
+              <w:t>5. 시스템은 전송 완료 후 공유 버퍼를 초기화한다</w:t>
             </w:r>
           </w:p>
         </w:tc>
@@ -1417,23 +1552,22 @@
       <w:tr>
         <w:tc>
           <w:tcPr>
-            <w:tcW w:type="dxa" w:w="2268"/>
-            <w:vAlign w:val="center"/>
-            <w:shd w:fill="EDEDED"/>
+            <w:tcW w:type="dxa" w:w="2200"/>
+            <w:shd w:val="clear" w:color="auto" w:fill="F2F2F2"/>
+            <w:tcBorders>
+              <w:top w:val="single" w:sz="8" w:space="0" w:color="000000"/>
+              <w:left w:val="single" w:sz="8" w:space="0" w:color="000000"/>
+              <w:bottom w:val="single" w:sz="8" w:space="0" w:color="000000"/>
+              <w:right w:val="single" w:sz="8" w:space="0" w:color="000000"/>
+            </w:tcBorders>
           </w:tcPr>
           <w:p>
             <w:pPr>
-              <w:spacing w:after="0" w:line="276" w:lineRule="auto"/>
-              <w:ind w:left="0"/>
+              <w:spacing w:after="40" w:before="0"/>
             </w:pPr>
             <w:r>
               <w:rPr>
-                <w:b/>
-              </w:rPr>
-            </w:r>
-            <w:r>
-              <w:rPr>
-                <w:rFonts w:ascii="Malgun Gothic" w:hAnsi="Malgun Gothic"/>
+                <w:rFonts w:ascii="맑은 고딕" w:hAnsi="맑은 고딕" w:eastAsia="맑은 고딕"/>
                 <w:b/>
                 <w:sz w:val="20"/>
               </w:rPr>
@@ -1443,21 +1577,51 @@
         </w:tc>
         <w:tc>
           <w:tcPr>
-            <w:tcW w:type="dxa" w:w="7371"/>
-            <w:vAlign w:val="center"/>
+            <w:tcW w:type="dxa" w:w="7200"/>
+            <w:tcBorders>
+              <w:top w:val="single" w:sz="8" w:space="0" w:color="000000"/>
+              <w:left w:val="single" w:sz="8" w:space="0" w:color="000000"/>
+              <w:bottom w:val="single" w:sz="8" w:space="0" w:color="000000"/>
+              <w:right w:val="single" w:sz="8" w:space="0" w:color="000000"/>
+            </w:tcBorders>
           </w:tcPr>
           <w:p>
             <w:pPr>
-              <w:spacing w:after="0" w:line="276" w:lineRule="auto"/>
-              <w:ind w:left="0"/>
+              <w:spacing w:after="40" w:before="0"/>
             </w:pPr>
-            <w:r/>
             <w:r>
               <w:rPr>
-                <w:rFonts w:ascii="Malgun Gothic" w:hAnsi="Malgun Gothic"/>
+                <w:rFonts w:ascii="맑은 고딕" w:hAnsi="맑은 고딕" w:eastAsia="맑은 고딕"/>
+                <w:b w:val="0"/>
                 <w:sz w:val="20"/>
               </w:rPr>
-              <w:t>수신 pVM이 응답 없는 경우 전송을 중단하고 공유 버퍼를 초기화한다</w:t>
+              <w:t>1. 시스템은 수신 Workload가 응답 없는 경우 전송을 중단하고 공유 버퍼를 초기화한다</w:t>
+            </w:r>
+          </w:p>
+          <w:p>
+            <w:pPr>
+              <w:spacing w:after="40" w:before="0"/>
+            </w:pPr>
+            <w:r>
+              <w:rPr>
+                <w:rFonts w:ascii="맑은 고딕" w:hAnsi="맑은 고딕" w:eastAsia="맑은 고딕"/>
+                <w:b w:val="0"/>
+                <w:sz w:val="20"/>
+              </w:rPr>
+              <w:t>2. 시스템은 공유 버퍼 권한 설정에 실패하면 버퍼를 해제하고 Host Application에 오류를 반환한다</w:t>
+            </w:r>
+          </w:p>
+          <w:p>
+            <w:pPr>
+              <w:spacing w:after="40" w:before="0"/>
+            </w:pPr>
+            <w:r>
+              <w:rPr>
+                <w:rFonts w:ascii="맑은 고딕" w:hAnsi="맑은 고딕" w:eastAsia="맑은 고딕"/>
+                <w:b w:val="0"/>
+                <w:sz w:val="20"/>
+              </w:rPr>
+              <w:t>3. Workload(Camera/AI)는 전송 중 데이터 무결성 검증이 실패하면 데이터를 폐기하고 재전송을 요청한다</w:t>
             </w:r>
           </w:p>
         </w:tc>
@@ -1466,44 +1630,33 @@
     <w:p/>
     <w:tbl>
       <w:tblPr>
-        <w:tblStyle w:val="TableGrid"/>
         <w:tblW w:type="auto" w:w="0"/>
-        <w:tblLayout w:type="autofit"/>
+        <w:tblLayout w:type="fixed"/>
         <w:tblLook w:firstColumn="1" w:firstRow="1" w:lastColumn="0" w:lastRow="0" w:noHBand="0" w:noVBand="1" w:val="04A0"/>
-        <w:tblBorders>
-          <w:top w:val="single" w:sz="8" w:space="0" w:color="000000"/>
-          <w:left w:val="single" w:sz="8" w:space="0" w:color="000000"/>
-          <w:bottom w:val="single" w:sz="8" w:space="0" w:color="000000"/>
-          <w:right w:val="single" w:sz="8" w:space="0" w:color="000000"/>
-          <w:insideH w:val="single" w:sz="8" w:space="0" w:color="000000"/>
-          <w:insideV w:val="single" w:sz="8" w:space="0" w:color="000000"/>
-        </w:tblBorders>
       </w:tblPr>
       <w:tblGrid>
-        <w:gridCol w:w="5100"/>
-        <w:gridCol w:w="5100"/>
+        <w:gridCol w:w="4320"/>
+        <w:gridCol w:w="4320"/>
       </w:tblGrid>
       <w:tr>
         <w:tc>
           <w:tcPr>
-            <w:tcW w:type="dxa" w:w="2268"/>
-            <w:vAlign w:val="center"/>
-            <w:shd w:fill="EDEDED"/>
+            <w:tcW w:type="dxa" w:w="2200"/>
+            <w:shd w:val="clear" w:color="auto" w:fill="D9E2F3"/>
+            <w:tcBorders>
+              <w:top w:val="single" w:sz="8" w:space="0" w:color="000000"/>
+              <w:left w:val="single" w:sz="8" w:space="0" w:color="000000"/>
+              <w:bottom w:val="single" w:sz="8" w:space="0" w:color="000000"/>
+              <w:right w:val="single" w:sz="8" w:space="0" w:color="000000"/>
+            </w:tcBorders>
           </w:tcPr>
           <w:p>
             <w:pPr>
-              <w:spacing w:after="0" w:line="276" w:lineRule="auto"/>
-              <w:ind w:left="0"/>
-              <w:jc w:val="center"/>
+              <w:spacing w:after="40" w:before="0"/>
             </w:pPr>
             <w:r>
               <w:rPr>
-                <w:b/>
-              </w:rPr>
-            </w:r>
-            <w:r>
-              <w:rPr>
-                <w:rFonts w:ascii="Malgun Gothic" w:hAnsi="Malgun Gothic"/>
+                <w:rFonts w:ascii="맑은 고딕" w:hAnsi="맑은 고딕" w:eastAsia="맑은 고딕"/>
                 <w:b/>
                 <w:sz w:val="20"/>
               </w:rPr>
@@ -1513,28 +1666,26 @@
         </w:tc>
         <w:tc>
           <w:tcPr>
-            <w:tcW w:type="dxa" w:w="7371"/>
-            <w:vAlign w:val="center"/>
-            <w:shd w:fill="EDEDED"/>
+            <w:tcW w:type="dxa" w:w="7200"/>
+            <w:shd w:val="clear" w:color="auto" w:fill="D9E2F3"/>
+            <w:tcBorders>
+              <w:top w:val="single" w:sz="8" w:space="0" w:color="000000"/>
+              <w:left w:val="single" w:sz="8" w:space="0" w:color="000000"/>
+              <w:bottom w:val="single" w:sz="8" w:space="0" w:color="000000"/>
+              <w:right w:val="single" w:sz="8" w:space="0" w:color="000000"/>
+            </w:tcBorders>
           </w:tcPr>
           <w:p>
             <w:pPr>
-              <w:spacing w:after="0" w:line="276" w:lineRule="auto"/>
-              <w:ind w:left="0"/>
-              <w:jc w:val="center"/>
+              <w:spacing w:after="40" w:before="0"/>
             </w:pPr>
             <w:r>
               <w:rPr>
-                <w:b/>
-              </w:rPr>
-            </w:r>
-            <w:r>
-              <w:rPr>
-                <w:rFonts w:ascii="Malgun Gothic" w:hAnsi="Malgun Gothic"/>
+                <w:rFonts w:ascii="맑은 고딕" w:hAnsi="맑은 고딕" w:eastAsia="맑은 고딕"/>
                 <w:b/>
                 <w:sz w:val="20"/>
               </w:rPr>
-              <w:t>보안 워크로드 동적 탑재</w:t>
+              <w:t>보안 Workload 동적 탑재</w:t>
             </w:r>
           </w:p>
         </w:tc>
@@ -1542,23 +1693,22 @@
       <w:tr>
         <w:tc>
           <w:tcPr>
-            <w:tcW w:type="dxa" w:w="2268"/>
-            <w:vAlign w:val="center"/>
-            <w:shd w:fill="EDEDED"/>
+            <w:tcW w:type="dxa" w:w="2200"/>
+            <w:shd w:val="clear" w:color="auto" w:fill="F2F2F2"/>
+            <w:tcBorders>
+              <w:top w:val="single" w:sz="8" w:space="0" w:color="000000"/>
+              <w:left w:val="single" w:sz="8" w:space="0" w:color="000000"/>
+              <w:bottom w:val="single" w:sz="8" w:space="0" w:color="000000"/>
+              <w:right w:val="single" w:sz="8" w:space="0" w:color="000000"/>
+            </w:tcBorders>
           </w:tcPr>
           <w:p>
             <w:pPr>
-              <w:spacing w:after="0" w:line="276" w:lineRule="auto"/>
-              <w:ind w:left="0"/>
+              <w:spacing w:after="40" w:before="0"/>
             </w:pPr>
             <w:r>
               <w:rPr>
-                <w:b/>
-              </w:rPr>
-            </w:r>
-            <w:r>
-              <w:rPr>
-                <w:rFonts w:ascii="Malgun Gothic" w:hAnsi="Malgun Gothic"/>
+                <w:rFonts w:ascii="맑은 고딕" w:hAnsi="맑은 고딕" w:eastAsia="맑은 고딕"/>
                 <w:b/>
                 <w:sz w:val="20"/>
               </w:rPr>
@@ -1568,21 +1718,25 @@
         </w:tc>
         <w:tc>
           <w:tcPr>
-            <w:tcW w:type="dxa" w:w="7371"/>
-            <w:vAlign w:val="center"/>
+            <w:tcW w:type="dxa" w:w="7200"/>
+            <w:tcBorders>
+              <w:top w:val="single" w:sz="8" w:space="0" w:color="000000"/>
+              <w:left w:val="single" w:sz="8" w:space="0" w:color="000000"/>
+              <w:bottom w:val="single" w:sz="8" w:space="0" w:color="000000"/>
+              <w:right w:val="single" w:sz="8" w:space="0" w:color="000000"/>
+            </w:tcBorders>
           </w:tcPr>
           <w:p>
             <w:pPr>
-              <w:spacing w:after="0" w:line="276" w:lineRule="auto"/>
-              <w:ind w:left="0"/>
+              <w:spacing w:after="40" w:before="0"/>
             </w:pPr>
-            <w:r/>
             <w:r>
               <w:rPr>
-                <w:rFonts w:ascii="Malgun Gothic" w:hAnsi="Malgun Gothic"/>
+                <w:rFonts w:ascii="맑은 고딕" w:hAnsi="맑은 고딕" w:eastAsia="맑은 고딕"/>
+                <w:b w:val="0"/>
                 <w:sz w:val="20"/>
               </w:rPr>
-              <w:t>사용자</w:t>
+              <w:t>Host Application</w:t>
             </w:r>
           </w:p>
         </w:tc>
@@ -1590,23 +1744,22 @@
       <w:tr>
         <w:tc>
           <w:tcPr>
-            <w:tcW w:type="dxa" w:w="2268"/>
-            <w:vAlign w:val="center"/>
-            <w:shd w:fill="EDEDED"/>
+            <w:tcW w:type="dxa" w:w="2200"/>
+            <w:shd w:val="clear" w:color="auto" w:fill="F2F2F2"/>
+            <w:tcBorders>
+              <w:top w:val="single" w:sz="8" w:space="0" w:color="000000"/>
+              <w:left w:val="single" w:sz="8" w:space="0" w:color="000000"/>
+              <w:bottom w:val="single" w:sz="8" w:space="0" w:color="000000"/>
+              <w:right w:val="single" w:sz="8" w:space="0" w:color="000000"/>
+            </w:tcBorders>
           </w:tcPr>
           <w:p>
             <w:pPr>
-              <w:spacing w:after="0" w:line="276" w:lineRule="auto"/>
-              <w:ind w:left="0"/>
+              <w:spacing w:after="40" w:before="0"/>
             </w:pPr>
             <w:r>
               <w:rPr>
-                <w:b/>
-              </w:rPr>
-            </w:r>
-            <w:r>
-              <w:rPr>
-                <w:rFonts w:ascii="Malgun Gothic" w:hAnsi="Malgun Gothic"/>
+                <w:rFonts w:ascii="맑은 고딕" w:hAnsi="맑은 고딕" w:eastAsia="맑은 고딕"/>
                 <w:b/>
                 <w:sz w:val="20"/>
               </w:rPr>
@@ -1616,21 +1769,25 @@
         </w:tc>
         <w:tc>
           <w:tcPr>
-            <w:tcW w:type="dxa" w:w="7371"/>
-            <w:vAlign w:val="center"/>
+            <w:tcW w:type="dxa" w:w="7200"/>
+            <w:tcBorders>
+              <w:top w:val="single" w:sz="8" w:space="0" w:color="000000"/>
+              <w:left w:val="single" w:sz="8" w:space="0" w:color="000000"/>
+              <w:bottom w:val="single" w:sz="8" w:space="0" w:color="000000"/>
+              <w:right w:val="single" w:sz="8" w:space="0" w:color="000000"/>
+            </w:tcBorders>
           </w:tcPr>
           <w:p>
             <w:pPr>
-              <w:spacing w:after="0" w:line="276" w:lineRule="auto"/>
-              <w:ind w:left="0"/>
+              <w:spacing w:after="40" w:before="0"/>
             </w:pPr>
-            <w:r/>
             <w:r>
               <w:rPr>
-                <w:rFonts w:ascii="Malgun Gothic" w:hAnsi="Malgun Gothic"/>
+                <w:rFonts w:ascii="맑은 고딕" w:hAnsi="맑은 고딕" w:eastAsia="맑은 고딕"/>
+                <w:b w:val="0"/>
                 <w:sz w:val="20"/>
               </w:rPr>
-              <w:t>플랫폼이 실행 중이고 신규 워크로드 이미지가 서명되어 있다</w:t>
+              <w:t>플랫폼이 실행 중이고 신규 Workload 이미지가 서명되어 있다</w:t>
             </w:r>
           </w:p>
         </w:tc>
@@ -1638,23 +1795,22 @@
       <w:tr>
         <w:tc>
           <w:tcPr>
-            <w:tcW w:type="dxa" w:w="2268"/>
-            <w:vAlign w:val="center"/>
-            <w:shd w:fill="EDEDED"/>
+            <w:tcW w:type="dxa" w:w="2200"/>
+            <w:shd w:val="clear" w:color="auto" w:fill="F2F2F2"/>
+            <w:tcBorders>
+              <w:top w:val="single" w:sz="8" w:space="0" w:color="000000"/>
+              <w:left w:val="single" w:sz="8" w:space="0" w:color="000000"/>
+              <w:bottom w:val="single" w:sz="8" w:space="0" w:color="000000"/>
+              <w:right w:val="single" w:sz="8" w:space="0" w:color="000000"/>
+            </w:tcBorders>
           </w:tcPr>
           <w:p>
             <w:pPr>
-              <w:spacing w:after="0" w:line="276" w:lineRule="auto"/>
-              <w:ind w:left="0"/>
+              <w:spacing w:after="40" w:before="0"/>
             </w:pPr>
             <w:r>
               <w:rPr>
-                <w:b/>
-              </w:rPr>
-            </w:r>
-            <w:r>
-              <w:rPr>
-                <w:rFonts w:ascii="Malgun Gothic" w:hAnsi="Malgun Gothic"/>
+                <w:rFonts w:ascii="맑은 고딕" w:hAnsi="맑은 고딕" w:eastAsia="맑은 고딕"/>
                 <w:b/>
                 <w:sz w:val="20"/>
               </w:rPr>
@@ -1664,21 +1820,25 @@
         </w:tc>
         <w:tc>
           <w:tcPr>
-            <w:tcW w:type="dxa" w:w="7371"/>
-            <w:vAlign w:val="center"/>
+            <w:tcW w:type="dxa" w:w="7200"/>
+            <w:tcBorders>
+              <w:top w:val="single" w:sz="8" w:space="0" w:color="000000"/>
+              <w:left w:val="single" w:sz="8" w:space="0" w:color="000000"/>
+              <w:bottom w:val="single" w:sz="8" w:space="0" w:color="000000"/>
+              <w:right w:val="single" w:sz="8" w:space="0" w:color="000000"/>
+            </w:tcBorders>
           </w:tcPr>
           <w:p>
             <w:pPr>
-              <w:spacing w:after="0" w:line="276" w:lineRule="auto"/>
-              <w:ind w:left="0"/>
+              <w:spacing w:after="40" w:before="0"/>
             </w:pPr>
-            <w:r/>
             <w:r>
               <w:rPr>
-                <w:rFonts w:ascii="Malgun Gothic" w:hAnsi="Malgun Gothic"/>
+                <w:rFonts w:ascii="맑은 고딕" w:hAnsi="맑은 고딕" w:eastAsia="맑은 고딕"/>
+                <w:b w:val="0"/>
                 <w:sz w:val="20"/>
               </w:rPr>
-              <w:t>신규 보안 워크로드가 펌웨어 재배포 없이 격리 환경에서 실행 중이다</w:t>
+              <w:t>신규 보안 Workload가 펌웨어 재배포 없이 격리 환경에서 실행 중이다</w:t>
             </w:r>
           </w:p>
         </w:tc>
@@ -1686,23 +1846,22 @@
       <w:tr>
         <w:tc>
           <w:tcPr>
-            <w:tcW w:type="dxa" w:w="2268"/>
-            <w:vAlign w:val="center"/>
-            <w:shd w:fill="EDEDED"/>
+            <w:tcW w:type="dxa" w:w="2200"/>
+            <w:shd w:val="clear" w:color="auto" w:fill="F2F2F2"/>
+            <w:tcBorders>
+              <w:top w:val="single" w:sz="8" w:space="0" w:color="000000"/>
+              <w:left w:val="single" w:sz="8" w:space="0" w:color="000000"/>
+              <w:bottom w:val="single" w:sz="8" w:space="0" w:color="000000"/>
+              <w:right w:val="single" w:sz="8" w:space="0" w:color="000000"/>
+            </w:tcBorders>
           </w:tcPr>
           <w:p>
             <w:pPr>
-              <w:spacing w:after="0" w:line="276" w:lineRule="auto"/>
-              <w:ind w:left="0"/>
+              <w:spacing w:after="40" w:before="0"/>
             </w:pPr>
             <w:r>
               <w:rPr>
-                <w:b/>
-              </w:rPr>
-            </w:r>
-            <w:r>
-              <w:rPr>
-                <w:rFonts w:ascii="Malgun Gothic" w:hAnsi="Malgun Gothic"/>
+                <w:rFonts w:ascii="맑은 고딕" w:hAnsi="맑은 고딕" w:eastAsia="맑은 고딕"/>
                 <w:b/>
                 <w:sz w:val="20"/>
               </w:rPr>
@@ -1712,60 +1871,64 @@
         </w:tc>
         <w:tc>
           <w:tcPr>
-            <w:tcW w:type="dxa" w:w="7371"/>
-            <w:vAlign w:val="center"/>
+            <w:tcW w:type="dxa" w:w="7200"/>
+            <w:tcBorders>
+              <w:top w:val="single" w:sz="8" w:space="0" w:color="000000"/>
+              <w:left w:val="single" w:sz="8" w:space="0" w:color="000000"/>
+              <w:bottom w:val="single" w:sz="8" w:space="0" w:color="000000"/>
+              <w:right w:val="single" w:sz="8" w:space="0" w:color="000000"/>
+            </w:tcBorders>
           </w:tcPr>
           <w:p>
             <w:pPr>
-              <w:spacing w:after="0" w:line="276" w:lineRule="auto"/>
-              <w:ind w:left="0"/>
+              <w:spacing w:after="40" w:before="0"/>
             </w:pPr>
-            <w:r/>
             <w:r>
               <w:rPr>
-                <w:rFonts w:ascii="Malgun Gothic" w:hAnsi="Malgun Gothic"/>
+                <w:rFonts w:ascii="맑은 고딕" w:hAnsi="맑은 고딕" w:eastAsia="맑은 고딕"/>
+                <w:b w:val="0"/>
                 <w:sz w:val="20"/>
               </w:rPr>
-              <w:t>1. 사용자가 신규 보안 워크로드 이미지를 pVM 관리 API에 전달한다</w:t>
+              <w:t>1. Host Application이 신규 보안 Workload 이미지를 pVM 관리 API에 전달한다</w:t>
             </w:r>
           </w:p>
           <w:p>
             <w:pPr>
-              <w:spacing w:after="0" w:line="276" w:lineRule="auto"/>
-              <w:ind w:left="0"/>
+              <w:spacing w:after="40" w:before="0"/>
             </w:pPr>
             <w:r>
               <w:rPr>
-                <w:rFonts w:ascii="Malgun Gothic" w:hAnsi="Malgun Gothic"/>
+                <w:rFonts w:ascii="맑은 고딕" w:hAnsi="맑은 고딕" w:eastAsia="맑은 고딕"/>
+                <w:b w:val="0"/>
                 <w:sz w:val="20"/>
               </w:rPr>
-              <w:t>2. 시스템이 이미지 서명을 검증한다</w:t>
+              <w:t>2. 시스템은 이미지 서명을 검증한다</w:t>
             </w:r>
           </w:p>
           <w:p>
             <w:pPr>
-              <w:spacing w:after="0" w:line="276" w:lineRule="auto"/>
-              <w:ind w:left="0"/>
+              <w:spacing w:after="40" w:before="0"/>
             </w:pPr>
             <w:r>
               <w:rPr>
-                <w:rFonts w:ascii="Malgun Gothic" w:hAnsi="Malgun Gothic"/>
+                <w:rFonts w:ascii="맑은 고딕" w:hAnsi="맑은 고딕" w:eastAsia="맑은 고딕"/>
+                <w:b w:val="0"/>
                 <w:sz w:val="20"/>
               </w:rPr>
-              <w:t>3. 시스템이 새 pVM 인스턴스를 생성하고 워크로드를 탑재한다</w:t>
+              <w:t>3. 시스템은 새 pVM 인스턴스를 생성하고 Workload를 탑재한다</w:t>
             </w:r>
           </w:p>
           <w:p>
             <w:pPr>
-              <w:spacing w:after="0" w:line="276" w:lineRule="auto"/>
-              <w:ind w:left="0"/>
+              <w:spacing w:after="40" w:before="0"/>
             </w:pPr>
             <w:r>
               <w:rPr>
-                <w:rFonts w:ascii="Malgun Gothic" w:hAnsi="Malgun Gothic"/>
+                <w:rFonts w:ascii="맑은 고딕" w:hAnsi="맑은 고딕" w:eastAsia="맑은 고딕"/>
+                <w:b w:val="0"/>
                 <w:sz w:val="20"/>
               </w:rPr>
-              <w:t>4. 새 워크로드가 기존 pVM들과 독립적으로 실행된다</w:t>
+              <w:t>4. 시스템은 새 Workload를 기존 pVM들과 독립적으로 실행한다</w:t>
             </w:r>
           </w:p>
         </w:tc>
@@ -1773,23 +1936,22 @@
       <w:tr>
         <w:tc>
           <w:tcPr>
-            <w:tcW w:type="dxa" w:w="2268"/>
-            <w:vAlign w:val="center"/>
-            <w:shd w:fill="EDEDED"/>
+            <w:tcW w:type="dxa" w:w="2200"/>
+            <w:shd w:val="clear" w:color="auto" w:fill="F2F2F2"/>
+            <w:tcBorders>
+              <w:top w:val="single" w:sz="8" w:space="0" w:color="000000"/>
+              <w:left w:val="single" w:sz="8" w:space="0" w:color="000000"/>
+              <w:bottom w:val="single" w:sz="8" w:space="0" w:color="000000"/>
+              <w:right w:val="single" w:sz="8" w:space="0" w:color="000000"/>
+            </w:tcBorders>
           </w:tcPr>
           <w:p>
             <w:pPr>
-              <w:spacing w:after="0" w:line="276" w:lineRule="auto"/>
-              <w:ind w:left="0"/>
+              <w:spacing w:after="40" w:before="0"/>
             </w:pPr>
             <w:r>
               <w:rPr>
-                <w:b/>
-              </w:rPr>
-            </w:r>
-            <w:r>
-              <w:rPr>
-                <w:rFonts w:ascii="Malgun Gothic" w:hAnsi="Malgun Gothic"/>
+                <w:rFonts w:ascii="맑은 고딕" w:hAnsi="맑은 고딕" w:eastAsia="맑은 고딕"/>
                 <w:b/>
                 <w:sz w:val="20"/>
               </w:rPr>
@@ -1799,21 +1961,51 @@
         </w:tc>
         <w:tc>
           <w:tcPr>
-            <w:tcW w:type="dxa" w:w="7371"/>
-            <w:vAlign w:val="center"/>
+            <w:tcW w:type="dxa" w:w="7200"/>
+            <w:tcBorders>
+              <w:top w:val="single" w:sz="8" w:space="0" w:color="000000"/>
+              <w:left w:val="single" w:sz="8" w:space="0" w:color="000000"/>
+              <w:bottom w:val="single" w:sz="8" w:space="0" w:color="000000"/>
+              <w:right w:val="single" w:sz="8" w:space="0" w:color="000000"/>
+            </w:tcBorders>
           </w:tcPr>
           <w:p>
             <w:pPr>
-              <w:spacing w:after="0" w:line="276" w:lineRule="auto"/>
-              <w:ind w:left="0"/>
+              <w:spacing w:after="40" w:before="0"/>
             </w:pPr>
-            <w:r/>
             <w:r>
               <w:rPr>
-                <w:rFonts w:ascii="Malgun Gothic" w:hAnsi="Malgun Gothic"/>
+                <w:rFonts w:ascii="맑은 고딕" w:hAnsi="맑은 고딕" w:eastAsia="맑은 고딕"/>
+                <w:b w:val="0"/>
                 <w:sz w:val="20"/>
               </w:rPr>
-              <w:t>서명 검증 실패 시 탑재를 중단하고 사용자에게 오류를 반환한다</w:t>
+              <w:t>1. 시스템은 서명 검증 실패 시 탑재를 중단하고 Host Application에 오류를 반환한다</w:t>
+            </w:r>
+          </w:p>
+          <w:p>
+            <w:pPr>
+              <w:spacing w:after="40" w:before="0"/>
+            </w:pPr>
+            <w:r>
+              <w:rPr>
+                <w:rFonts w:ascii="맑은 고딕" w:hAnsi="맑은 고딕" w:eastAsia="맑은 고딕"/>
+                <w:b w:val="0"/>
+                <w:sz w:val="20"/>
+              </w:rPr>
+              <w:t>2. 시스템은 Workload 이미지 형식이 지원되지 않으면 pVM 생성을 수행하지 않고 Host Application에 오류를 반환한다</w:t>
+            </w:r>
+          </w:p>
+          <w:p>
+            <w:pPr>
+              <w:spacing w:after="40" w:before="0"/>
+            </w:pPr>
+            <w:r>
+              <w:rPr>
+                <w:rFonts w:ascii="맑은 고딕" w:hAnsi="맑은 고딕" w:eastAsia="맑은 고딕"/>
+                <w:b w:val="0"/>
+                <w:sz w:val="20"/>
+              </w:rPr>
+              <w:t>3. 시스템은 신규 Workload에 필요한 자원이 부족하면 기존 pVM 상태를 유지하고 탑재 요청을 실패 처리한다</w:t>
             </w:r>
           </w:p>
         </w:tc>
@@ -1822,44 +2014,33 @@
     <w:p/>
     <w:tbl>
       <w:tblPr>
-        <w:tblStyle w:val="TableGrid"/>
         <w:tblW w:type="auto" w:w="0"/>
-        <w:tblLayout w:type="autofit"/>
+        <w:tblLayout w:type="fixed"/>
         <w:tblLook w:firstColumn="1" w:firstRow="1" w:lastColumn="0" w:lastRow="0" w:noHBand="0" w:noVBand="1" w:val="04A0"/>
-        <w:tblBorders>
-          <w:top w:val="single" w:sz="8" w:space="0" w:color="000000"/>
-          <w:left w:val="single" w:sz="8" w:space="0" w:color="000000"/>
-          <w:bottom w:val="single" w:sz="8" w:space="0" w:color="000000"/>
-          <w:right w:val="single" w:sz="8" w:space="0" w:color="000000"/>
-          <w:insideH w:val="single" w:sz="8" w:space="0" w:color="000000"/>
-          <w:insideV w:val="single" w:sz="8" w:space="0" w:color="000000"/>
-        </w:tblBorders>
       </w:tblPr>
       <w:tblGrid>
-        <w:gridCol w:w="5100"/>
-        <w:gridCol w:w="5100"/>
+        <w:gridCol w:w="4320"/>
+        <w:gridCol w:w="4320"/>
       </w:tblGrid>
       <w:tr>
         <w:tc>
           <w:tcPr>
-            <w:tcW w:type="dxa" w:w="2268"/>
-            <w:vAlign w:val="center"/>
-            <w:shd w:fill="EDEDED"/>
+            <w:tcW w:type="dxa" w:w="2200"/>
+            <w:shd w:val="clear" w:color="auto" w:fill="D9E2F3"/>
+            <w:tcBorders>
+              <w:top w:val="single" w:sz="8" w:space="0" w:color="000000"/>
+              <w:left w:val="single" w:sz="8" w:space="0" w:color="000000"/>
+              <w:bottom w:val="single" w:sz="8" w:space="0" w:color="000000"/>
+              <w:right w:val="single" w:sz="8" w:space="0" w:color="000000"/>
+            </w:tcBorders>
           </w:tcPr>
           <w:p>
             <w:pPr>
-              <w:spacing w:after="0" w:line="276" w:lineRule="auto"/>
-              <w:ind w:left="0"/>
-              <w:jc w:val="center"/>
+              <w:spacing w:after="40" w:before="0"/>
             </w:pPr>
             <w:r>
               <w:rPr>
-                <w:b/>
-              </w:rPr>
-            </w:r>
-            <w:r>
-              <w:rPr>
-                <w:rFonts w:ascii="Malgun Gothic" w:hAnsi="Malgun Gothic"/>
+                <w:rFonts w:ascii="맑은 고딕" w:hAnsi="맑은 고딕" w:eastAsia="맑은 고딕"/>
                 <w:b/>
                 <w:sz w:val="20"/>
               </w:rPr>
@@ -1869,24 +2050,22 @@
         </w:tc>
         <w:tc>
           <w:tcPr>
-            <w:tcW w:type="dxa" w:w="7371"/>
-            <w:vAlign w:val="center"/>
-            <w:shd w:fill="EDEDED"/>
+            <w:tcW w:type="dxa" w:w="7200"/>
+            <w:shd w:val="clear" w:color="auto" w:fill="D9E2F3"/>
+            <w:tcBorders>
+              <w:top w:val="single" w:sz="8" w:space="0" w:color="000000"/>
+              <w:left w:val="single" w:sz="8" w:space="0" w:color="000000"/>
+              <w:bottom w:val="single" w:sz="8" w:space="0" w:color="000000"/>
+              <w:right w:val="single" w:sz="8" w:space="0" w:color="000000"/>
+            </w:tcBorders>
           </w:tcPr>
           <w:p>
             <w:pPr>
-              <w:spacing w:after="0" w:line="276" w:lineRule="auto"/>
-              <w:ind w:left="0"/>
-              <w:jc w:val="center"/>
+              <w:spacing w:after="40" w:before="0"/>
             </w:pPr>
             <w:r>
               <w:rPr>
-                <w:b/>
-              </w:rPr>
-            </w:r>
-            <w:r>
-              <w:rPr>
-                <w:rFonts w:ascii="Malgun Gothic" w:hAnsi="Malgun Gothic"/>
+                <w:rFonts w:ascii="맑은 고딕" w:hAnsi="맑은 고딕" w:eastAsia="맑은 고딕"/>
                 <w:b/>
                 <w:sz w:val="20"/>
               </w:rPr>
@@ -1898,23 +2077,22 @@
       <w:tr>
         <w:tc>
           <w:tcPr>
-            <w:tcW w:type="dxa" w:w="2268"/>
-            <w:vAlign w:val="center"/>
-            <w:shd w:fill="EDEDED"/>
+            <w:tcW w:type="dxa" w:w="2200"/>
+            <w:shd w:val="clear" w:color="auto" w:fill="F2F2F2"/>
+            <w:tcBorders>
+              <w:top w:val="single" w:sz="8" w:space="0" w:color="000000"/>
+              <w:left w:val="single" w:sz="8" w:space="0" w:color="000000"/>
+              <w:bottom w:val="single" w:sz="8" w:space="0" w:color="000000"/>
+              <w:right w:val="single" w:sz="8" w:space="0" w:color="000000"/>
+            </w:tcBorders>
           </w:tcPr>
           <w:p>
             <w:pPr>
-              <w:spacing w:after="0" w:line="276" w:lineRule="auto"/>
-              <w:ind w:left="0"/>
+              <w:spacing w:after="40" w:before="0"/>
             </w:pPr>
             <w:r>
               <w:rPr>
-                <w:b/>
-              </w:rPr>
-            </w:r>
-            <w:r>
-              <w:rPr>
-                <w:rFonts w:ascii="Malgun Gothic" w:hAnsi="Malgun Gothic"/>
+                <w:rFonts w:ascii="맑은 고딕" w:hAnsi="맑은 고딕" w:eastAsia="맑은 고딕"/>
                 <w:b/>
                 <w:sz w:val="20"/>
               </w:rPr>
@@ -1924,21 +2102,25 @@
         </w:tc>
         <w:tc>
           <w:tcPr>
-            <w:tcW w:type="dxa" w:w="7371"/>
-            <w:vAlign w:val="center"/>
+            <w:tcW w:type="dxa" w:w="7200"/>
+            <w:tcBorders>
+              <w:top w:val="single" w:sz="8" w:space="0" w:color="000000"/>
+              <w:left w:val="single" w:sz="8" w:space="0" w:color="000000"/>
+              <w:bottom w:val="single" w:sz="8" w:space="0" w:color="000000"/>
+              <w:right w:val="single" w:sz="8" w:space="0" w:color="000000"/>
+            </w:tcBorders>
           </w:tcPr>
           <w:p>
             <w:pPr>
-              <w:spacing w:after="0" w:line="276" w:lineRule="auto"/>
-              <w:ind w:left="0"/>
+              <w:spacing w:after="40" w:before="0"/>
             </w:pPr>
-            <w:r/>
             <w:r>
               <w:rPr>
-                <w:rFonts w:ascii="Malgun Gothic" w:hAnsi="Malgun Gothic"/>
+                <w:rFonts w:ascii="맑은 고딕" w:hAnsi="맑은 고딕" w:eastAsia="맑은 고딕"/>
+                <w:b w:val="0"/>
                 <w:sz w:val="20"/>
               </w:rPr>
-              <w:t>사용자</w:t>
+              <w:t>Workload(Camera/AI)</w:t>
             </w:r>
           </w:p>
         </w:tc>
@@ -1946,23 +2128,22 @@
       <w:tr>
         <w:tc>
           <w:tcPr>
-            <w:tcW w:type="dxa" w:w="2268"/>
-            <w:vAlign w:val="center"/>
-            <w:shd w:fill="EDEDED"/>
+            <w:tcW w:type="dxa" w:w="2200"/>
+            <w:shd w:val="clear" w:color="auto" w:fill="F2F2F2"/>
+            <w:tcBorders>
+              <w:top w:val="single" w:sz="8" w:space="0" w:color="000000"/>
+              <w:left w:val="single" w:sz="8" w:space="0" w:color="000000"/>
+              <w:bottom w:val="single" w:sz="8" w:space="0" w:color="000000"/>
+              <w:right w:val="single" w:sz="8" w:space="0" w:color="000000"/>
+            </w:tcBorders>
           </w:tcPr>
           <w:p>
             <w:pPr>
-              <w:spacing w:after="0" w:line="276" w:lineRule="auto"/>
-              <w:ind w:left="0"/>
+              <w:spacing w:after="40" w:before="0"/>
             </w:pPr>
             <w:r>
               <w:rPr>
-                <w:b/>
-              </w:rPr>
-            </w:r>
-            <w:r>
-              <w:rPr>
-                <w:rFonts w:ascii="Malgun Gothic" w:hAnsi="Malgun Gothic"/>
+                <w:rFonts w:ascii="맑은 고딕" w:hAnsi="맑은 고딕" w:eastAsia="맑은 고딕"/>
                 <w:b/>
                 <w:sz w:val="20"/>
               </w:rPr>
@@ -1972,21 +2153,25 @@
         </w:tc>
         <w:tc>
           <w:tcPr>
-            <w:tcW w:type="dxa" w:w="7371"/>
-            <w:vAlign w:val="center"/>
+            <w:tcW w:type="dxa" w:w="7200"/>
+            <w:tcBorders>
+              <w:top w:val="single" w:sz="8" w:space="0" w:color="000000"/>
+              <w:left w:val="single" w:sz="8" w:space="0" w:color="000000"/>
+              <w:bottom w:val="single" w:sz="8" w:space="0" w:color="000000"/>
+              <w:right w:val="single" w:sz="8" w:space="0" w:color="000000"/>
+            </w:tcBorders>
           </w:tcPr>
           <w:p>
             <w:pPr>
-              <w:spacing w:after="0" w:line="276" w:lineRule="auto"/>
-              <w:ind w:left="0"/>
+              <w:spacing w:after="40" w:before="0"/>
             </w:pPr>
-            <w:r/>
             <w:r>
               <w:rPr>
-                <w:rFonts w:ascii="Malgun Gothic" w:hAnsi="Malgun Gothic"/>
+                <w:rFonts w:ascii="맑은 고딕" w:hAnsi="맑은 고딕" w:eastAsia="맑은 고딕"/>
+                <w:b w:val="0"/>
                 <w:sz w:val="20"/>
               </w:rPr>
-              <w:t>Secure AI pVM이 실행 중이고 pVM 내 Secure OS가 초기화되어 있다</w:t>
+              <w:t>Workload(Camera/AI)가 실행 중이고 pVM 내 Secure OS의 기능을 사용할 준비가 되어 있다</w:t>
             </w:r>
           </w:p>
         </w:tc>
@@ -1994,23 +2179,22 @@
       <w:tr>
         <w:tc>
           <w:tcPr>
-            <w:tcW w:type="dxa" w:w="2268"/>
-            <w:vAlign w:val="center"/>
-            <w:shd w:fill="EDEDED"/>
+            <w:tcW w:type="dxa" w:w="2200"/>
+            <w:shd w:val="clear" w:color="auto" w:fill="F2F2F2"/>
+            <w:tcBorders>
+              <w:top w:val="single" w:sz="8" w:space="0" w:color="000000"/>
+              <w:left w:val="single" w:sz="8" w:space="0" w:color="000000"/>
+              <w:bottom w:val="single" w:sz="8" w:space="0" w:color="000000"/>
+              <w:right w:val="single" w:sz="8" w:space="0" w:color="000000"/>
+            </w:tcBorders>
           </w:tcPr>
           <w:p>
             <w:pPr>
-              <w:spacing w:after="0" w:line="276" w:lineRule="auto"/>
-              <w:ind w:left="0"/>
+              <w:spacing w:after="40" w:before="0"/>
             </w:pPr>
             <w:r>
               <w:rPr>
-                <w:b/>
-              </w:rPr>
-            </w:r>
-            <w:r>
-              <w:rPr>
-                <w:rFonts w:ascii="Malgun Gothic" w:hAnsi="Malgun Gothic"/>
+                <w:rFonts w:ascii="맑은 고딕" w:hAnsi="맑은 고딕" w:eastAsia="맑은 고딕"/>
                 <w:b/>
                 <w:sz w:val="20"/>
               </w:rPr>
@@ -2020,21 +2204,25 @@
         </w:tc>
         <w:tc>
           <w:tcPr>
-            <w:tcW w:type="dxa" w:w="7371"/>
-            <w:vAlign w:val="center"/>
+            <w:tcW w:type="dxa" w:w="7200"/>
+            <w:tcBorders>
+              <w:top w:val="single" w:sz="8" w:space="0" w:color="000000"/>
+              <w:left w:val="single" w:sz="8" w:space="0" w:color="000000"/>
+              <w:bottom w:val="single" w:sz="8" w:space="0" w:color="000000"/>
+              <w:right w:val="single" w:sz="8" w:space="0" w:color="000000"/>
+            </w:tcBorders>
           </w:tcPr>
           <w:p>
             <w:pPr>
-              <w:spacing w:after="0" w:line="276" w:lineRule="auto"/>
-              <w:ind w:left="0"/>
+              <w:spacing w:after="40" w:before="0"/>
             </w:pPr>
-            <w:r/>
             <w:r>
               <w:rPr>
-                <w:rFonts w:ascii="Malgun Gothic" w:hAnsi="Malgun Gothic"/>
+                <w:rFonts w:ascii="맑은 고딕" w:hAnsi="맑은 고딕" w:eastAsia="맑은 고딕"/>
+                <w:b w:val="0"/>
                 <w:sz w:val="20"/>
               </w:rPr>
-              <w:t>데이터가 암호화/복호화된 상태로 반환되었다</w:t>
+              <w:t>데이터가 암호화/복호화된 상태로 Workload(Camera/AI)에 반환되었다</w:t>
             </w:r>
           </w:p>
         </w:tc>
@@ -2042,23 +2230,22 @@
       <w:tr>
         <w:tc>
           <w:tcPr>
-            <w:tcW w:type="dxa" w:w="2268"/>
-            <w:vAlign w:val="center"/>
-            <w:shd w:fill="EDEDED"/>
+            <w:tcW w:type="dxa" w:w="2200"/>
+            <w:shd w:val="clear" w:color="auto" w:fill="F2F2F2"/>
+            <w:tcBorders>
+              <w:top w:val="single" w:sz="8" w:space="0" w:color="000000"/>
+              <w:left w:val="single" w:sz="8" w:space="0" w:color="000000"/>
+              <w:bottom w:val="single" w:sz="8" w:space="0" w:color="000000"/>
+              <w:right w:val="single" w:sz="8" w:space="0" w:color="000000"/>
+            </w:tcBorders>
           </w:tcPr>
           <w:p>
             <w:pPr>
-              <w:spacing w:after="0" w:line="276" w:lineRule="auto"/>
-              <w:ind w:left="0"/>
+              <w:spacing w:after="40" w:before="0"/>
             </w:pPr>
             <w:r>
               <w:rPr>
-                <w:b/>
-              </w:rPr>
-            </w:r>
-            <w:r>
-              <w:rPr>
-                <w:rFonts w:ascii="Malgun Gothic" w:hAnsi="Malgun Gothic"/>
+                <w:rFonts w:ascii="맑은 고딕" w:hAnsi="맑은 고딕" w:eastAsia="맑은 고딕"/>
                 <w:b/>
                 <w:sz w:val="20"/>
               </w:rPr>
@@ -2068,60 +2255,64 @@
         </w:tc>
         <w:tc>
           <w:tcPr>
-            <w:tcW w:type="dxa" w:w="7371"/>
-            <w:vAlign w:val="center"/>
+            <w:tcW w:type="dxa" w:w="7200"/>
+            <w:tcBorders>
+              <w:top w:val="single" w:sz="8" w:space="0" w:color="000000"/>
+              <w:left w:val="single" w:sz="8" w:space="0" w:color="000000"/>
+              <w:bottom w:val="single" w:sz="8" w:space="0" w:color="000000"/>
+              <w:right w:val="single" w:sz="8" w:space="0" w:color="000000"/>
+            </w:tcBorders>
           </w:tcPr>
           <w:p>
             <w:pPr>
-              <w:spacing w:after="0" w:line="276" w:lineRule="auto"/>
-              <w:ind w:left="0"/>
+              <w:spacing w:after="40" w:before="0"/>
             </w:pPr>
-            <w:r/>
             <w:r>
               <w:rPr>
-                <w:rFonts w:ascii="Malgun Gothic" w:hAnsi="Malgun Gothic"/>
+                <w:rFonts w:ascii="맑은 고딕" w:hAnsi="맑은 고딕" w:eastAsia="맑은 고딕"/>
+                <w:b w:val="0"/>
                 <w:sz w:val="20"/>
               </w:rPr>
-              <w:t>1. 사용자가 Secure OS에 ENC/DEC 명령과 대상 데이터를 전달한다</w:t>
+              <w:t>1. Workload(Camera/AI)가 Secure OS에 ENC/DEC 명령과 대상 데이터를 전달한다</w:t>
             </w:r>
           </w:p>
           <w:p>
             <w:pPr>
-              <w:spacing w:after="0" w:line="276" w:lineRule="auto"/>
-              <w:ind w:left="0"/>
+              <w:spacing w:after="40" w:before="0"/>
             </w:pPr>
             <w:r>
               <w:rPr>
-                <w:rFonts w:ascii="Malgun Gothic" w:hAnsi="Malgun Gothic"/>
+                <w:rFonts w:ascii="맑은 고딕" w:hAnsi="맑은 고딕" w:eastAsia="맑은 고딕"/>
+                <w:b w:val="0"/>
                 <w:sz w:val="20"/>
               </w:rPr>
-              <w:t>2. Secure OS가 데이터를 암호화 또는 복호화한다</w:t>
+              <w:t>2. 시스템은 Secure OS를 통해 데이터를 암호화 또는 복호화한다</w:t>
             </w:r>
           </w:p>
           <w:p>
             <w:pPr>
-              <w:spacing w:after="0" w:line="276" w:lineRule="auto"/>
-              <w:ind w:left="0"/>
+              <w:spacing w:after="40" w:before="0"/>
             </w:pPr>
             <w:r>
               <w:rPr>
-                <w:rFonts w:ascii="Malgun Gothic" w:hAnsi="Malgun Gothic"/>
+                <w:rFonts w:ascii="맑은 고딕" w:hAnsi="맑은 고딕" w:eastAsia="맑은 고딕"/>
+                <w:b w:val="0"/>
                 <w:sz w:val="20"/>
               </w:rPr>
-              <w:t>3. 처리된 데이터가 사용자에게 반환된다</w:t>
+              <w:t>3. 시스템은 처리된 데이터를 Workload(Camera/AI)에 반환한다</w:t>
             </w:r>
           </w:p>
           <w:p>
             <w:pPr>
-              <w:spacing w:after="0" w:line="276" w:lineRule="auto"/>
-              <w:ind w:left="0"/>
+              <w:spacing w:after="40" w:before="0"/>
             </w:pPr>
             <w:r>
               <w:rPr>
-                <w:rFonts w:ascii="Malgun Gothic" w:hAnsi="Malgun Gothic"/>
+                <w:rFonts w:ascii="맑은 고딕" w:hAnsi="맑은 고딕" w:eastAsia="맑은 고딕"/>
+                <w:b w:val="0"/>
                 <w:sz w:val="20"/>
               </w:rPr>
-              <w:t>4. 사용자가 처리된 데이터를 외부 시스템으로 전달한다</w:t>
+              <w:t>4. Workload(Camera/AI)는 처리된 데이터를 후속 보안 처리에 사용한다</w:t>
             </w:r>
           </w:p>
         </w:tc>
@@ -2129,23 +2320,22 @@
       <w:tr>
         <w:tc>
           <w:tcPr>
-            <w:tcW w:type="dxa" w:w="2268"/>
-            <w:vAlign w:val="center"/>
-            <w:shd w:fill="EDEDED"/>
+            <w:tcW w:type="dxa" w:w="2200"/>
+            <w:shd w:val="clear" w:color="auto" w:fill="F2F2F2"/>
+            <w:tcBorders>
+              <w:top w:val="single" w:sz="8" w:space="0" w:color="000000"/>
+              <w:left w:val="single" w:sz="8" w:space="0" w:color="000000"/>
+              <w:bottom w:val="single" w:sz="8" w:space="0" w:color="000000"/>
+              <w:right w:val="single" w:sz="8" w:space="0" w:color="000000"/>
+            </w:tcBorders>
           </w:tcPr>
           <w:p>
             <w:pPr>
-              <w:spacing w:after="0" w:line="276" w:lineRule="auto"/>
-              <w:ind w:left="0"/>
+              <w:spacing w:after="40" w:before="0"/>
             </w:pPr>
             <w:r>
               <w:rPr>
-                <w:b/>
-              </w:rPr>
-            </w:r>
-            <w:r>
-              <w:rPr>
-                <w:rFonts w:ascii="Malgun Gothic" w:hAnsi="Malgun Gothic"/>
+                <w:rFonts w:ascii="맑은 고딕" w:hAnsi="맑은 고딕" w:eastAsia="맑은 고딕"/>
                 <w:b/>
                 <w:sz w:val="20"/>
               </w:rPr>
@@ -2155,403 +2345,51 @@
         </w:tc>
         <w:tc>
           <w:tcPr>
-            <w:tcW w:type="dxa" w:w="7371"/>
-            <w:vAlign w:val="center"/>
+            <w:tcW w:type="dxa" w:w="7200"/>
+            <w:tcBorders>
+              <w:top w:val="single" w:sz="8" w:space="0" w:color="000000"/>
+              <w:left w:val="single" w:sz="8" w:space="0" w:color="000000"/>
+              <w:bottom w:val="single" w:sz="8" w:space="0" w:color="000000"/>
+              <w:right w:val="single" w:sz="8" w:space="0" w:color="000000"/>
+            </w:tcBorders>
           </w:tcPr>
           <w:p>
             <w:pPr>
-              <w:spacing w:after="0" w:line="276" w:lineRule="auto"/>
-              <w:ind w:left="0"/>
-            </w:pPr>
-            <w:r/>
-            <w:r>
-              <w:rPr>
-                <w:rFonts w:ascii="Malgun Gothic" w:hAnsi="Malgun Gothic"/>
-                <w:sz w:val="20"/>
-              </w:rPr>
-              <w:t>ENC/DEC 실패 시 오류를 반환하고 평문 데이터는 pVM 외부로 유출하지 않는다</w:t>
-            </w:r>
-          </w:p>
-        </w:tc>
-      </w:tr>
-    </w:tbl>
-    <w:p/>
-    <w:tbl>
-      <w:tblPr>
-        <w:tblStyle w:val="TableGrid"/>
-        <w:tblW w:type="auto" w:w="0"/>
-        <w:tblLayout w:type="autofit"/>
-        <w:tblLook w:firstColumn="1" w:firstRow="1" w:lastColumn="0" w:lastRow="0" w:noHBand="0" w:noVBand="1" w:val="04A0"/>
-        <w:tblBorders>
-          <w:top w:val="single" w:sz="8" w:space="0" w:color="000000"/>
-          <w:left w:val="single" w:sz="8" w:space="0" w:color="000000"/>
-          <w:bottom w:val="single" w:sz="8" w:space="0" w:color="000000"/>
-          <w:right w:val="single" w:sz="8" w:space="0" w:color="000000"/>
-          <w:insideH w:val="single" w:sz="8" w:space="0" w:color="000000"/>
-          <w:insideV w:val="single" w:sz="8" w:space="0" w:color="000000"/>
-        </w:tblBorders>
-      </w:tblPr>
-      <w:tblGrid>
-        <w:gridCol w:w="5100"/>
-        <w:gridCol w:w="5100"/>
-      </w:tblGrid>
-      <w:tr>
-        <w:tc>
-          <w:tcPr>
-            <w:tcW w:type="dxa" w:w="2268"/>
-            <w:vAlign w:val="center"/>
-            <w:shd w:fill="EDEDED"/>
-          </w:tcPr>
-          <w:p>
-            <w:pPr>
-              <w:spacing w:after="0" w:line="276" w:lineRule="auto"/>
-              <w:ind w:left="0"/>
-              <w:jc w:val="center"/>
+              <w:spacing w:after="40" w:before="0"/>
             </w:pPr>
             <w:r>
               <w:rPr>
-                <w:b/>
-              </w:rPr>
-            </w:r>
-            <w:r>
-              <w:rPr>
-                <w:rFonts w:ascii="Malgun Gothic" w:hAnsi="Malgun Gothic"/>
-                <w:b/>
+                <w:rFonts w:ascii="맑은 고딕" w:hAnsi="맑은 고딕" w:eastAsia="맑은 고딕"/>
+                <w:b w:val="0"/>
                 <w:sz w:val="20"/>
               </w:rPr>
-              <w:t>UC-07</w:t>
-            </w:r>
-          </w:p>
-        </w:tc>
-        <w:tc>
-          <w:tcPr>
-            <w:tcW w:type="dxa" w:w="7371"/>
-            <w:vAlign w:val="center"/>
-            <w:shd w:fill="EDEDED"/>
-          </w:tcPr>
-          <w:p>
-            <w:pPr>
-              <w:spacing w:after="0" w:line="276" w:lineRule="auto"/>
-              <w:ind w:left="0"/>
-              <w:jc w:val="center"/>
-            </w:pPr>
-            <w:r>
-              <w:rPr>
-                <w:b/>
-              </w:rPr>
-            </w:r>
-            <w:r>
-              <w:rPr>
-                <w:rFonts w:ascii="Malgun Gothic" w:hAnsi="Malgun Gothic"/>
-                <w:b/>
-                <w:sz w:val="20"/>
-              </w:rPr>
-              <w:t>pVM 모니터링 및 장애 복구</w:t>
-            </w:r>
-          </w:p>
-        </w:tc>
-      </w:tr>
-      <w:tr>
-        <w:tc>
-          <w:tcPr>
-            <w:tcW w:type="dxa" w:w="2268"/>
-            <w:vAlign w:val="center"/>
-            <w:shd w:fill="EDEDED"/>
-          </w:tcPr>
-          <w:p>
-            <w:pPr>
-              <w:spacing w:after="0" w:line="276" w:lineRule="auto"/>
-              <w:ind w:left="0"/>
-            </w:pPr>
-            <w:r>
-              <w:rPr>
-                <w:b/>
-              </w:rPr>
-            </w:r>
-            <w:r>
-              <w:rPr>
-                <w:rFonts w:ascii="Malgun Gothic" w:hAnsi="Malgun Gothic"/>
-                <w:b/>
-                <w:sz w:val="20"/>
-              </w:rPr>
-              <w:t>Actor</w:t>
-            </w:r>
-          </w:p>
-        </w:tc>
-        <w:tc>
-          <w:tcPr>
-            <w:tcW w:type="dxa" w:w="7371"/>
-            <w:vAlign w:val="center"/>
-          </w:tcPr>
-          <w:p>
-            <w:pPr>
-              <w:spacing w:after="0" w:line="276" w:lineRule="auto"/>
-              <w:ind w:left="0"/>
-            </w:pPr>
-            <w:r/>
-            <w:r>
-              <w:rPr>
-                <w:rFonts w:ascii="Malgun Gothic" w:hAnsi="Malgun Gothic"/>
-                <w:sz w:val="20"/>
-              </w:rPr>
-              <w:t>사용자</w:t>
-            </w:r>
-          </w:p>
-        </w:tc>
-      </w:tr>
-      <w:tr>
-        <w:tc>
-          <w:tcPr>
-            <w:tcW w:type="dxa" w:w="2268"/>
-            <w:vAlign w:val="center"/>
-            <w:shd w:fill="EDEDED"/>
-          </w:tcPr>
-          <w:p>
-            <w:pPr>
-              <w:spacing w:after="0" w:line="276" w:lineRule="auto"/>
-              <w:ind w:left="0"/>
-            </w:pPr>
-            <w:r>
-              <w:rPr>
-                <w:b/>
-              </w:rPr>
-            </w:r>
-            <w:r>
-              <w:rPr>
-                <w:rFonts w:ascii="Malgun Gothic" w:hAnsi="Malgun Gothic"/>
-                <w:b/>
-                <w:sz w:val="20"/>
-              </w:rPr>
-              <w:t>Pre-Condition</w:t>
-            </w:r>
-          </w:p>
-        </w:tc>
-        <w:tc>
-          <w:tcPr>
-            <w:tcW w:type="dxa" w:w="7371"/>
-            <w:vAlign w:val="center"/>
-          </w:tcPr>
-          <w:p>
-            <w:pPr>
-              <w:spacing w:after="0" w:line="276" w:lineRule="auto"/>
-              <w:ind w:left="0"/>
-            </w:pPr>
-            <w:r/>
-            <w:r>
-              <w:rPr>
-                <w:rFonts w:ascii="Malgun Gothic" w:hAnsi="Malgun Gothic"/>
-                <w:sz w:val="20"/>
-              </w:rPr>
-              <w:t>pVM이 실행 중이고 모니터링이 활성화되어 있다</w:t>
-            </w:r>
-          </w:p>
-        </w:tc>
-      </w:tr>
-      <w:tr>
-        <w:tc>
-          <w:tcPr>
-            <w:tcW w:type="dxa" w:w="2268"/>
-            <w:vAlign w:val="center"/>
-            <w:shd w:fill="EDEDED"/>
-          </w:tcPr>
-          <w:p>
-            <w:pPr>
-              <w:spacing w:after="0" w:line="276" w:lineRule="auto"/>
-              <w:ind w:left="0"/>
-            </w:pPr>
-            <w:r>
-              <w:rPr>
-                <w:b/>
-              </w:rPr>
-            </w:r>
-            <w:r>
-              <w:rPr>
-                <w:rFonts w:ascii="Malgun Gothic" w:hAnsi="Malgun Gothic"/>
-                <w:b/>
-                <w:sz w:val="20"/>
-              </w:rPr>
-              <w:t>Post-Condition</w:t>
-            </w:r>
-          </w:p>
-        </w:tc>
-        <w:tc>
-          <w:tcPr>
-            <w:tcW w:type="dxa" w:w="7371"/>
-            <w:vAlign w:val="center"/>
-          </w:tcPr>
-          <w:p>
-            <w:pPr>
-              <w:spacing w:after="0" w:line="276" w:lineRule="auto"/>
-              <w:ind w:left="0"/>
-            </w:pPr>
-            <w:r/>
-            <w:r>
-              <w:rPr>
-                <w:rFonts w:ascii="Malgun Gothic" w:hAnsi="Malgun Gothic"/>
-                <w:sz w:val="20"/>
-              </w:rPr>
-              <w:t>장애 pVM이 재시작되었고 다른 pVM과 Host는 영향받지 않았다</w:t>
-            </w:r>
-          </w:p>
-        </w:tc>
-      </w:tr>
-      <w:tr>
-        <w:tc>
-          <w:tcPr>
-            <w:tcW w:type="dxa" w:w="2268"/>
-            <w:vAlign w:val="center"/>
-            <w:shd w:fill="EDEDED"/>
-          </w:tcPr>
-          <w:p>
-            <w:pPr>
-              <w:spacing w:after="0" w:line="276" w:lineRule="auto"/>
-              <w:ind w:left="0"/>
-            </w:pPr>
-            <w:r>
-              <w:rPr>
-                <w:b/>
-              </w:rPr>
-            </w:r>
-            <w:r>
-              <w:rPr>
-                <w:rFonts w:ascii="Malgun Gothic" w:hAnsi="Malgun Gothic"/>
-                <w:b/>
-                <w:sz w:val="20"/>
-              </w:rPr>
-              <w:t>Main Flow</w:t>
-            </w:r>
-          </w:p>
-        </w:tc>
-        <w:tc>
-          <w:tcPr>
-            <w:tcW w:type="dxa" w:w="7371"/>
-            <w:vAlign w:val="center"/>
-          </w:tcPr>
-          <w:p>
-            <w:pPr>
-              <w:spacing w:after="0" w:line="276" w:lineRule="auto"/>
-              <w:ind w:left="0"/>
-            </w:pPr>
-            <w:r/>
-            <w:r>
-              <w:rPr>
-                <w:rFonts w:ascii="Malgun Gothic" w:hAnsi="Malgun Gothic"/>
-                <w:sz w:val="20"/>
-              </w:rPr>
-              <w:t>1. 시스템이 pVM 상태 이상을 감지한다</w:t>
+              <w:t>1. 시스템은 ENC/DEC 실패 시 오류를 반환하고 평문 데이터는 pVM 외부로 유출하지 않는다</w:t>
             </w:r>
           </w:p>
           <w:p>
             <w:pPr>
-              <w:spacing w:after="0" w:line="276" w:lineRule="auto"/>
-              <w:ind w:left="0"/>
+              <w:spacing w:after="40" w:before="0"/>
             </w:pPr>
             <w:r>
               <w:rPr>
-                <w:rFonts w:ascii="Malgun Gothic" w:hAnsi="Malgun Gothic"/>
+                <w:rFonts w:ascii="맑은 고딕" w:hAnsi="맑은 고딕" w:eastAsia="맑은 고딕"/>
+                <w:b w:val="0"/>
                 <w:sz w:val="20"/>
               </w:rPr>
-              <w:t>2. 사용자에게 장애 알림이 전달된다</w:t>
+              <w:t>2. 시스템은 Secure OS가 응답하지 않으면 요청을 시간 초과 처리하고 세션을 정리한다</w:t>
             </w:r>
           </w:p>
           <w:p>
             <w:pPr>
-              <w:spacing w:after="0" w:line="276" w:lineRule="auto"/>
-              <w:ind w:left="0"/>
+              <w:spacing w:after="40" w:before="0"/>
             </w:pPr>
             <w:r>
               <w:rPr>
-                <w:rFonts w:ascii="Malgun Gothic" w:hAnsi="Malgun Gothic"/>
+                <w:rFonts w:ascii="맑은 고딕" w:hAnsi="맑은 고딕" w:eastAsia="맑은 고딕"/>
+                <w:b w:val="0"/>
                 <w:sz w:val="20"/>
               </w:rPr>
-              <w:t>3. 시스템이 해당 pVM의 자원을 안전하게 회수한다</w:t>
-            </w:r>
-          </w:p>
-          <w:p>
-            <w:pPr>
-              <w:spacing w:after="0" w:line="276" w:lineRule="auto"/>
-              <w:ind w:left="0"/>
-            </w:pPr>
-            <w:r>
-              <w:rPr>
-                <w:rFonts w:ascii="Malgun Gothic" w:hAnsi="Malgun Gothic"/>
-                <w:sz w:val="20"/>
-              </w:rPr>
-              <w:t>4. 다른 pVM과 Host는 정상 동작을 유지한다</w:t>
-            </w:r>
-          </w:p>
-          <w:p>
-            <w:pPr>
-              <w:spacing w:after="0" w:line="276" w:lineRule="auto"/>
-              <w:ind w:left="0"/>
-            </w:pPr>
-            <w:r>
-              <w:rPr>
-                <w:rFonts w:ascii="Malgun Gothic" w:hAnsi="Malgun Gothic"/>
-                <w:sz w:val="20"/>
-              </w:rPr>
-              <w:t>5. 자동 재시작 정책 또는 사용자 명령에 따라 pVM이 재시작된다</w:t>
-            </w:r>
-          </w:p>
-          <w:p>
-            <w:pPr>
-              <w:spacing w:after="0" w:line="276" w:lineRule="auto"/>
-              <w:ind w:left="0"/>
-            </w:pPr>
-            <w:r>
-              <w:rPr>
-                <w:rFonts w:ascii="Malgun Gothic" w:hAnsi="Malgun Gothic"/>
-                <w:sz w:val="20"/>
-              </w:rPr>
-              <w:t>6. 재시작된 pVM이 정상 상태로 복귀한다</w:t>
-            </w:r>
-          </w:p>
-        </w:tc>
-      </w:tr>
-      <w:tr>
-        <w:tc>
-          <w:tcPr>
-            <w:tcW w:type="dxa" w:w="2268"/>
-            <w:vAlign w:val="center"/>
-            <w:shd w:fill="EDEDED"/>
-          </w:tcPr>
-          <w:p>
-            <w:pPr>
-              <w:spacing w:after="0" w:line="276" w:lineRule="auto"/>
-              <w:ind w:left="0"/>
-            </w:pPr>
-            <w:r>
-              <w:rPr>
-                <w:b/>
-              </w:rPr>
-            </w:r>
-            <w:r>
-              <w:rPr>
-                <w:rFonts w:ascii="Malgun Gothic" w:hAnsi="Malgun Gothic"/>
-                <w:b/>
-                <w:sz w:val="20"/>
-              </w:rPr>
-              <w:t>Alternative Flow</w:t>
-            </w:r>
-          </w:p>
-        </w:tc>
-        <w:tc>
-          <w:tcPr>
-            <w:tcW w:type="dxa" w:w="7371"/>
-            <w:vAlign w:val="center"/>
-          </w:tcPr>
-          <w:p>
-            <w:pPr>
-              <w:spacing w:after="0" w:line="276" w:lineRule="auto"/>
-              <w:ind w:left="0"/>
-            </w:pPr>
-            <w:r/>
-            <w:r>
-              <w:rPr>
-                <w:rFonts w:ascii="Malgun Gothic" w:hAnsi="Malgun Gothic"/>
-                <w:sz w:val="20"/>
-              </w:rPr>
-              <w:t>재시작 실패 시 pVM을 종료하고 사용자에게 알린다</w:t>
+              <w:t>3. 시스템은 잘못된 명령 또는 권한 없는 요청이 전달되면 처리를 거부하고 오류를 반환한다</w:t>
             </w:r>
           </w:p>
         </w:tc>
@@ -2559,7 +2397,7 @@
     </w:tbl>
     <w:sectPr>
       <w:pgSz w:w="12240" w:h="15840"/>
-      <w:pgMar w:top="1020" w:right="1020" w:bottom="1020" w:left="1020" w:header="720" w:footer="720" w:gutter="0"/>
+      <w:pgMar w:top="1440" w:right="1800" w:bottom="1440" w:left="1800" w:header="720" w:footer="720" w:gutter="0"/>
       <w:cols w:space="720"/>
       <w:docGrid w:linePitch="360"/>
     </w:sectPr>
@@ -2931,7 +2769,7 @@
     <w:qFormat/>
     <w:rsid w:val="00FC693F"/>
     <w:rPr>
-      <w:rFonts w:ascii="Malgun Gothic" w:hAnsi="Malgun Gothic" w:eastAsia="Malgun Gothic"/>
+      <w:rFonts w:ascii="맑은 고딕" w:hAnsi="맑은 고딕" w:eastAsia="맑은 고딕"/>
       <w:sz w:val="20"/>
     </w:rPr>
   </w:style>

</xml_diff>

<commit_message>
docs: regenerate use case specification as Word document
</commit_message>
<xml_diff>
--- a/docs/01_use_case_spec.docx
+++ b/docs/01_use_case_spec.docx
@@ -5,44 +5,47 @@
     <w:p>
       <w:pPr>
         <w:pStyle w:val="Heading1"/>
+        <w:jc w:val="center"/>
       </w:pPr>
       <w:r>
         <w:rPr>
-          <w:rFonts w:ascii="맑은 고딕" w:hAnsi="맑은 고딕" w:eastAsia="맑은 고딕"/>
+          <w:rFonts w:ascii="Malgun Gothic" w:hAnsi="Malgun Gothic" w:eastAsia="맑은 고딕"/>
         </w:rPr>
         <w:t>유즈케이스 명세</w:t>
       </w:r>
     </w:p>
-    <w:p/>
     <w:tbl>
       <w:tblPr>
         <w:tblW w:type="auto" w:w="0"/>
         <w:tblLayout w:type="fixed"/>
         <w:tblLook w:firstColumn="1" w:firstRow="1" w:lastColumn="0" w:lastRow="0" w:noHBand="0" w:noVBand="1" w:val="04A0"/>
+        <w:tblBorders>
+          <w:top w:val="single" w:sz="8" w:space="0" w:color="000000"/>
+          <w:left w:val="single" w:sz="8" w:space="0" w:color="000000"/>
+          <w:bottom w:val="single" w:sz="8" w:space="0" w:color="000000"/>
+          <w:right w:val="single" w:sz="8" w:space="0" w:color="000000"/>
+          <w:insideH w:val="single" w:sz="8" w:space="0" w:color="000000"/>
+          <w:insideV w:val="single" w:sz="8" w:space="0" w:color="000000"/>
+        </w:tblBorders>
       </w:tblPr>
       <w:tblGrid>
-        <w:gridCol w:w="4320"/>
-        <w:gridCol w:w="4320"/>
+        <w:gridCol w:w="1871"/>
+        <w:gridCol w:w="7937"/>
       </w:tblGrid>
       <w:tr>
         <w:tc>
           <w:tcPr>
-            <w:tcW w:type="dxa" w:w="2200"/>
-            <w:shd w:val="clear" w:color="auto" w:fill="D9E2F3"/>
-            <w:tcBorders>
-              <w:top w:val="single" w:sz="8" w:space="0" w:color="000000"/>
-              <w:left w:val="single" w:sz="8" w:space="0" w:color="000000"/>
-              <w:bottom w:val="single" w:sz="8" w:space="0" w:color="000000"/>
-              <w:right w:val="single" w:sz="8" w:space="0" w:color="000000"/>
-            </w:tcBorders>
+            <w:tcW w:type="dxa" w:w="1871"/>
+            <w:vAlign w:val="center"/>
+            <w:shd w:fill="D9EAF7"/>
           </w:tcPr>
           <w:p>
             <w:pPr>
-              <w:spacing w:after="40" w:before="0"/>
+              <w:spacing w:after="0"/>
             </w:pPr>
+            <w:r/>
             <w:r>
               <w:rPr>
-                <w:rFonts w:ascii="맑은 고딕" w:hAnsi="맑은 고딕" w:eastAsia="맑은 고딕"/>
                 <w:b/>
                 <w:sz w:val="20"/>
               </w:rPr>
@@ -52,22 +55,17 @@
         </w:tc>
         <w:tc>
           <w:tcPr>
-            <w:tcW w:type="dxa" w:w="7200"/>
-            <w:shd w:val="clear" w:color="auto" w:fill="D9E2F3"/>
-            <w:tcBorders>
-              <w:top w:val="single" w:sz="8" w:space="0" w:color="000000"/>
-              <w:left w:val="single" w:sz="8" w:space="0" w:color="000000"/>
-              <w:bottom w:val="single" w:sz="8" w:space="0" w:color="000000"/>
-              <w:right w:val="single" w:sz="8" w:space="0" w:color="000000"/>
-            </w:tcBorders>
+            <w:tcW w:type="dxa" w:w="7937"/>
+            <w:vAlign w:val="center"/>
+            <w:shd w:fill="D9EAF7"/>
           </w:tcPr>
           <w:p>
             <w:pPr>
-              <w:spacing w:after="40" w:before="0"/>
+              <w:spacing w:after="0"/>
             </w:pPr>
+            <w:r/>
             <w:r>
               <w:rPr>
-                <w:rFonts w:ascii="맑은 고딕" w:hAnsi="맑은 고딕" w:eastAsia="맑은 고딕"/>
                 <w:b/>
                 <w:sz w:val="20"/>
               </w:rPr>
@@ -79,22 +77,17 @@
       <w:tr>
         <w:tc>
           <w:tcPr>
-            <w:tcW w:type="dxa" w:w="2200"/>
-            <w:shd w:val="clear" w:color="auto" w:fill="F2F2F2"/>
-            <w:tcBorders>
-              <w:top w:val="single" w:sz="8" w:space="0" w:color="000000"/>
-              <w:left w:val="single" w:sz="8" w:space="0" w:color="000000"/>
-              <w:bottom w:val="single" w:sz="8" w:space="0" w:color="000000"/>
-              <w:right w:val="single" w:sz="8" w:space="0" w:color="000000"/>
-            </w:tcBorders>
+            <w:tcW w:type="dxa" w:w="1871"/>
+            <w:vAlign w:val="center"/>
+            <w:shd w:fill="EDEDED"/>
           </w:tcPr>
           <w:p>
             <w:pPr>
-              <w:spacing w:after="40" w:before="0"/>
+              <w:spacing w:after="0"/>
             </w:pPr>
+            <w:r/>
             <w:r>
               <w:rPr>
-                <w:rFonts w:ascii="맑은 고딕" w:hAnsi="맑은 고딕" w:eastAsia="맑은 고딕"/>
                 <w:b/>
                 <w:sz w:val="20"/>
               </w:rPr>
@@ -104,21 +97,16 @@
         </w:tc>
         <w:tc>
           <w:tcPr>
-            <w:tcW w:type="dxa" w:w="7200"/>
-            <w:tcBorders>
-              <w:top w:val="single" w:sz="8" w:space="0" w:color="000000"/>
-              <w:left w:val="single" w:sz="8" w:space="0" w:color="000000"/>
-              <w:bottom w:val="single" w:sz="8" w:space="0" w:color="000000"/>
-              <w:right w:val="single" w:sz="8" w:space="0" w:color="000000"/>
-            </w:tcBorders>
+            <w:tcW w:type="dxa" w:w="7937"/>
+            <w:vAlign w:val="center"/>
           </w:tcPr>
           <w:p>
             <w:pPr>
-              <w:spacing w:after="40" w:before="0"/>
+              <w:spacing w:after="0"/>
             </w:pPr>
+            <w:r/>
             <w:r>
               <w:rPr>
-                <w:rFonts w:ascii="맑은 고딕" w:hAnsi="맑은 고딕" w:eastAsia="맑은 고딕"/>
                 <w:b w:val="0"/>
                 <w:sz w:val="20"/>
               </w:rPr>
@@ -130,22 +118,17 @@
       <w:tr>
         <w:tc>
           <w:tcPr>
-            <w:tcW w:type="dxa" w:w="2200"/>
-            <w:shd w:val="clear" w:color="auto" w:fill="F2F2F2"/>
-            <w:tcBorders>
-              <w:top w:val="single" w:sz="8" w:space="0" w:color="000000"/>
-              <w:left w:val="single" w:sz="8" w:space="0" w:color="000000"/>
-              <w:bottom w:val="single" w:sz="8" w:space="0" w:color="000000"/>
-              <w:right w:val="single" w:sz="8" w:space="0" w:color="000000"/>
-            </w:tcBorders>
+            <w:tcW w:type="dxa" w:w="1871"/>
+            <w:vAlign w:val="center"/>
+            <w:shd w:fill="EDEDED"/>
           </w:tcPr>
           <w:p>
             <w:pPr>
-              <w:spacing w:after="40" w:before="0"/>
+              <w:spacing w:after="0"/>
             </w:pPr>
+            <w:r/>
             <w:r>
               <w:rPr>
-                <w:rFonts w:ascii="맑은 고딕" w:hAnsi="맑은 고딕" w:eastAsia="맑은 고딕"/>
                 <w:b/>
                 <w:sz w:val="20"/>
               </w:rPr>
@@ -155,21 +138,16 @@
         </w:tc>
         <w:tc>
           <w:tcPr>
-            <w:tcW w:type="dxa" w:w="7200"/>
-            <w:tcBorders>
-              <w:top w:val="single" w:sz="8" w:space="0" w:color="000000"/>
-              <w:left w:val="single" w:sz="8" w:space="0" w:color="000000"/>
-              <w:bottom w:val="single" w:sz="8" w:space="0" w:color="000000"/>
-              <w:right w:val="single" w:sz="8" w:space="0" w:color="000000"/>
-            </w:tcBorders>
+            <w:tcW w:type="dxa" w:w="7937"/>
+            <w:vAlign w:val="center"/>
           </w:tcPr>
           <w:p>
             <w:pPr>
-              <w:spacing w:after="40" w:before="0"/>
+              <w:spacing w:after="0"/>
             </w:pPr>
+            <w:r/>
             <w:r>
               <w:rPr>
-                <w:rFonts w:ascii="맑은 고딕" w:hAnsi="맑은 고딕" w:eastAsia="맑은 고딕"/>
                 <w:b w:val="0"/>
                 <w:sz w:val="20"/>
               </w:rPr>
@@ -181,22 +159,17 @@
       <w:tr>
         <w:tc>
           <w:tcPr>
-            <w:tcW w:type="dxa" w:w="2200"/>
-            <w:shd w:val="clear" w:color="auto" w:fill="F2F2F2"/>
-            <w:tcBorders>
-              <w:top w:val="single" w:sz="8" w:space="0" w:color="000000"/>
-              <w:left w:val="single" w:sz="8" w:space="0" w:color="000000"/>
-              <w:bottom w:val="single" w:sz="8" w:space="0" w:color="000000"/>
-              <w:right w:val="single" w:sz="8" w:space="0" w:color="000000"/>
-            </w:tcBorders>
+            <w:tcW w:type="dxa" w:w="1871"/>
+            <w:vAlign w:val="center"/>
+            <w:shd w:fill="EDEDED"/>
           </w:tcPr>
           <w:p>
             <w:pPr>
-              <w:spacing w:after="40" w:before="0"/>
+              <w:spacing w:after="0"/>
             </w:pPr>
+            <w:r/>
             <w:r>
               <w:rPr>
-                <w:rFonts w:ascii="맑은 고딕" w:hAnsi="맑은 고딕" w:eastAsia="맑은 고딕"/>
                 <w:b/>
                 <w:sz w:val="20"/>
               </w:rPr>
@@ -206,21 +179,16 @@
         </w:tc>
         <w:tc>
           <w:tcPr>
-            <w:tcW w:type="dxa" w:w="7200"/>
-            <w:tcBorders>
-              <w:top w:val="single" w:sz="8" w:space="0" w:color="000000"/>
-              <w:left w:val="single" w:sz="8" w:space="0" w:color="000000"/>
-              <w:bottom w:val="single" w:sz="8" w:space="0" w:color="000000"/>
-              <w:right w:val="single" w:sz="8" w:space="0" w:color="000000"/>
-            </w:tcBorders>
+            <w:tcW w:type="dxa" w:w="7937"/>
+            <w:vAlign w:val="center"/>
           </w:tcPr>
           <w:p>
             <w:pPr>
-              <w:spacing w:after="40" w:before="0"/>
+              <w:spacing w:after="0"/>
             </w:pPr>
+            <w:r/>
             <w:r>
               <w:rPr>
-                <w:rFonts w:ascii="맑은 고딕" w:hAnsi="맑은 고딕" w:eastAsia="맑은 고딕"/>
                 <w:b w:val="0"/>
                 <w:sz w:val="20"/>
               </w:rPr>
@@ -232,22 +200,17 @@
       <w:tr>
         <w:tc>
           <w:tcPr>
-            <w:tcW w:type="dxa" w:w="2200"/>
-            <w:shd w:val="clear" w:color="auto" w:fill="F2F2F2"/>
-            <w:tcBorders>
-              <w:top w:val="single" w:sz="8" w:space="0" w:color="000000"/>
-              <w:left w:val="single" w:sz="8" w:space="0" w:color="000000"/>
-              <w:bottom w:val="single" w:sz="8" w:space="0" w:color="000000"/>
-              <w:right w:val="single" w:sz="8" w:space="0" w:color="000000"/>
-            </w:tcBorders>
+            <w:tcW w:type="dxa" w:w="1871"/>
+            <w:vAlign w:val="center"/>
+            <w:shd w:fill="EDEDED"/>
           </w:tcPr>
           <w:p>
             <w:pPr>
-              <w:spacing w:after="40" w:before="0"/>
+              <w:spacing w:after="0"/>
             </w:pPr>
+            <w:r/>
             <w:r>
               <w:rPr>
-                <w:rFonts w:ascii="맑은 고딕" w:hAnsi="맑은 고딕" w:eastAsia="맑은 고딕"/>
                 <w:b/>
                 <w:sz w:val="20"/>
               </w:rPr>
@@ -257,86 +220,66 @@
         </w:tc>
         <w:tc>
           <w:tcPr>
-            <w:tcW w:type="dxa" w:w="7200"/>
-            <w:tcBorders>
-              <w:top w:val="single" w:sz="8" w:space="0" w:color="000000"/>
-              <w:left w:val="single" w:sz="8" w:space="0" w:color="000000"/>
-              <w:bottom w:val="single" w:sz="8" w:space="0" w:color="000000"/>
-              <w:right w:val="single" w:sz="8" w:space="0" w:color="000000"/>
-            </w:tcBorders>
+            <w:tcW w:type="dxa" w:w="7937"/>
+            <w:vAlign w:val="center"/>
           </w:tcPr>
           <w:p>
             <w:pPr>
-              <w:spacing w:after="40" w:before="0"/>
+              <w:spacing w:after="0"/>
             </w:pPr>
+            <w:r/>
             <w:r>
               <w:rPr>
-                <w:rFonts w:ascii="맑은 고딕" w:hAnsi="맑은 고딕" w:eastAsia="맑은 고딕"/>
                 <w:b w:val="0"/>
                 <w:sz w:val="20"/>
               </w:rPr>
               <w:t>1. Host Application이 pVM API로 pVM 생성을 요청한다</w:t>
             </w:r>
-          </w:p>
-          <w:p>
-            <w:pPr>
-              <w:spacing w:after="40" w:before="0"/>
-            </w:pPr>
+            <w:r>
+              <w:br/>
+            </w:r>
             <w:r>
               <w:rPr>
-                <w:rFonts w:ascii="맑은 고딕" w:hAnsi="맑은 고딕" w:eastAsia="맑은 고딕"/>
                 <w:b w:val="0"/>
                 <w:sz w:val="20"/>
               </w:rPr>
               <w:t>2. 시스템은 메모리/CPU 자원을 할당하고 pVM 인스턴스를 초기화한다</w:t>
             </w:r>
-          </w:p>
-          <w:p>
-            <w:pPr>
-              <w:spacing w:after="40" w:before="0"/>
-            </w:pPr>
+            <w:r>
+              <w:br/>
+            </w:r>
             <w:r>
               <w:rPr>
-                <w:rFonts w:ascii="맑은 고딕" w:hAnsi="맑은 고딕" w:eastAsia="맑은 고딕"/>
                 <w:b w:val="0"/>
                 <w:sz w:val="20"/>
               </w:rPr>
               <w:t>3. Host Application이 pVM 시작 명령을 호출한다</w:t>
             </w:r>
-          </w:p>
-          <w:p>
-            <w:pPr>
-              <w:spacing w:after="40" w:before="0"/>
-            </w:pPr>
+            <w:r>
+              <w:br/>
+            </w:r>
             <w:r>
               <w:rPr>
-                <w:rFonts w:ascii="맑은 고딕" w:hAnsi="맑은 고딕" w:eastAsia="맑은 고딕"/>
                 <w:b w:val="0"/>
                 <w:sz w:val="20"/>
               </w:rPr>
               <w:t>4. 시스템은 pVM을 Running 상태로 전환한다</w:t>
             </w:r>
-          </w:p>
-          <w:p>
-            <w:pPr>
-              <w:spacing w:after="40" w:before="0"/>
-            </w:pPr>
+            <w:r>
+              <w:br/>
+            </w:r>
             <w:r>
               <w:rPr>
-                <w:rFonts w:ascii="맑은 고딕" w:hAnsi="맑은 고딕" w:eastAsia="맑은 고딕"/>
                 <w:b w:val="0"/>
                 <w:sz w:val="20"/>
               </w:rPr>
               <w:t>5. Host Application이 pVM 정지 명령을 호출한다</w:t>
             </w:r>
-          </w:p>
-          <w:p>
-            <w:pPr>
-              <w:spacing w:after="40" w:before="0"/>
-            </w:pPr>
+            <w:r>
+              <w:br/>
+            </w:r>
             <w:r>
               <w:rPr>
-                <w:rFonts w:ascii="맑은 고딕" w:hAnsi="맑은 고딕" w:eastAsia="맑은 고딕"/>
                 <w:b w:val="0"/>
                 <w:sz w:val="20"/>
               </w:rPr>
@@ -348,22 +291,17 @@
       <w:tr>
         <w:tc>
           <w:tcPr>
-            <w:tcW w:type="dxa" w:w="2200"/>
-            <w:shd w:val="clear" w:color="auto" w:fill="F2F2F2"/>
-            <w:tcBorders>
-              <w:top w:val="single" w:sz="8" w:space="0" w:color="000000"/>
-              <w:left w:val="single" w:sz="8" w:space="0" w:color="000000"/>
-              <w:bottom w:val="single" w:sz="8" w:space="0" w:color="000000"/>
-              <w:right w:val="single" w:sz="8" w:space="0" w:color="000000"/>
-            </w:tcBorders>
+            <w:tcW w:type="dxa" w:w="1871"/>
+            <w:vAlign w:val="center"/>
+            <w:shd w:fill="EDEDED"/>
           </w:tcPr>
           <w:p>
             <w:pPr>
-              <w:spacing w:after="40" w:before="0"/>
+              <w:spacing w:after="0"/>
             </w:pPr>
+            <w:r/>
             <w:r>
               <w:rPr>
-                <w:rFonts w:ascii="맑은 고딕" w:hAnsi="맑은 고딕" w:eastAsia="맑은 고딕"/>
                 <w:b/>
                 <w:sz w:val="20"/>
               </w:rPr>
@@ -373,47 +311,36 @@
         </w:tc>
         <w:tc>
           <w:tcPr>
-            <w:tcW w:type="dxa" w:w="7200"/>
-            <w:tcBorders>
-              <w:top w:val="single" w:sz="8" w:space="0" w:color="000000"/>
-              <w:left w:val="single" w:sz="8" w:space="0" w:color="000000"/>
-              <w:bottom w:val="single" w:sz="8" w:space="0" w:color="000000"/>
-              <w:right w:val="single" w:sz="8" w:space="0" w:color="000000"/>
-            </w:tcBorders>
+            <w:tcW w:type="dxa" w:w="7937"/>
+            <w:vAlign w:val="center"/>
           </w:tcPr>
           <w:p>
             <w:pPr>
-              <w:spacing w:after="40" w:before="0"/>
+              <w:spacing w:after="0"/>
             </w:pPr>
+            <w:r/>
             <w:r>
               <w:rPr>
-                <w:rFonts w:ascii="맑은 고딕" w:hAnsi="맑은 고딕" w:eastAsia="맑은 고딕"/>
                 <w:b w:val="0"/>
                 <w:sz w:val="20"/>
               </w:rPr>
               <w:t>1. 시스템은 pVM 생성 실패 시 생성을 중단하고 Host Application에 오류를 반환한다</w:t>
             </w:r>
-          </w:p>
-          <w:p>
-            <w:pPr>
-              <w:spacing w:after="40" w:before="0"/>
-            </w:pPr>
+            <w:r>
+              <w:br/>
+            </w:r>
             <w:r>
               <w:rPr>
-                <w:rFonts w:ascii="맑은 고딕" w:hAnsi="맑은 고딕" w:eastAsia="맑은 고딕"/>
                 <w:b w:val="0"/>
                 <w:sz w:val="20"/>
               </w:rPr>
               <w:t>2. 시스템은 pVM 시작 실패 시 할당 자원을 회수하고 Host Application에 실패 상태를 반환한다</w:t>
             </w:r>
-          </w:p>
-          <w:p>
-            <w:pPr>
-              <w:spacing w:after="40" w:before="0"/>
-            </w:pPr>
+            <w:r>
+              <w:br/>
+            </w:r>
             <w:r>
               <w:rPr>
-                <w:rFonts w:ascii="맑은 고딕" w:hAnsi="맑은 고딕" w:eastAsia="맑은 고딕"/>
                 <w:b w:val="0"/>
                 <w:sz w:val="20"/>
               </w:rPr>
@@ -423,36 +350,43 @@
         </w:tc>
       </w:tr>
     </w:tbl>
-    <w:p/>
+    <w:p>
+      <w:pPr>
+        <w:spacing w:after="0"/>
+      </w:pPr>
+    </w:p>
     <w:tbl>
       <w:tblPr>
         <w:tblW w:type="auto" w:w="0"/>
         <w:tblLayout w:type="fixed"/>
         <w:tblLook w:firstColumn="1" w:firstRow="1" w:lastColumn="0" w:lastRow="0" w:noHBand="0" w:noVBand="1" w:val="04A0"/>
+        <w:tblBorders>
+          <w:top w:val="single" w:sz="8" w:space="0" w:color="000000"/>
+          <w:left w:val="single" w:sz="8" w:space="0" w:color="000000"/>
+          <w:bottom w:val="single" w:sz="8" w:space="0" w:color="000000"/>
+          <w:right w:val="single" w:sz="8" w:space="0" w:color="000000"/>
+          <w:insideH w:val="single" w:sz="8" w:space="0" w:color="000000"/>
+          <w:insideV w:val="single" w:sz="8" w:space="0" w:color="000000"/>
+        </w:tblBorders>
       </w:tblPr>
       <w:tblGrid>
-        <w:gridCol w:w="4320"/>
-        <w:gridCol w:w="4320"/>
+        <w:gridCol w:w="1871"/>
+        <w:gridCol w:w="7937"/>
       </w:tblGrid>
       <w:tr>
         <w:tc>
           <w:tcPr>
-            <w:tcW w:type="dxa" w:w="2200"/>
-            <w:shd w:val="clear" w:color="auto" w:fill="D9E2F3"/>
-            <w:tcBorders>
-              <w:top w:val="single" w:sz="8" w:space="0" w:color="000000"/>
-              <w:left w:val="single" w:sz="8" w:space="0" w:color="000000"/>
-              <w:bottom w:val="single" w:sz="8" w:space="0" w:color="000000"/>
-              <w:right w:val="single" w:sz="8" w:space="0" w:color="000000"/>
-            </w:tcBorders>
+            <w:tcW w:type="dxa" w:w="1871"/>
+            <w:vAlign w:val="center"/>
+            <w:shd w:fill="D9EAF7"/>
           </w:tcPr>
           <w:p>
             <w:pPr>
-              <w:spacing w:after="40" w:before="0"/>
+              <w:spacing w:after="0"/>
             </w:pPr>
+            <w:r/>
             <w:r>
               <w:rPr>
-                <w:rFonts w:ascii="맑은 고딕" w:hAnsi="맑은 고딕" w:eastAsia="맑은 고딕"/>
                 <w:b/>
                 <w:sz w:val="20"/>
               </w:rPr>
@@ -462,22 +396,17 @@
         </w:tc>
         <w:tc>
           <w:tcPr>
-            <w:tcW w:type="dxa" w:w="7200"/>
-            <w:shd w:val="clear" w:color="auto" w:fill="D9E2F3"/>
-            <w:tcBorders>
-              <w:top w:val="single" w:sz="8" w:space="0" w:color="000000"/>
-              <w:left w:val="single" w:sz="8" w:space="0" w:color="000000"/>
-              <w:bottom w:val="single" w:sz="8" w:space="0" w:color="000000"/>
-              <w:right w:val="single" w:sz="8" w:space="0" w:color="000000"/>
-            </w:tcBorders>
+            <w:tcW w:type="dxa" w:w="7937"/>
+            <w:vAlign w:val="center"/>
+            <w:shd w:fill="D9EAF7"/>
           </w:tcPr>
           <w:p>
             <w:pPr>
-              <w:spacing w:after="40" w:before="0"/>
+              <w:spacing w:after="0"/>
             </w:pPr>
+            <w:r/>
             <w:r>
               <w:rPr>
-                <w:rFonts w:ascii="맑은 고딕" w:hAnsi="맑은 고딕" w:eastAsia="맑은 고딕"/>
                 <w:b/>
                 <w:sz w:val="20"/>
               </w:rPr>
@@ -489,22 +418,17 @@
       <w:tr>
         <w:tc>
           <w:tcPr>
-            <w:tcW w:type="dxa" w:w="2200"/>
-            <w:shd w:val="clear" w:color="auto" w:fill="F2F2F2"/>
-            <w:tcBorders>
-              <w:top w:val="single" w:sz="8" w:space="0" w:color="000000"/>
-              <w:left w:val="single" w:sz="8" w:space="0" w:color="000000"/>
-              <w:bottom w:val="single" w:sz="8" w:space="0" w:color="000000"/>
-              <w:right w:val="single" w:sz="8" w:space="0" w:color="000000"/>
-            </w:tcBorders>
+            <w:tcW w:type="dxa" w:w="1871"/>
+            <w:vAlign w:val="center"/>
+            <w:shd w:fill="EDEDED"/>
           </w:tcPr>
           <w:p>
             <w:pPr>
-              <w:spacing w:after="40" w:before="0"/>
+              <w:spacing w:after="0"/>
             </w:pPr>
+            <w:r/>
             <w:r>
               <w:rPr>
-                <w:rFonts w:ascii="맑은 고딕" w:hAnsi="맑은 고딕" w:eastAsia="맑은 고딕"/>
                 <w:b/>
                 <w:sz w:val="20"/>
               </w:rPr>
@@ -514,21 +438,16 @@
         </w:tc>
         <w:tc>
           <w:tcPr>
-            <w:tcW w:type="dxa" w:w="7200"/>
-            <w:tcBorders>
-              <w:top w:val="single" w:sz="8" w:space="0" w:color="000000"/>
-              <w:left w:val="single" w:sz="8" w:space="0" w:color="000000"/>
-              <w:bottom w:val="single" w:sz="8" w:space="0" w:color="000000"/>
-              <w:right w:val="single" w:sz="8" w:space="0" w:color="000000"/>
-            </w:tcBorders>
+            <w:tcW w:type="dxa" w:w="7937"/>
+            <w:vAlign w:val="center"/>
           </w:tcPr>
           <w:p>
             <w:pPr>
-              <w:spacing w:after="40" w:before="0"/>
+              <w:spacing w:after="0"/>
             </w:pPr>
+            <w:r/>
             <w:r>
               <w:rPr>
-                <w:rFonts w:ascii="맑은 고딕" w:hAnsi="맑은 고딕" w:eastAsia="맑은 고딕"/>
                 <w:b w:val="0"/>
                 <w:sz w:val="20"/>
               </w:rPr>
@@ -540,22 +459,17 @@
       <w:tr>
         <w:tc>
           <w:tcPr>
-            <w:tcW w:type="dxa" w:w="2200"/>
-            <w:shd w:val="clear" w:color="auto" w:fill="F2F2F2"/>
-            <w:tcBorders>
-              <w:top w:val="single" w:sz="8" w:space="0" w:color="000000"/>
-              <w:left w:val="single" w:sz="8" w:space="0" w:color="000000"/>
-              <w:bottom w:val="single" w:sz="8" w:space="0" w:color="000000"/>
-              <w:right w:val="single" w:sz="8" w:space="0" w:color="000000"/>
-            </w:tcBorders>
+            <w:tcW w:type="dxa" w:w="1871"/>
+            <w:vAlign w:val="center"/>
+            <w:shd w:fill="EDEDED"/>
           </w:tcPr>
           <w:p>
             <w:pPr>
-              <w:spacing w:after="40" w:before="0"/>
+              <w:spacing w:after="0"/>
             </w:pPr>
+            <w:r/>
             <w:r>
               <w:rPr>
-                <w:rFonts w:ascii="맑은 고딕" w:hAnsi="맑은 고딕" w:eastAsia="맑은 고딕"/>
                 <w:b/>
                 <w:sz w:val="20"/>
               </w:rPr>
@@ -565,21 +479,16 @@
         </w:tc>
         <w:tc>
           <w:tcPr>
-            <w:tcW w:type="dxa" w:w="7200"/>
-            <w:tcBorders>
-              <w:top w:val="single" w:sz="8" w:space="0" w:color="000000"/>
-              <w:left w:val="single" w:sz="8" w:space="0" w:color="000000"/>
-              <w:bottom w:val="single" w:sz="8" w:space="0" w:color="000000"/>
-              <w:right w:val="single" w:sz="8" w:space="0" w:color="000000"/>
-            </w:tcBorders>
+            <w:tcW w:type="dxa" w:w="7937"/>
+            <w:vAlign w:val="center"/>
           </w:tcPr>
           <w:p>
             <w:pPr>
-              <w:spacing w:after="40" w:before="0"/>
+              <w:spacing w:after="0"/>
             </w:pPr>
+            <w:r/>
             <w:r>
               <w:rPr>
-                <w:rFonts w:ascii="맑은 고딕" w:hAnsi="맑은 고딕" w:eastAsia="맑은 고딕"/>
                 <w:b w:val="0"/>
                 <w:sz w:val="20"/>
               </w:rPr>
@@ -591,22 +500,17 @@
       <w:tr>
         <w:tc>
           <w:tcPr>
-            <w:tcW w:type="dxa" w:w="2200"/>
-            <w:shd w:val="clear" w:color="auto" w:fill="F2F2F2"/>
-            <w:tcBorders>
-              <w:top w:val="single" w:sz="8" w:space="0" w:color="000000"/>
-              <w:left w:val="single" w:sz="8" w:space="0" w:color="000000"/>
-              <w:bottom w:val="single" w:sz="8" w:space="0" w:color="000000"/>
-              <w:right w:val="single" w:sz="8" w:space="0" w:color="000000"/>
-            </w:tcBorders>
+            <w:tcW w:type="dxa" w:w="1871"/>
+            <w:vAlign w:val="center"/>
+            <w:shd w:fill="EDEDED"/>
           </w:tcPr>
           <w:p>
             <w:pPr>
-              <w:spacing w:after="40" w:before="0"/>
+              <w:spacing w:after="0"/>
             </w:pPr>
+            <w:r/>
             <w:r>
               <w:rPr>
-                <w:rFonts w:ascii="맑은 고딕" w:hAnsi="맑은 고딕" w:eastAsia="맑은 고딕"/>
                 <w:b/>
                 <w:sz w:val="20"/>
               </w:rPr>
@@ -616,21 +520,16 @@
         </w:tc>
         <w:tc>
           <w:tcPr>
-            <w:tcW w:type="dxa" w:w="7200"/>
-            <w:tcBorders>
-              <w:top w:val="single" w:sz="8" w:space="0" w:color="000000"/>
-              <w:left w:val="single" w:sz="8" w:space="0" w:color="000000"/>
-              <w:bottom w:val="single" w:sz="8" w:space="0" w:color="000000"/>
-              <w:right w:val="single" w:sz="8" w:space="0" w:color="000000"/>
-            </w:tcBorders>
+            <w:tcW w:type="dxa" w:w="7937"/>
+            <w:vAlign w:val="center"/>
           </w:tcPr>
           <w:p>
             <w:pPr>
-              <w:spacing w:after="40" w:before="0"/>
+              <w:spacing w:after="0"/>
             </w:pPr>
+            <w:r/>
             <w:r>
               <w:rPr>
-                <w:rFonts w:ascii="맑은 고딕" w:hAnsi="맑은 고딕" w:eastAsia="맑은 고딕"/>
                 <w:b w:val="0"/>
                 <w:sz w:val="20"/>
               </w:rPr>
@@ -642,22 +541,17 @@
       <w:tr>
         <w:tc>
           <w:tcPr>
-            <w:tcW w:type="dxa" w:w="2200"/>
-            <w:shd w:val="clear" w:color="auto" w:fill="F2F2F2"/>
-            <w:tcBorders>
-              <w:top w:val="single" w:sz="8" w:space="0" w:color="000000"/>
-              <w:left w:val="single" w:sz="8" w:space="0" w:color="000000"/>
-              <w:bottom w:val="single" w:sz="8" w:space="0" w:color="000000"/>
-              <w:right w:val="single" w:sz="8" w:space="0" w:color="000000"/>
-            </w:tcBorders>
+            <w:tcW w:type="dxa" w:w="1871"/>
+            <w:vAlign w:val="center"/>
+            <w:shd w:fill="EDEDED"/>
           </w:tcPr>
           <w:p>
             <w:pPr>
-              <w:spacing w:after="40" w:before="0"/>
+              <w:spacing w:after="0"/>
             </w:pPr>
+            <w:r/>
             <w:r>
               <w:rPr>
-                <w:rFonts w:ascii="맑은 고딕" w:hAnsi="맑은 고딕" w:eastAsia="맑은 고딕"/>
                 <w:b/>
                 <w:sz w:val="20"/>
               </w:rPr>
@@ -667,73 +561,56 @@
         </w:tc>
         <w:tc>
           <w:tcPr>
-            <w:tcW w:type="dxa" w:w="7200"/>
-            <w:tcBorders>
-              <w:top w:val="single" w:sz="8" w:space="0" w:color="000000"/>
-              <w:left w:val="single" w:sz="8" w:space="0" w:color="000000"/>
-              <w:bottom w:val="single" w:sz="8" w:space="0" w:color="000000"/>
-              <w:right w:val="single" w:sz="8" w:space="0" w:color="000000"/>
-            </w:tcBorders>
+            <w:tcW w:type="dxa" w:w="7937"/>
+            <w:vAlign w:val="center"/>
           </w:tcPr>
           <w:p>
             <w:pPr>
-              <w:spacing w:after="40" w:before="0"/>
+              <w:spacing w:after="0"/>
             </w:pPr>
+            <w:r/>
             <w:r>
               <w:rPr>
-                <w:rFonts w:ascii="맑은 고딕" w:hAnsi="맑은 고딕" w:eastAsia="맑은 고딕"/>
                 <w:b w:val="0"/>
                 <w:sz w:val="20"/>
               </w:rPr>
               <w:t>1. Host Application이 Secure Camera pVM 생성을 요청한다</w:t>
             </w:r>
-          </w:p>
-          <w:p>
-            <w:pPr>
-              <w:spacing w:after="40" w:before="0"/>
-            </w:pPr>
+            <w:r>
+              <w:br/>
+            </w:r>
             <w:r>
               <w:rPr>
-                <w:rFonts w:ascii="맑은 고딕" w:hAnsi="맑은 고딕" w:eastAsia="맑은 고딕"/>
                 <w:b w:val="0"/>
                 <w:sz w:val="20"/>
               </w:rPr>
               <w:t>2. 시스템은 Secure Camera pVM을 생성하고 시작한다</w:t>
             </w:r>
-          </w:p>
-          <w:p>
-            <w:pPr>
-              <w:spacing w:after="40" w:before="0"/>
-            </w:pPr>
+            <w:r>
+              <w:br/>
+            </w:r>
             <w:r>
               <w:rPr>
-                <w:rFonts w:ascii="맑은 고딕" w:hAnsi="맑은 고딕" w:eastAsia="맑은 고딕"/>
                 <w:b w:val="0"/>
                 <w:sz w:val="20"/>
               </w:rPr>
               <w:t>3. Host Application이 Secure AI pVM 생성을 요청한다</w:t>
             </w:r>
-          </w:p>
-          <w:p>
-            <w:pPr>
-              <w:spacing w:after="40" w:before="0"/>
-            </w:pPr>
+            <w:r>
+              <w:br/>
+            </w:r>
             <w:r>
               <w:rPr>
-                <w:rFonts w:ascii="맑은 고딕" w:hAnsi="맑은 고딕" w:eastAsia="맑은 고딕"/>
                 <w:b w:val="0"/>
                 <w:sz w:val="20"/>
               </w:rPr>
               <w:t>4. 시스템은 Secure AI pVM을 생성하고 시작한다</w:t>
             </w:r>
-          </w:p>
-          <w:p>
-            <w:pPr>
-              <w:spacing w:after="40" w:before="0"/>
-            </w:pPr>
+            <w:r>
+              <w:br/>
+            </w:r>
             <w:r>
               <w:rPr>
-                <w:rFonts w:ascii="맑은 고딕" w:hAnsi="맑은 고딕" w:eastAsia="맑은 고딕"/>
                 <w:b w:val="0"/>
                 <w:sz w:val="20"/>
               </w:rPr>
@@ -745,22 +622,17 @@
       <w:tr>
         <w:tc>
           <w:tcPr>
-            <w:tcW w:type="dxa" w:w="2200"/>
-            <w:shd w:val="clear" w:color="auto" w:fill="F2F2F2"/>
-            <w:tcBorders>
-              <w:top w:val="single" w:sz="8" w:space="0" w:color="000000"/>
-              <w:left w:val="single" w:sz="8" w:space="0" w:color="000000"/>
-              <w:bottom w:val="single" w:sz="8" w:space="0" w:color="000000"/>
-              <w:right w:val="single" w:sz="8" w:space="0" w:color="000000"/>
-            </w:tcBorders>
+            <w:tcW w:type="dxa" w:w="1871"/>
+            <w:vAlign w:val="center"/>
+            <w:shd w:fill="EDEDED"/>
           </w:tcPr>
           <w:p>
             <w:pPr>
-              <w:spacing w:after="40" w:before="0"/>
+              <w:spacing w:after="0"/>
             </w:pPr>
+            <w:r/>
             <w:r>
               <w:rPr>
-                <w:rFonts w:ascii="맑은 고딕" w:hAnsi="맑은 고딕" w:eastAsia="맑은 고딕"/>
                 <w:b/>
                 <w:sz w:val="20"/>
               </w:rPr>
@@ -770,47 +642,36 @@
         </w:tc>
         <w:tc>
           <w:tcPr>
-            <w:tcW w:type="dxa" w:w="7200"/>
-            <w:tcBorders>
-              <w:top w:val="single" w:sz="8" w:space="0" w:color="000000"/>
-              <w:left w:val="single" w:sz="8" w:space="0" w:color="000000"/>
-              <w:bottom w:val="single" w:sz="8" w:space="0" w:color="000000"/>
-              <w:right w:val="single" w:sz="8" w:space="0" w:color="000000"/>
-            </w:tcBorders>
+            <w:tcW w:type="dxa" w:w="7937"/>
+            <w:vAlign w:val="center"/>
           </w:tcPr>
           <w:p>
             <w:pPr>
-              <w:spacing w:after="40" w:before="0"/>
+              <w:spacing w:after="0"/>
             </w:pPr>
+            <w:r/>
             <w:r>
               <w:rPr>
-                <w:rFonts w:ascii="맑은 고딕" w:hAnsi="맑은 고딕" w:eastAsia="맑은 고딕"/>
                 <w:b w:val="0"/>
                 <w:sz w:val="20"/>
               </w:rPr>
               <w:t>1. 시스템은 pVM 중 하나가 종료 혹은 Crash되어도 나머지 pVM을 계속 실행한다</w:t>
             </w:r>
-          </w:p>
-          <w:p>
-            <w:pPr>
-              <w:spacing w:after="40" w:before="0"/>
-            </w:pPr>
+            <w:r>
+              <w:br/>
+            </w:r>
             <w:r>
               <w:rPr>
-                <w:rFonts w:ascii="맑은 고딕" w:hAnsi="맑은 고딕" w:eastAsia="맑은 고딕"/>
                 <w:b w:val="0"/>
                 <w:sz w:val="20"/>
               </w:rPr>
               <w:t>2. 시스템은 두 번째 pVM 생성에 필요한 자원이 부족하면 기존 pVM을 유지하고 Host Application에 신규 생성 실패를 반환한다</w:t>
             </w:r>
-          </w:p>
-          <w:p>
-            <w:pPr>
-              <w:spacing w:after="40" w:before="0"/>
-            </w:pPr>
+            <w:r>
+              <w:br/>
+            </w:r>
             <w:r>
               <w:rPr>
-                <w:rFonts w:ascii="맑은 고딕" w:hAnsi="맑은 고딕" w:eastAsia="맑은 고딕"/>
                 <w:b w:val="0"/>
                 <w:sz w:val="20"/>
               </w:rPr>
@@ -820,36 +681,43 @@
         </w:tc>
       </w:tr>
     </w:tbl>
-    <w:p/>
+    <w:p>
+      <w:pPr>
+        <w:spacing w:after="0"/>
+      </w:pPr>
+    </w:p>
     <w:tbl>
       <w:tblPr>
         <w:tblW w:type="auto" w:w="0"/>
         <w:tblLayout w:type="fixed"/>
         <w:tblLook w:firstColumn="1" w:firstRow="1" w:lastColumn="0" w:lastRow="0" w:noHBand="0" w:noVBand="1" w:val="04A0"/>
+        <w:tblBorders>
+          <w:top w:val="single" w:sz="8" w:space="0" w:color="000000"/>
+          <w:left w:val="single" w:sz="8" w:space="0" w:color="000000"/>
+          <w:bottom w:val="single" w:sz="8" w:space="0" w:color="000000"/>
+          <w:right w:val="single" w:sz="8" w:space="0" w:color="000000"/>
+          <w:insideH w:val="single" w:sz="8" w:space="0" w:color="000000"/>
+          <w:insideV w:val="single" w:sz="8" w:space="0" w:color="000000"/>
+        </w:tblBorders>
       </w:tblPr>
       <w:tblGrid>
-        <w:gridCol w:w="4320"/>
-        <w:gridCol w:w="4320"/>
+        <w:gridCol w:w="1871"/>
+        <w:gridCol w:w="7937"/>
       </w:tblGrid>
       <w:tr>
         <w:tc>
           <w:tcPr>
-            <w:tcW w:type="dxa" w:w="2200"/>
-            <w:shd w:val="clear" w:color="auto" w:fill="D9E2F3"/>
-            <w:tcBorders>
-              <w:top w:val="single" w:sz="8" w:space="0" w:color="000000"/>
-              <w:left w:val="single" w:sz="8" w:space="0" w:color="000000"/>
-              <w:bottom w:val="single" w:sz="8" w:space="0" w:color="000000"/>
-              <w:right w:val="single" w:sz="8" w:space="0" w:color="000000"/>
-            </w:tcBorders>
+            <w:tcW w:type="dxa" w:w="1871"/>
+            <w:vAlign w:val="center"/>
+            <w:shd w:fill="D9EAF7"/>
           </w:tcPr>
           <w:p>
             <w:pPr>
-              <w:spacing w:after="40" w:before="0"/>
+              <w:spacing w:after="0"/>
             </w:pPr>
+            <w:r/>
             <w:r>
               <w:rPr>
-                <w:rFonts w:ascii="맑은 고딕" w:hAnsi="맑은 고딕" w:eastAsia="맑은 고딕"/>
                 <w:b/>
                 <w:sz w:val="20"/>
               </w:rPr>
@@ -859,22 +727,338 @@
         </w:tc>
         <w:tc>
           <w:tcPr>
-            <w:tcW w:type="dxa" w:w="7200"/>
-            <w:shd w:val="clear" w:color="auto" w:fill="D9E2F3"/>
-            <w:tcBorders>
-              <w:top w:val="single" w:sz="8" w:space="0" w:color="000000"/>
-              <w:left w:val="single" w:sz="8" w:space="0" w:color="000000"/>
-              <w:bottom w:val="single" w:sz="8" w:space="0" w:color="000000"/>
-              <w:right w:val="single" w:sz="8" w:space="0" w:color="000000"/>
-            </w:tcBorders>
+            <w:tcW w:type="dxa" w:w="7937"/>
+            <w:vAlign w:val="center"/>
+            <w:shd w:fill="D9EAF7"/>
           </w:tcPr>
           <w:p>
             <w:pPr>
-              <w:spacing w:after="40" w:before="0"/>
+              <w:spacing w:after="0"/>
             </w:pPr>
+            <w:r/>
             <w:r>
               <w:rPr>
-                <w:rFonts w:ascii="맑은 고딕" w:hAnsi="맑은 고딕" w:eastAsia="맑은 고딕"/>
+                <w:b/>
+                <w:sz w:val="20"/>
+              </w:rPr>
+              <w:t>보안 Workload 동적 탑재</w:t>
+            </w:r>
+          </w:p>
+        </w:tc>
+      </w:tr>
+      <w:tr>
+        <w:tc>
+          <w:tcPr>
+            <w:tcW w:type="dxa" w:w="1871"/>
+            <w:vAlign w:val="center"/>
+            <w:shd w:fill="EDEDED"/>
+          </w:tcPr>
+          <w:p>
+            <w:pPr>
+              <w:spacing w:after="0"/>
+            </w:pPr>
+            <w:r/>
+            <w:r>
+              <w:rPr>
+                <w:b/>
+                <w:sz w:val="20"/>
+              </w:rPr>
+              <w:t>Actor</w:t>
+            </w:r>
+          </w:p>
+        </w:tc>
+        <w:tc>
+          <w:tcPr>
+            <w:tcW w:type="dxa" w:w="7937"/>
+            <w:vAlign w:val="center"/>
+          </w:tcPr>
+          <w:p>
+            <w:pPr>
+              <w:spacing w:after="0"/>
+            </w:pPr>
+            <w:r/>
+            <w:r>
+              <w:rPr>
+                <w:b w:val="0"/>
+                <w:sz w:val="20"/>
+              </w:rPr>
+              <w:t>Host Application</w:t>
+            </w:r>
+          </w:p>
+        </w:tc>
+      </w:tr>
+      <w:tr>
+        <w:tc>
+          <w:tcPr>
+            <w:tcW w:type="dxa" w:w="1871"/>
+            <w:vAlign w:val="center"/>
+            <w:shd w:fill="EDEDED"/>
+          </w:tcPr>
+          <w:p>
+            <w:pPr>
+              <w:spacing w:after="0"/>
+            </w:pPr>
+            <w:r/>
+            <w:r>
+              <w:rPr>
+                <w:b/>
+                <w:sz w:val="20"/>
+              </w:rPr>
+              <w:t>Pre-Condition</w:t>
+            </w:r>
+          </w:p>
+        </w:tc>
+        <w:tc>
+          <w:tcPr>
+            <w:tcW w:type="dxa" w:w="7937"/>
+            <w:vAlign w:val="center"/>
+          </w:tcPr>
+          <w:p>
+            <w:pPr>
+              <w:spacing w:after="0"/>
+            </w:pPr>
+            <w:r/>
+            <w:r>
+              <w:rPr>
+                <w:b w:val="0"/>
+                <w:sz w:val="20"/>
+              </w:rPr>
+              <w:t>플랫폼이 실행 중이고 신규 보안 Workload 이미지가 서명되어 있다</w:t>
+            </w:r>
+          </w:p>
+        </w:tc>
+      </w:tr>
+      <w:tr>
+        <w:tc>
+          <w:tcPr>
+            <w:tcW w:type="dxa" w:w="1871"/>
+            <w:vAlign w:val="center"/>
+            <w:shd w:fill="EDEDED"/>
+          </w:tcPr>
+          <w:p>
+            <w:pPr>
+              <w:spacing w:after="0"/>
+            </w:pPr>
+            <w:r/>
+            <w:r>
+              <w:rPr>
+                <w:b/>
+                <w:sz w:val="20"/>
+              </w:rPr>
+              <w:t>Post-Condition</w:t>
+            </w:r>
+          </w:p>
+        </w:tc>
+        <w:tc>
+          <w:tcPr>
+            <w:tcW w:type="dxa" w:w="7937"/>
+            <w:vAlign w:val="center"/>
+          </w:tcPr>
+          <w:p>
+            <w:pPr>
+              <w:spacing w:after="0"/>
+            </w:pPr>
+            <w:r/>
+            <w:r>
+              <w:rPr>
+                <w:b w:val="0"/>
+                <w:sz w:val="20"/>
+              </w:rPr>
+              <w:t>서명이 검증된 신규 보안 Workload가 pVM에 탑재되어 격리 환경에서 실행 중이다</w:t>
+            </w:r>
+          </w:p>
+        </w:tc>
+      </w:tr>
+      <w:tr>
+        <w:tc>
+          <w:tcPr>
+            <w:tcW w:type="dxa" w:w="1871"/>
+            <w:vAlign w:val="center"/>
+            <w:shd w:fill="EDEDED"/>
+          </w:tcPr>
+          <w:p>
+            <w:pPr>
+              <w:spacing w:after="0"/>
+            </w:pPr>
+            <w:r/>
+            <w:r>
+              <w:rPr>
+                <w:b/>
+                <w:sz w:val="20"/>
+              </w:rPr>
+              <w:t>Main Flow</w:t>
+            </w:r>
+          </w:p>
+        </w:tc>
+        <w:tc>
+          <w:tcPr>
+            <w:tcW w:type="dxa" w:w="7937"/>
+            <w:vAlign w:val="center"/>
+          </w:tcPr>
+          <w:p>
+            <w:pPr>
+              <w:spacing w:after="0"/>
+            </w:pPr>
+            <w:r/>
+            <w:r>
+              <w:rPr>
+                <w:b w:val="0"/>
+                <w:sz w:val="20"/>
+              </w:rPr>
+              <w:t>1. Host Application이 신규 보안 Workload 이미지를 pVM 관리 API에 전달한다</w:t>
+            </w:r>
+            <w:r>
+              <w:br/>
+            </w:r>
+            <w:r>
+              <w:rPr>
+                <w:b w:val="0"/>
+                <w:sz w:val="20"/>
+              </w:rPr>
+              <w:t>2. 시스템은 Workload 이미지의 서명을 검증한다</w:t>
+            </w:r>
+            <w:r>
+              <w:br/>
+            </w:r>
+            <w:r>
+              <w:rPr>
+                <w:b w:val="0"/>
+                <w:sz w:val="20"/>
+              </w:rPr>
+              <w:t>3. 시스템은 대상 pVM에 Workload를 동적으로 탑재한다</w:t>
+            </w:r>
+            <w:r>
+              <w:br/>
+            </w:r>
+            <w:r>
+              <w:rPr>
+                <w:b w:val="0"/>
+                <w:sz w:val="20"/>
+              </w:rPr>
+              <w:t>4. 시스템은 새 Workload를 다른 Workload 및 pVM과 격리하여 실행한다</w:t>
+            </w:r>
+          </w:p>
+        </w:tc>
+      </w:tr>
+      <w:tr>
+        <w:tc>
+          <w:tcPr>
+            <w:tcW w:type="dxa" w:w="1871"/>
+            <w:vAlign w:val="center"/>
+            <w:shd w:fill="EDEDED"/>
+          </w:tcPr>
+          <w:p>
+            <w:pPr>
+              <w:spacing w:after="0"/>
+            </w:pPr>
+            <w:r/>
+            <w:r>
+              <w:rPr>
+                <w:b/>
+                <w:sz w:val="20"/>
+              </w:rPr>
+              <w:t>Alternative Flow</w:t>
+            </w:r>
+          </w:p>
+        </w:tc>
+        <w:tc>
+          <w:tcPr>
+            <w:tcW w:type="dxa" w:w="7937"/>
+            <w:vAlign w:val="center"/>
+          </w:tcPr>
+          <w:p>
+            <w:pPr>
+              <w:spacing w:after="0"/>
+            </w:pPr>
+            <w:r/>
+            <w:r>
+              <w:rPr>
+                <w:b w:val="0"/>
+                <w:sz w:val="20"/>
+              </w:rPr>
+              <w:t>1. 시스템은 서명 검증 실패 시 탑재를 중단하고 Host Application에 오류를 반환한다</w:t>
+            </w:r>
+            <w:r>
+              <w:br/>
+            </w:r>
+            <w:r>
+              <w:rPr>
+                <w:b w:val="0"/>
+                <w:sz w:val="20"/>
+              </w:rPr>
+              <w:t>2. 시스템은 Workload 이미지 형식이 지원되지 않으면 탑재를 수행하지 않고 Host Application에 오류를 반환한다</w:t>
+            </w:r>
+            <w:r>
+              <w:br/>
+            </w:r>
+            <w:r>
+              <w:rPr>
+                <w:b w:val="0"/>
+                <w:sz w:val="20"/>
+              </w:rPr>
+              <w:t>3. 시스템은 신규 Workload에 필요한 자원이 부족하면 기존 pVM 상태를 유지하고 탑재 요청을 실패 처리한다</w:t>
+            </w:r>
+          </w:p>
+        </w:tc>
+      </w:tr>
+    </w:tbl>
+    <w:p>
+      <w:pPr>
+        <w:spacing w:after="0"/>
+      </w:pPr>
+    </w:p>
+    <w:tbl>
+      <w:tblPr>
+        <w:tblW w:type="auto" w:w="0"/>
+        <w:tblLayout w:type="fixed"/>
+        <w:tblLook w:firstColumn="1" w:firstRow="1" w:lastColumn="0" w:lastRow="0" w:noHBand="0" w:noVBand="1" w:val="04A0"/>
+        <w:tblBorders>
+          <w:top w:val="single" w:sz="8" w:space="0" w:color="000000"/>
+          <w:left w:val="single" w:sz="8" w:space="0" w:color="000000"/>
+          <w:bottom w:val="single" w:sz="8" w:space="0" w:color="000000"/>
+          <w:right w:val="single" w:sz="8" w:space="0" w:color="000000"/>
+          <w:insideH w:val="single" w:sz="8" w:space="0" w:color="000000"/>
+          <w:insideV w:val="single" w:sz="8" w:space="0" w:color="000000"/>
+        </w:tblBorders>
+      </w:tblPr>
+      <w:tblGrid>
+        <w:gridCol w:w="1871"/>
+        <w:gridCol w:w="7937"/>
+      </w:tblGrid>
+      <w:tr>
+        <w:tc>
+          <w:tcPr>
+            <w:tcW w:type="dxa" w:w="1871"/>
+            <w:vAlign w:val="center"/>
+            <w:shd w:fill="D9EAF7"/>
+          </w:tcPr>
+          <w:p>
+            <w:pPr>
+              <w:spacing w:after="0"/>
+            </w:pPr>
+            <w:r/>
+            <w:r>
+              <w:rPr>
+                <w:b/>
+                <w:sz w:val="20"/>
+              </w:rPr>
+              <w:t>UC-04</w:t>
+            </w:r>
+          </w:p>
+        </w:tc>
+        <w:tc>
+          <w:tcPr>
+            <w:tcW w:type="dxa" w:w="7937"/>
+            <w:vAlign w:val="center"/>
+            <w:shd w:fill="D9EAF7"/>
+          </w:tcPr>
+          <w:p>
+            <w:pPr>
+              <w:spacing w:after="0"/>
+            </w:pPr>
+            <w:r/>
+            <w:r>
+              <w:rPr>
                 <w:b/>
                 <w:sz w:val="20"/>
               </w:rPr>
@@ -886,22 +1070,17 @@
       <w:tr>
         <w:tc>
           <w:tcPr>
-            <w:tcW w:type="dxa" w:w="2200"/>
-            <w:shd w:val="clear" w:color="auto" w:fill="F2F2F2"/>
-            <w:tcBorders>
-              <w:top w:val="single" w:sz="8" w:space="0" w:color="000000"/>
-              <w:left w:val="single" w:sz="8" w:space="0" w:color="000000"/>
-              <w:bottom w:val="single" w:sz="8" w:space="0" w:color="000000"/>
-              <w:right w:val="single" w:sz="8" w:space="0" w:color="000000"/>
-            </w:tcBorders>
+            <w:tcW w:type="dxa" w:w="1871"/>
+            <w:vAlign w:val="center"/>
+            <w:shd w:fill="EDEDED"/>
           </w:tcPr>
           <w:p>
             <w:pPr>
-              <w:spacing w:after="40" w:before="0"/>
+              <w:spacing w:after="0"/>
             </w:pPr>
+            <w:r/>
             <w:r>
               <w:rPr>
-                <w:rFonts w:ascii="맑은 고딕" w:hAnsi="맑은 고딕" w:eastAsia="맑은 고딕"/>
                 <w:b/>
                 <w:sz w:val="20"/>
               </w:rPr>
@@ -911,21 +1090,16 @@
         </w:tc>
         <w:tc>
           <w:tcPr>
-            <w:tcW w:type="dxa" w:w="7200"/>
-            <w:tcBorders>
-              <w:top w:val="single" w:sz="8" w:space="0" w:color="000000"/>
-              <w:left w:val="single" w:sz="8" w:space="0" w:color="000000"/>
-              <w:bottom w:val="single" w:sz="8" w:space="0" w:color="000000"/>
-              <w:right w:val="single" w:sz="8" w:space="0" w:color="000000"/>
-            </w:tcBorders>
+            <w:tcW w:type="dxa" w:w="7937"/>
+            <w:vAlign w:val="center"/>
           </w:tcPr>
           <w:p>
             <w:pPr>
-              <w:spacing w:after="40" w:before="0"/>
+              <w:spacing w:after="0"/>
             </w:pPr>
+            <w:r/>
             <w:r>
               <w:rPr>
-                <w:rFonts w:ascii="맑은 고딕" w:hAnsi="맑은 고딕" w:eastAsia="맑은 고딕"/>
                 <w:b w:val="0"/>
                 <w:sz w:val="20"/>
               </w:rPr>
@@ -937,22 +1111,17 @@
       <w:tr>
         <w:tc>
           <w:tcPr>
-            <w:tcW w:type="dxa" w:w="2200"/>
-            <w:shd w:val="clear" w:color="auto" w:fill="F2F2F2"/>
-            <w:tcBorders>
-              <w:top w:val="single" w:sz="8" w:space="0" w:color="000000"/>
-              <w:left w:val="single" w:sz="8" w:space="0" w:color="000000"/>
-              <w:bottom w:val="single" w:sz="8" w:space="0" w:color="000000"/>
-              <w:right w:val="single" w:sz="8" w:space="0" w:color="000000"/>
-            </w:tcBorders>
+            <w:tcW w:type="dxa" w:w="1871"/>
+            <w:vAlign w:val="center"/>
+            <w:shd w:fill="EDEDED"/>
           </w:tcPr>
           <w:p>
             <w:pPr>
-              <w:spacing w:after="40" w:before="0"/>
+              <w:spacing w:after="0"/>
             </w:pPr>
+            <w:r/>
             <w:r>
               <w:rPr>
-                <w:rFonts w:ascii="맑은 고딕" w:hAnsi="맑은 고딕" w:eastAsia="맑은 고딕"/>
                 <w:b/>
                 <w:sz w:val="20"/>
               </w:rPr>
@@ -962,21 +1131,16 @@
         </w:tc>
         <w:tc>
           <w:tcPr>
-            <w:tcW w:type="dxa" w:w="7200"/>
-            <w:tcBorders>
-              <w:top w:val="single" w:sz="8" w:space="0" w:color="000000"/>
-              <w:left w:val="single" w:sz="8" w:space="0" w:color="000000"/>
-              <w:bottom w:val="single" w:sz="8" w:space="0" w:color="000000"/>
-              <w:right w:val="single" w:sz="8" w:space="0" w:color="000000"/>
-            </w:tcBorders>
+            <w:tcW w:type="dxa" w:w="7937"/>
+            <w:vAlign w:val="center"/>
           </w:tcPr>
           <w:p>
             <w:pPr>
-              <w:spacing w:after="40" w:before="0"/>
+              <w:spacing w:after="0"/>
             </w:pPr>
+            <w:r/>
             <w:r>
               <w:rPr>
-                <w:rFonts w:ascii="맑은 고딕" w:hAnsi="맑은 고딕" w:eastAsia="맑은 고딕"/>
                 <w:b w:val="0"/>
                 <w:sz w:val="20"/>
               </w:rPr>
@@ -988,22 +1152,17 @@
       <w:tr>
         <w:tc>
           <w:tcPr>
-            <w:tcW w:type="dxa" w:w="2200"/>
-            <w:shd w:val="clear" w:color="auto" w:fill="F2F2F2"/>
-            <w:tcBorders>
-              <w:top w:val="single" w:sz="8" w:space="0" w:color="000000"/>
-              <w:left w:val="single" w:sz="8" w:space="0" w:color="000000"/>
-              <w:bottom w:val="single" w:sz="8" w:space="0" w:color="000000"/>
-              <w:right w:val="single" w:sz="8" w:space="0" w:color="000000"/>
-            </w:tcBorders>
+            <w:tcW w:type="dxa" w:w="1871"/>
+            <w:vAlign w:val="center"/>
+            <w:shd w:fill="EDEDED"/>
           </w:tcPr>
           <w:p>
             <w:pPr>
-              <w:spacing w:after="40" w:before="0"/>
+              <w:spacing w:after="0"/>
             </w:pPr>
+            <w:r/>
             <w:r>
               <w:rPr>
-                <w:rFonts w:ascii="맑은 고딕" w:hAnsi="맑은 고딕" w:eastAsia="맑은 고딕"/>
                 <w:b/>
                 <w:sz w:val="20"/>
               </w:rPr>
@@ -1013,25 +1172,20 @@
         </w:tc>
         <w:tc>
           <w:tcPr>
-            <w:tcW w:type="dxa" w:w="7200"/>
-            <w:tcBorders>
-              <w:top w:val="single" w:sz="8" w:space="0" w:color="000000"/>
-              <w:left w:val="single" w:sz="8" w:space="0" w:color="000000"/>
-              <w:bottom w:val="single" w:sz="8" w:space="0" w:color="000000"/>
-              <w:right w:val="single" w:sz="8" w:space="0" w:color="000000"/>
-            </w:tcBorders>
+            <w:tcW w:type="dxa" w:w="7937"/>
+            <w:vAlign w:val="center"/>
           </w:tcPr>
           <w:p>
             <w:pPr>
-              <w:spacing w:after="40" w:before="0"/>
+              <w:spacing w:after="0"/>
             </w:pPr>
+            <w:r/>
             <w:r>
               <w:rPr>
-                <w:rFonts w:ascii="맑은 고딕" w:hAnsi="맑은 고딕" w:eastAsia="맑은 고딕"/>
                 <w:b w:val="0"/>
                 <w:sz w:val="20"/>
               </w:rPr>
-              <w:t>Workload(Camera/AI)와 Normal Camera Application이 Camera/AI HW를 충돌/데이터 유출 없이 사용했다</w:t>
+              <w:t>Host와 pVM이 Camera/AI HW를 서로 배타적으로 사용했고, 사용 주체 전환 시 잔류 데이터 유출이 없었다</w:t>
             </w:r>
           </w:p>
         </w:tc>
@@ -1039,22 +1193,17 @@
       <w:tr>
         <w:tc>
           <w:tcPr>
-            <w:tcW w:type="dxa" w:w="2200"/>
-            <w:shd w:val="clear" w:color="auto" w:fill="F2F2F2"/>
-            <w:tcBorders>
-              <w:top w:val="single" w:sz="8" w:space="0" w:color="000000"/>
-              <w:left w:val="single" w:sz="8" w:space="0" w:color="000000"/>
-              <w:bottom w:val="single" w:sz="8" w:space="0" w:color="000000"/>
-              <w:right w:val="single" w:sz="8" w:space="0" w:color="000000"/>
-            </w:tcBorders>
+            <w:tcW w:type="dxa" w:w="1871"/>
+            <w:vAlign w:val="center"/>
+            <w:shd w:fill="EDEDED"/>
           </w:tcPr>
           <w:p>
             <w:pPr>
-              <w:spacing w:after="40" w:before="0"/>
+              <w:spacing w:after="0"/>
             </w:pPr>
+            <w:r/>
             <w:r>
               <w:rPr>
-                <w:rFonts w:ascii="맑은 고딕" w:hAnsi="맑은 고딕" w:eastAsia="맑은 고딕"/>
                 <w:b/>
                 <w:sz w:val="20"/>
               </w:rPr>
@@ -1064,90 +1213,70 @@
         </w:tc>
         <w:tc>
           <w:tcPr>
-            <w:tcW w:type="dxa" w:w="7200"/>
-            <w:tcBorders>
-              <w:top w:val="single" w:sz="8" w:space="0" w:color="000000"/>
-              <w:left w:val="single" w:sz="8" w:space="0" w:color="000000"/>
-              <w:bottom w:val="single" w:sz="8" w:space="0" w:color="000000"/>
-              <w:right w:val="single" w:sz="8" w:space="0" w:color="000000"/>
-            </w:tcBorders>
+            <w:tcW w:type="dxa" w:w="7937"/>
+            <w:vAlign w:val="center"/>
           </w:tcPr>
           <w:p>
             <w:pPr>
-              <w:spacing w:after="40" w:before="0"/>
+              <w:spacing w:after="0"/>
             </w:pPr>
+            <w:r/>
             <w:r>
               <w:rPr>
-                <w:rFonts w:ascii="맑은 고딕" w:hAnsi="맑은 고딕" w:eastAsia="맑은 고딕"/>
                 <w:b w:val="0"/>
                 <w:sz w:val="20"/>
               </w:rPr>
               <w:t>1. Workload(Camera/AI)가 Camera/AI HW 사용을 요청한다</w:t>
             </w:r>
-          </w:p>
-          <w:p>
-            <w:pPr>
-              <w:spacing w:after="40" w:before="0"/>
-            </w:pPr>
+            <w:r>
+              <w:br/>
+            </w:r>
             <w:r>
               <w:rPr>
-                <w:rFonts w:ascii="맑은 고딕" w:hAnsi="맑은 고딕" w:eastAsia="맑은 고딕"/>
                 <w:b w:val="0"/>
                 <w:sz w:val="20"/>
               </w:rPr>
-              <w:t>2. 시스템은 S2MPU를 통해 요청한 HW 접근 권한을 Workload(Camera/AI)에 전용 할당한다</w:t>
+              <w:t>2. 시스템은 현재 HW를 점유한 다른 주체가 없음을 확인하고, S2MPU를 통해 HW 접근 권한을 pVM의 Workload(Camera/AI)에 배타적으로 할당한다</w:t>
             </w:r>
-          </w:p>
-          <w:p>
-            <w:pPr>
-              <w:spacing w:after="40" w:before="0"/>
-            </w:pPr>
+            <w:r>
+              <w:br/>
+            </w:r>
             <w:r>
               <w:rPr>
-                <w:rFonts w:ascii="맑은 고딕" w:hAnsi="맑은 고딕" w:eastAsia="맑은 고딕"/>
                 <w:b w:val="0"/>
                 <w:sz w:val="20"/>
               </w:rPr>
-              <w:t>3. Workload(Camera/AI)는 Camera/AI HW로 보안 데이터를 처리한다</w:t>
+              <w:t>3. Workload(Camera/AI)는 확보한 Camera/AI HW로 보안 데이터를 처리한다</w:t>
             </w:r>
-          </w:p>
-          <w:p>
-            <w:pPr>
-              <w:spacing w:after="40" w:before="0"/>
-            </w:pPr>
+            <w:r>
+              <w:br/>
+            </w:r>
             <w:r>
               <w:rPr>
-                <w:rFonts w:ascii="맑은 고딕" w:hAnsi="맑은 고딕" w:eastAsia="맑은 고딕"/>
                 <w:b w:val="0"/>
                 <w:sz w:val="20"/>
               </w:rPr>
-              <w:t>4. 시스템은 처리 완료 후 HW 버퍼의 잔류 데이터를 보안 격리하고 접근 권한을 반환한다</w:t>
+              <w:t>4. 시스템은 처리 완료 후 HW 버퍼의 잔류 데이터를 격리하고 접근 권한을 회수하여 HW를 유휴 상태로 전환한다</w:t>
             </w:r>
-          </w:p>
-          <w:p>
-            <w:pPr>
-              <w:spacing w:after="40" w:before="0"/>
-            </w:pPr>
+            <w:r>
+              <w:br/>
+            </w:r>
             <w:r>
               <w:rPr>
-                <w:rFonts w:ascii="맑은 고딕" w:hAnsi="맑은 고딕" w:eastAsia="맑은 고딕"/>
                 <w:b w:val="0"/>
                 <w:sz w:val="20"/>
               </w:rPr>
-              <w:t>5. Normal Camera Application이 Camera HW 사용을 요청한다</w:t>
+              <w:t>5. Normal Camera Application이 Host에서 Camera HW 사용을 요청한다</w:t>
             </w:r>
-          </w:p>
-          <w:p>
-            <w:pPr>
-              <w:spacing w:after="40" w:before="0"/>
-            </w:pPr>
+            <w:r>
+              <w:br/>
+            </w:r>
             <w:r>
               <w:rPr>
-                <w:rFonts w:ascii="맑은 고딕" w:hAnsi="맑은 고딕" w:eastAsia="맑은 고딕"/>
                 <w:b w:val="0"/>
                 <w:sz w:val="20"/>
               </w:rPr>
-              <w:t>6. 시스템은 Camera HW 접근 권한을 Normal Camera Application에 할당한다</w:t>
+              <w:t>6. 시스템은 HW가 유휴 상태임을 확인하고 Camera HW 접근 권한을 Host의 Normal Camera Application에 배타적으로 할당한다</w:t>
             </w:r>
           </w:p>
         </w:tc>
@@ -1155,22 +1284,17 @@
       <w:tr>
         <w:tc>
           <w:tcPr>
-            <w:tcW w:type="dxa" w:w="2200"/>
-            <w:shd w:val="clear" w:color="auto" w:fill="F2F2F2"/>
-            <w:tcBorders>
-              <w:top w:val="single" w:sz="8" w:space="0" w:color="000000"/>
-              <w:left w:val="single" w:sz="8" w:space="0" w:color="000000"/>
-              <w:bottom w:val="single" w:sz="8" w:space="0" w:color="000000"/>
-              <w:right w:val="single" w:sz="8" w:space="0" w:color="000000"/>
-            </w:tcBorders>
+            <w:tcW w:type="dxa" w:w="1871"/>
+            <w:vAlign w:val="center"/>
+            <w:shd w:fill="EDEDED"/>
           </w:tcPr>
           <w:p>
             <w:pPr>
-              <w:spacing w:after="40" w:before="0"/>
+              <w:spacing w:after="0"/>
             </w:pPr>
+            <w:r/>
             <w:r>
               <w:rPr>
-                <w:rFonts w:ascii="맑은 고딕" w:hAnsi="맑은 고딕" w:eastAsia="맑은 고딕"/>
                 <w:b/>
                 <w:sz w:val="20"/>
               </w:rPr>
@@ -1180,115 +1304,106 @@
         </w:tc>
         <w:tc>
           <w:tcPr>
-            <w:tcW w:type="dxa" w:w="7200"/>
-            <w:tcBorders>
-              <w:top w:val="single" w:sz="8" w:space="0" w:color="000000"/>
-              <w:left w:val="single" w:sz="8" w:space="0" w:color="000000"/>
-              <w:bottom w:val="single" w:sz="8" w:space="0" w:color="000000"/>
-              <w:right w:val="single" w:sz="8" w:space="0" w:color="000000"/>
-            </w:tcBorders>
+            <w:tcW w:type="dxa" w:w="7937"/>
+            <w:vAlign w:val="center"/>
           </w:tcPr>
           <w:p>
             <w:pPr>
-              <w:spacing w:after="40" w:before="0"/>
+              <w:spacing w:after="0"/>
             </w:pPr>
+            <w:r/>
             <w:r>
               <w:rPr>
-                <w:rFonts w:ascii="맑은 고딕" w:hAnsi="맑은 고딕" w:eastAsia="맑은 고딕"/>
                 <w:b w:val="0"/>
                 <w:sz w:val="20"/>
               </w:rPr>
-              <w:t>1. 시스템은 HW IP 접근 충돌 발생 시 요청을 큐에 대기시키고 현재 사용 완료 후 순차 처리한다</w:t>
+              <w:t>1. 시스템은 한 주체가 HW를 점유 중일 때 다른 주체의 사용 요청이 들어오면 요청을 대기시키고, 현재 사용 완료 및 권한 회수 후 순차 처리한다</w:t>
             </w:r>
-          </w:p>
-          <w:p>
-            <w:pPr>
-              <w:spacing w:after="40" w:before="0"/>
-            </w:pPr>
+            <w:r>
+              <w:br/>
+            </w:r>
             <w:r>
               <w:rPr>
-                <w:rFonts w:ascii="맑은 고딕" w:hAnsi="맑은 고딕" w:eastAsia="맑은 고딕"/>
                 <w:b w:val="0"/>
                 <w:sz w:val="20"/>
               </w:rPr>
-              <w:t>2. 시스템은 Camera/AI HW 사용 주체 전환 전 잔류 데이터 보안 격리가 실패하면 접근 권한 반환을 중단하고 오류를 기록한다</w:t>
+              <w:t>2. 시스템은 사용 주체 전환 전 잔류 데이터 격리에 실패하면 접근 권한 재할당을 중단하고 오류를 기록한다</w:t>
             </w:r>
-          </w:p>
-          <w:p>
-            <w:pPr>
-              <w:spacing w:after="40" w:before="0"/>
-            </w:pPr>
+            <w:r>
+              <w:br/>
+            </w:r>
             <w:r>
               <w:rPr>
-                <w:rFonts w:ascii="맑은 고딕" w:hAnsi="맑은 고딕" w:eastAsia="맑은 고딕"/>
                 <w:b w:val="0"/>
                 <w:sz w:val="20"/>
               </w:rPr>
-              <w:t>3. 시스템은 허가되지 않은 pVM 또는 애플리케이션이 Camera/AI HW 접근을 요청하면 S2MPU 정책으로 접근을 차단한다</w:t>
+              <w:t>3. 시스템은 허가되지 않은 pVM 또는 Host 애플리케이션의 Camera/AI HW 접근을 S2MPU 정책으로 차단한다</w:t>
             </w:r>
           </w:p>
         </w:tc>
       </w:tr>
     </w:tbl>
-    <w:p/>
+    <w:p>
+      <w:pPr>
+        <w:spacing w:after="0"/>
+      </w:pPr>
+    </w:p>
     <w:tbl>
       <w:tblPr>
         <w:tblW w:type="auto" w:w="0"/>
         <w:tblLayout w:type="fixed"/>
         <w:tblLook w:firstColumn="1" w:firstRow="1" w:lastColumn="0" w:lastRow="0" w:noHBand="0" w:noVBand="1" w:val="04A0"/>
+        <w:tblBorders>
+          <w:top w:val="single" w:sz="8" w:space="0" w:color="000000"/>
+          <w:left w:val="single" w:sz="8" w:space="0" w:color="000000"/>
+          <w:bottom w:val="single" w:sz="8" w:space="0" w:color="000000"/>
+          <w:right w:val="single" w:sz="8" w:space="0" w:color="000000"/>
+          <w:insideH w:val="single" w:sz="8" w:space="0" w:color="000000"/>
+          <w:insideV w:val="single" w:sz="8" w:space="0" w:color="000000"/>
+        </w:tblBorders>
       </w:tblPr>
       <w:tblGrid>
-        <w:gridCol w:w="4320"/>
-        <w:gridCol w:w="4320"/>
+        <w:gridCol w:w="1871"/>
+        <w:gridCol w:w="7937"/>
       </w:tblGrid>
       <w:tr>
         <w:tc>
           <w:tcPr>
-            <w:tcW w:type="dxa" w:w="2200"/>
-            <w:shd w:val="clear" w:color="auto" w:fill="D9E2F3"/>
-            <w:tcBorders>
-              <w:top w:val="single" w:sz="8" w:space="0" w:color="000000"/>
-              <w:left w:val="single" w:sz="8" w:space="0" w:color="000000"/>
-              <w:bottom w:val="single" w:sz="8" w:space="0" w:color="000000"/>
-              <w:right w:val="single" w:sz="8" w:space="0" w:color="000000"/>
-            </w:tcBorders>
+            <w:tcW w:type="dxa" w:w="1871"/>
+            <w:vAlign w:val="center"/>
+            <w:shd w:fill="D9EAF7"/>
           </w:tcPr>
           <w:p>
             <w:pPr>
-              <w:spacing w:after="40" w:before="0"/>
+              <w:spacing w:after="0"/>
             </w:pPr>
+            <w:r/>
             <w:r>
               <w:rPr>
-                <w:rFonts w:ascii="맑은 고딕" w:hAnsi="맑은 고딕" w:eastAsia="맑은 고딕"/>
                 <w:b/>
                 <w:sz w:val="20"/>
               </w:rPr>
-              <w:t>UC-04</w:t>
+              <w:t>UC-05</w:t>
             </w:r>
           </w:p>
         </w:tc>
         <w:tc>
           <w:tcPr>
-            <w:tcW w:type="dxa" w:w="7200"/>
-            <w:shd w:val="clear" w:color="auto" w:fill="D9E2F3"/>
-            <w:tcBorders>
-              <w:top w:val="single" w:sz="8" w:space="0" w:color="000000"/>
-              <w:left w:val="single" w:sz="8" w:space="0" w:color="000000"/>
-              <w:bottom w:val="single" w:sz="8" w:space="0" w:color="000000"/>
-              <w:right w:val="single" w:sz="8" w:space="0" w:color="000000"/>
-            </w:tcBorders>
+            <w:tcW w:type="dxa" w:w="7937"/>
+            <w:vAlign w:val="center"/>
+            <w:shd w:fill="D9EAF7"/>
           </w:tcPr>
           <w:p>
             <w:pPr>
-              <w:spacing w:after="40" w:before="0"/>
+              <w:spacing w:after="0"/>
             </w:pPr>
+            <w:r/>
             <w:r>
               <w:rPr>
-                <w:rFonts w:ascii="맑은 고딕" w:hAnsi="맑은 고딕" w:eastAsia="맑은 고딕"/>
                 <w:b/>
                 <w:sz w:val="20"/>
               </w:rPr>
-              <w:t>도메인 간 보안 데이터 전송</w:t>
+              <w:t>도메인 간 DMABUF 전송</w:t>
             </w:r>
           </w:p>
         </w:tc>
@@ -1296,22 +1411,17 @@
       <w:tr>
         <w:tc>
           <w:tcPr>
-            <w:tcW w:type="dxa" w:w="2200"/>
-            <w:shd w:val="clear" w:color="auto" w:fill="F2F2F2"/>
-            <w:tcBorders>
-              <w:top w:val="single" w:sz="8" w:space="0" w:color="000000"/>
-              <w:left w:val="single" w:sz="8" w:space="0" w:color="000000"/>
-              <w:bottom w:val="single" w:sz="8" w:space="0" w:color="000000"/>
-              <w:right w:val="single" w:sz="8" w:space="0" w:color="000000"/>
-            </w:tcBorders>
+            <w:tcW w:type="dxa" w:w="1871"/>
+            <w:vAlign w:val="center"/>
+            <w:shd w:fill="EDEDED"/>
           </w:tcPr>
           <w:p>
             <w:pPr>
-              <w:spacing w:after="40" w:before="0"/>
+              <w:spacing w:after="0"/>
             </w:pPr>
+            <w:r/>
             <w:r>
               <w:rPr>
-                <w:rFonts w:ascii="맑은 고딕" w:hAnsi="맑은 고딕" w:eastAsia="맑은 고딕"/>
                 <w:b/>
                 <w:sz w:val="20"/>
               </w:rPr>
@@ -1321,21 +1431,16 @@
         </w:tc>
         <w:tc>
           <w:tcPr>
-            <w:tcW w:type="dxa" w:w="7200"/>
-            <w:tcBorders>
-              <w:top w:val="single" w:sz="8" w:space="0" w:color="000000"/>
-              <w:left w:val="single" w:sz="8" w:space="0" w:color="000000"/>
-              <w:bottom w:val="single" w:sz="8" w:space="0" w:color="000000"/>
-              <w:right w:val="single" w:sz="8" w:space="0" w:color="000000"/>
-            </w:tcBorders>
+            <w:tcW w:type="dxa" w:w="7937"/>
+            <w:vAlign w:val="center"/>
           </w:tcPr>
           <w:p>
             <w:pPr>
-              <w:spacing w:after="40" w:before="0"/>
+              <w:spacing w:after="0"/>
             </w:pPr>
+            <w:r/>
             <w:r>
               <w:rPr>
-                <w:rFonts w:ascii="맑은 고딕" w:hAnsi="맑은 고딕" w:eastAsia="맑은 고딕"/>
                 <w:b w:val="0"/>
                 <w:sz w:val="20"/>
               </w:rPr>
@@ -1347,22 +1452,17 @@
       <w:tr>
         <w:tc>
           <w:tcPr>
-            <w:tcW w:type="dxa" w:w="2200"/>
-            <w:shd w:val="clear" w:color="auto" w:fill="F2F2F2"/>
-            <w:tcBorders>
-              <w:top w:val="single" w:sz="8" w:space="0" w:color="000000"/>
-              <w:left w:val="single" w:sz="8" w:space="0" w:color="000000"/>
-              <w:bottom w:val="single" w:sz="8" w:space="0" w:color="000000"/>
-              <w:right w:val="single" w:sz="8" w:space="0" w:color="000000"/>
-            </w:tcBorders>
+            <w:tcW w:type="dxa" w:w="1871"/>
+            <w:vAlign w:val="center"/>
+            <w:shd w:fill="EDEDED"/>
           </w:tcPr>
           <w:p>
             <w:pPr>
-              <w:spacing w:after="40" w:before="0"/>
+              <w:spacing w:after="0"/>
             </w:pPr>
+            <w:r/>
             <w:r>
               <w:rPr>
-                <w:rFonts w:ascii="맑은 고딕" w:hAnsi="맑은 고딕" w:eastAsia="맑은 고딕"/>
                 <w:b/>
                 <w:sz w:val="20"/>
               </w:rPr>
@@ -1372,25 +1472,20 @@
         </w:tc>
         <w:tc>
           <w:tcPr>
-            <w:tcW w:type="dxa" w:w="7200"/>
-            <w:tcBorders>
-              <w:top w:val="single" w:sz="8" w:space="0" w:color="000000"/>
-              <w:left w:val="single" w:sz="8" w:space="0" w:color="000000"/>
-              <w:bottom w:val="single" w:sz="8" w:space="0" w:color="000000"/>
-              <w:right w:val="single" w:sz="8" w:space="0" w:color="000000"/>
-            </w:tcBorders>
+            <w:tcW w:type="dxa" w:w="7937"/>
+            <w:vAlign w:val="center"/>
           </w:tcPr>
           <w:p>
             <w:pPr>
-              <w:spacing w:after="40" w:before="0"/>
+              <w:spacing w:after="0"/>
             </w:pPr>
+            <w:r/>
             <w:r>
               <w:rPr>
-                <w:rFonts w:ascii="맑은 고딕" w:hAnsi="맑은 고딕" w:eastAsia="맑은 고딕"/>
                 <w:b w:val="0"/>
                 <w:sz w:val="20"/>
               </w:rPr>
-              <w:t>Host Application이 데이터 전송을 요청할 수 있고 Workload(Camera/AI)가 실행 중이다</w:t>
+              <w:t>송신 및 수신 도메인이 실행 중이고 DMABUF 전송 채널과 접근 제어 정책이 준비되어 있다</w:t>
             </w:r>
           </w:p>
         </w:tc>
@@ -1398,22 +1493,17 @@
       <w:tr>
         <w:tc>
           <w:tcPr>
-            <w:tcW w:type="dxa" w:w="2200"/>
-            <w:shd w:val="clear" w:color="auto" w:fill="F2F2F2"/>
-            <w:tcBorders>
-              <w:top w:val="single" w:sz="8" w:space="0" w:color="000000"/>
-              <w:left w:val="single" w:sz="8" w:space="0" w:color="000000"/>
-              <w:bottom w:val="single" w:sz="8" w:space="0" w:color="000000"/>
-              <w:right w:val="single" w:sz="8" w:space="0" w:color="000000"/>
-            </w:tcBorders>
+            <w:tcW w:type="dxa" w:w="1871"/>
+            <w:vAlign w:val="center"/>
+            <w:shd w:fill="EDEDED"/>
           </w:tcPr>
           <w:p>
             <w:pPr>
-              <w:spacing w:after="40" w:before="0"/>
+              <w:spacing w:after="0"/>
             </w:pPr>
+            <w:r/>
             <w:r>
               <w:rPr>
-                <w:rFonts w:ascii="맑은 고딕" w:hAnsi="맑은 고딕" w:eastAsia="맑은 고딕"/>
                 <w:b/>
                 <w:sz w:val="20"/>
               </w:rPr>
@@ -1423,25 +1513,20 @@
         </w:tc>
         <w:tc>
           <w:tcPr>
-            <w:tcW w:type="dxa" w:w="7200"/>
-            <w:tcBorders>
-              <w:top w:val="single" w:sz="8" w:space="0" w:color="000000"/>
-              <w:left w:val="single" w:sz="8" w:space="0" w:color="000000"/>
-              <w:bottom w:val="single" w:sz="8" w:space="0" w:color="000000"/>
-              <w:right w:val="single" w:sz="8" w:space="0" w:color="000000"/>
-            </w:tcBorders>
+            <w:tcW w:type="dxa" w:w="7937"/>
+            <w:vAlign w:val="center"/>
           </w:tcPr>
           <w:p>
             <w:pPr>
-              <w:spacing w:after="40" w:before="0"/>
+              <w:spacing w:after="0"/>
             </w:pPr>
+            <w:r/>
             <w:r>
               <w:rPr>
-                <w:rFonts w:ascii="맑은 고딕" w:hAnsi="맑은 고딕" w:eastAsia="맑은 고딕"/>
                 <w:b w:val="0"/>
                 <w:sz w:val="20"/>
               </w:rPr>
-              <w:t>데이터가 Host에 노출되지 않고 대상 도메인에 전달되었다</w:t>
+              <w:t>DMABUF가 비신뢰 주체에 노출되지 않고 대상 pVM 또는 Host에 전달되었다</w:t>
             </w:r>
           </w:p>
         </w:tc>
@@ -1449,22 +1534,17 @@
       <w:tr>
         <w:tc>
           <w:tcPr>
-            <w:tcW w:type="dxa" w:w="2200"/>
-            <w:shd w:val="clear" w:color="auto" w:fill="F2F2F2"/>
-            <w:tcBorders>
-              <w:top w:val="single" w:sz="8" w:space="0" w:color="000000"/>
-              <w:left w:val="single" w:sz="8" w:space="0" w:color="000000"/>
-              <w:bottom w:val="single" w:sz="8" w:space="0" w:color="000000"/>
-              <w:right w:val="single" w:sz="8" w:space="0" w:color="000000"/>
-            </w:tcBorders>
+            <w:tcW w:type="dxa" w:w="1871"/>
+            <w:vAlign w:val="center"/>
+            <w:shd w:fill="EDEDED"/>
           </w:tcPr>
           <w:p>
             <w:pPr>
-              <w:spacing w:after="40" w:before="0"/>
+              <w:spacing w:after="0"/>
             </w:pPr>
+            <w:r/>
             <w:r>
               <w:rPr>
-                <w:rFonts w:ascii="맑은 고딕" w:hAnsi="맑은 고딕" w:eastAsia="맑은 고딕"/>
                 <w:b/>
                 <w:sz w:val="20"/>
               </w:rPr>
@@ -1474,77 +1554,60 @@
         </w:tc>
         <w:tc>
           <w:tcPr>
-            <w:tcW w:type="dxa" w:w="7200"/>
-            <w:tcBorders>
-              <w:top w:val="single" w:sz="8" w:space="0" w:color="000000"/>
-              <w:left w:val="single" w:sz="8" w:space="0" w:color="000000"/>
-              <w:bottom w:val="single" w:sz="8" w:space="0" w:color="000000"/>
-              <w:right w:val="single" w:sz="8" w:space="0" w:color="000000"/>
-            </w:tcBorders>
+            <w:tcW w:type="dxa" w:w="7937"/>
+            <w:vAlign w:val="center"/>
           </w:tcPr>
           <w:p>
             <w:pPr>
-              <w:spacing w:after="40" w:before="0"/>
+              <w:spacing w:after="0"/>
             </w:pPr>
+            <w:r/>
             <w:r>
               <w:rPr>
-                <w:rFonts w:ascii="맑은 고딕" w:hAnsi="맑은 고딕" w:eastAsia="맑은 고딕"/>
                 <w:b w:val="0"/>
                 <w:sz w:val="20"/>
               </w:rPr>
-              <w:t>1. Host Application이 도메인 간 보안 데이터 전송을 요청한다</w:t>
+              <w:t>1. Host Application 또는 Workload(Camera/AI)가 pVM↔pVM 또는 pVM↔Host 간 DMABUF 전송을 요청한다</w:t>
             </w:r>
-          </w:p>
-          <w:p>
-            <w:pPr>
-              <w:spacing w:after="40" w:before="0"/>
-            </w:pPr>
+            <w:r>
+              <w:br/>
+            </w:r>
             <w:r>
               <w:rPr>
-                <w:rFonts w:ascii="맑은 고딕" w:hAnsi="맑은 고딕" w:eastAsia="맑은 고딕"/>
                 <w:b w:val="0"/>
                 <w:sz w:val="20"/>
               </w:rPr>
-              <w:t>2. 시스템은 송신/수신 도메인에만 접근 가능한 보안 공유 버퍼를 생성한다</w:t>
+              <w:t>2. 시스템은 송신 및 수신 도메인의 권한을 검증한다</w:t>
             </w:r>
-          </w:p>
-          <w:p>
-            <w:pPr>
-              <w:spacing w:after="40" w:before="0"/>
-            </w:pPr>
+            <w:r>
+              <w:br/>
+            </w:r>
             <w:r>
               <w:rPr>
-                <w:rFonts w:ascii="맑은 고딕" w:hAnsi="맑은 고딕" w:eastAsia="맑은 고딕"/>
                 <w:b w:val="0"/>
                 <w:sz w:val="20"/>
               </w:rPr>
-              <w:t>3. Workload(Camera/AI)는 데이터를 보안 공유 버퍼에 기록한다</w:t>
+              <w:t>3. 시스템은 DMABUF 접근 권한을 송신/수신 도메인으로 제한하고 대상 도메인에 전달한다</w:t>
             </w:r>
-          </w:p>
-          <w:p>
-            <w:pPr>
-              <w:spacing w:after="40" w:before="0"/>
-            </w:pPr>
+            <w:r>
+              <w:br/>
+            </w:r>
             <w:r>
               <w:rPr>
-                <w:rFonts w:ascii="맑은 고딕" w:hAnsi="맑은 고딕" w:eastAsia="맑은 고딕"/>
                 <w:b w:val="0"/>
                 <w:sz w:val="20"/>
               </w:rPr>
-              <w:t>4. Workload(Camera/AI)는 대상 도메인에서 공유 버퍼의 데이터를 읽어 처리한다</w:t>
+              <w:t>4. 대상 도메인의 Workload 또는 Host Application이 DMABUF를 처리한다</w:t>
             </w:r>
-          </w:p>
-          <w:p>
-            <w:pPr>
-              <w:spacing w:after="40" w:before="0"/>
-            </w:pPr>
+            <w:r>
+              <w:br/>
+            </w:r>
             <w:r>
               <w:rPr>
-                <w:rFonts w:ascii="맑은 고딕" w:hAnsi="맑은 고딕" w:eastAsia="맑은 고딕"/>
                 <w:b w:val="0"/>
                 <w:sz w:val="20"/>
               </w:rPr>
-              <w:t>5. 시스템은 전송 완료 후 공유 버퍼를 초기화한다</w:t>
+              <w:t>5. 시스템은 전송 완료 후 불필요한 매핑과 접근 권한을 회수한다</w:t>
             </w:r>
           </w:p>
         </w:tc>
@@ -1552,22 +1615,17 @@
       <w:tr>
         <w:tc>
           <w:tcPr>
-            <w:tcW w:type="dxa" w:w="2200"/>
-            <w:shd w:val="clear" w:color="auto" w:fill="F2F2F2"/>
-            <w:tcBorders>
-              <w:top w:val="single" w:sz="8" w:space="0" w:color="000000"/>
-              <w:left w:val="single" w:sz="8" w:space="0" w:color="000000"/>
-              <w:bottom w:val="single" w:sz="8" w:space="0" w:color="000000"/>
-              <w:right w:val="single" w:sz="8" w:space="0" w:color="000000"/>
-            </w:tcBorders>
+            <w:tcW w:type="dxa" w:w="1871"/>
+            <w:vAlign w:val="center"/>
+            <w:shd w:fill="EDEDED"/>
           </w:tcPr>
           <w:p>
             <w:pPr>
-              <w:spacing w:after="40" w:before="0"/>
+              <w:spacing w:after="0"/>
             </w:pPr>
+            <w:r/>
             <w:r>
               <w:rPr>
-                <w:rFonts w:ascii="맑은 고딕" w:hAnsi="맑은 고딕" w:eastAsia="맑은 고딕"/>
                 <w:b/>
                 <w:sz w:val="20"/>
               </w:rPr>
@@ -1577,470 +1635,82 @@
         </w:tc>
         <w:tc>
           <w:tcPr>
-            <w:tcW w:type="dxa" w:w="7200"/>
-            <w:tcBorders>
-              <w:top w:val="single" w:sz="8" w:space="0" w:color="000000"/>
-              <w:left w:val="single" w:sz="8" w:space="0" w:color="000000"/>
-              <w:bottom w:val="single" w:sz="8" w:space="0" w:color="000000"/>
-              <w:right w:val="single" w:sz="8" w:space="0" w:color="000000"/>
-            </w:tcBorders>
+            <w:tcW w:type="dxa" w:w="7937"/>
+            <w:vAlign w:val="center"/>
           </w:tcPr>
           <w:p>
             <w:pPr>
-              <w:spacing w:after="40" w:before="0"/>
+              <w:spacing w:after="0"/>
             </w:pPr>
+            <w:r/>
             <w:r>
               <w:rPr>
-                <w:rFonts w:ascii="맑은 고딕" w:hAnsi="맑은 고딕" w:eastAsia="맑은 고딕"/>
                 <w:b w:val="0"/>
                 <w:sz w:val="20"/>
               </w:rPr>
-              <w:t>1. 시스템은 수신 Workload가 응답 없는 경우 전송을 중단하고 공유 버퍼를 초기화한다</w:t>
+              <w:t>1. 시스템은 수신 도메인이 응답하지 않으면 전송을 중단하고 DMABUF 매핑 및 권한을 회수한다</w:t>
             </w:r>
-          </w:p>
-          <w:p>
-            <w:pPr>
-              <w:spacing w:after="40" w:before="0"/>
-            </w:pPr>
+            <w:r>
+              <w:br/>
+            </w:r>
             <w:r>
               <w:rPr>
-                <w:rFonts w:ascii="맑은 고딕" w:hAnsi="맑은 고딕" w:eastAsia="맑은 고딕"/>
                 <w:b w:val="0"/>
                 <w:sz w:val="20"/>
               </w:rPr>
-              <w:t>2. 시스템은 공유 버퍼 권한 설정에 실패하면 버퍼를 해제하고 Host Application에 오류를 반환한다</w:t>
+              <w:t>2. 시스템은 DMABUF 권한 설정 또는 전달에 실패하면 비신뢰 주체의 접근을 차단한 상태로 자원을 정리하고 오류를 반환한다</w:t>
             </w:r>
-          </w:p>
-          <w:p>
-            <w:pPr>
-              <w:spacing w:after="40" w:before="0"/>
-            </w:pPr>
+            <w:r>
+              <w:br/>
+            </w:r>
             <w:r>
               <w:rPr>
-                <w:rFonts w:ascii="맑은 고딕" w:hAnsi="맑은 고딕" w:eastAsia="맑은 고딕"/>
                 <w:b w:val="0"/>
                 <w:sz w:val="20"/>
               </w:rPr>
-              <w:t>3. Workload(Camera/AI)는 전송 중 데이터 무결성 검증이 실패하면 데이터를 폐기하고 재전송을 요청한다</w:t>
+              <w:t>3. 시스템은 권한이 없는 도메인의 DMABUF 접근 요청을 거부하고 보안 이벤트를 기록한다</w:t>
             </w:r>
           </w:p>
         </w:tc>
       </w:tr>
     </w:tbl>
-    <w:p/>
+    <w:p>
+      <w:pPr>
+        <w:spacing w:after="0"/>
+      </w:pPr>
+    </w:p>
     <w:tbl>
       <w:tblPr>
         <w:tblW w:type="auto" w:w="0"/>
         <w:tblLayout w:type="fixed"/>
         <w:tblLook w:firstColumn="1" w:firstRow="1" w:lastColumn="0" w:lastRow="0" w:noHBand="0" w:noVBand="1" w:val="04A0"/>
+        <w:tblBorders>
+          <w:top w:val="single" w:sz="8" w:space="0" w:color="000000"/>
+          <w:left w:val="single" w:sz="8" w:space="0" w:color="000000"/>
+          <w:bottom w:val="single" w:sz="8" w:space="0" w:color="000000"/>
+          <w:right w:val="single" w:sz="8" w:space="0" w:color="000000"/>
+          <w:insideH w:val="single" w:sz="8" w:space="0" w:color="000000"/>
+          <w:insideV w:val="single" w:sz="8" w:space="0" w:color="000000"/>
+        </w:tblBorders>
       </w:tblPr>
       <w:tblGrid>
-        <w:gridCol w:w="4320"/>
-        <w:gridCol w:w="4320"/>
+        <w:gridCol w:w="1871"/>
+        <w:gridCol w:w="7937"/>
       </w:tblGrid>
       <w:tr>
         <w:tc>
           <w:tcPr>
-            <w:tcW w:type="dxa" w:w="2200"/>
-            <w:shd w:val="clear" w:color="auto" w:fill="D9E2F3"/>
-            <w:tcBorders>
-              <w:top w:val="single" w:sz="8" w:space="0" w:color="000000"/>
-              <w:left w:val="single" w:sz="8" w:space="0" w:color="000000"/>
-              <w:bottom w:val="single" w:sz="8" w:space="0" w:color="000000"/>
-              <w:right w:val="single" w:sz="8" w:space="0" w:color="000000"/>
-            </w:tcBorders>
+            <w:tcW w:type="dxa" w:w="1871"/>
+            <w:vAlign w:val="center"/>
+            <w:shd w:fill="D9EAF7"/>
           </w:tcPr>
           <w:p>
             <w:pPr>
-              <w:spacing w:after="40" w:before="0"/>
+              <w:spacing w:after="0"/>
             </w:pPr>
+            <w:r/>
             <w:r>
               <w:rPr>
-                <w:rFonts w:ascii="맑은 고딕" w:hAnsi="맑은 고딕" w:eastAsia="맑은 고딕"/>
-                <w:b/>
-                <w:sz w:val="20"/>
-              </w:rPr>
-              <w:t>UC-05</w:t>
-            </w:r>
-          </w:p>
-        </w:tc>
-        <w:tc>
-          <w:tcPr>
-            <w:tcW w:type="dxa" w:w="7200"/>
-            <w:shd w:val="clear" w:color="auto" w:fill="D9E2F3"/>
-            <w:tcBorders>
-              <w:top w:val="single" w:sz="8" w:space="0" w:color="000000"/>
-              <w:left w:val="single" w:sz="8" w:space="0" w:color="000000"/>
-              <w:bottom w:val="single" w:sz="8" w:space="0" w:color="000000"/>
-              <w:right w:val="single" w:sz="8" w:space="0" w:color="000000"/>
-            </w:tcBorders>
-          </w:tcPr>
-          <w:p>
-            <w:pPr>
-              <w:spacing w:after="40" w:before="0"/>
-            </w:pPr>
-            <w:r>
-              <w:rPr>
-                <w:rFonts w:ascii="맑은 고딕" w:hAnsi="맑은 고딕" w:eastAsia="맑은 고딕"/>
-                <w:b/>
-                <w:sz w:val="20"/>
-              </w:rPr>
-              <w:t>보안 Workload 동적 탑재</w:t>
-            </w:r>
-          </w:p>
-        </w:tc>
-      </w:tr>
-      <w:tr>
-        <w:tc>
-          <w:tcPr>
-            <w:tcW w:type="dxa" w:w="2200"/>
-            <w:shd w:val="clear" w:color="auto" w:fill="F2F2F2"/>
-            <w:tcBorders>
-              <w:top w:val="single" w:sz="8" w:space="0" w:color="000000"/>
-              <w:left w:val="single" w:sz="8" w:space="0" w:color="000000"/>
-              <w:bottom w:val="single" w:sz="8" w:space="0" w:color="000000"/>
-              <w:right w:val="single" w:sz="8" w:space="0" w:color="000000"/>
-            </w:tcBorders>
-          </w:tcPr>
-          <w:p>
-            <w:pPr>
-              <w:spacing w:after="40" w:before="0"/>
-            </w:pPr>
-            <w:r>
-              <w:rPr>
-                <w:rFonts w:ascii="맑은 고딕" w:hAnsi="맑은 고딕" w:eastAsia="맑은 고딕"/>
-                <w:b/>
-                <w:sz w:val="20"/>
-              </w:rPr>
-              <w:t>Actor</w:t>
-            </w:r>
-          </w:p>
-        </w:tc>
-        <w:tc>
-          <w:tcPr>
-            <w:tcW w:type="dxa" w:w="7200"/>
-            <w:tcBorders>
-              <w:top w:val="single" w:sz="8" w:space="0" w:color="000000"/>
-              <w:left w:val="single" w:sz="8" w:space="0" w:color="000000"/>
-              <w:bottom w:val="single" w:sz="8" w:space="0" w:color="000000"/>
-              <w:right w:val="single" w:sz="8" w:space="0" w:color="000000"/>
-            </w:tcBorders>
-          </w:tcPr>
-          <w:p>
-            <w:pPr>
-              <w:spacing w:after="40" w:before="0"/>
-            </w:pPr>
-            <w:r>
-              <w:rPr>
-                <w:rFonts w:ascii="맑은 고딕" w:hAnsi="맑은 고딕" w:eastAsia="맑은 고딕"/>
-                <w:b w:val="0"/>
-                <w:sz w:val="20"/>
-              </w:rPr>
-              <w:t>Host Application</w:t>
-            </w:r>
-          </w:p>
-        </w:tc>
-      </w:tr>
-      <w:tr>
-        <w:tc>
-          <w:tcPr>
-            <w:tcW w:type="dxa" w:w="2200"/>
-            <w:shd w:val="clear" w:color="auto" w:fill="F2F2F2"/>
-            <w:tcBorders>
-              <w:top w:val="single" w:sz="8" w:space="0" w:color="000000"/>
-              <w:left w:val="single" w:sz="8" w:space="0" w:color="000000"/>
-              <w:bottom w:val="single" w:sz="8" w:space="0" w:color="000000"/>
-              <w:right w:val="single" w:sz="8" w:space="0" w:color="000000"/>
-            </w:tcBorders>
-          </w:tcPr>
-          <w:p>
-            <w:pPr>
-              <w:spacing w:after="40" w:before="0"/>
-            </w:pPr>
-            <w:r>
-              <w:rPr>
-                <w:rFonts w:ascii="맑은 고딕" w:hAnsi="맑은 고딕" w:eastAsia="맑은 고딕"/>
-                <w:b/>
-                <w:sz w:val="20"/>
-              </w:rPr>
-              <w:t>Pre-Condition</w:t>
-            </w:r>
-          </w:p>
-        </w:tc>
-        <w:tc>
-          <w:tcPr>
-            <w:tcW w:type="dxa" w:w="7200"/>
-            <w:tcBorders>
-              <w:top w:val="single" w:sz="8" w:space="0" w:color="000000"/>
-              <w:left w:val="single" w:sz="8" w:space="0" w:color="000000"/>
-              <w:bottom w:val="single" w:sz="8" w:space="0" w:color="000000"/>
-              <w:right w:val="single" w:sz="8" w:space="0" w:color="000000"/>
-            </w:tcBorders>
-          </w:tcPr>
-          <w:p>
-            <w:pPr>
-              <w:spacing w:after="40" w:before="0"/>
-            </w:pPr>
-            <w:r>
-              <w:rPr>
-                <w:rFonts w:ascii="맑은 고딕" w:hAnsi="맑은 고딕" w:eastAsia="맑은 고딕"/>
-                <w:b w:val="0"/>
-                <w:sz w:val="20"/>
-              </w:rPr>
-              <w:t>플랫폼이 실행 중이고 신규 Workload 이미지가 서명되어 있다</w:t>
-            </w:r>
-          </w:p>
-        </w:tc>
-      </w:tr>
-      <w:tr>
-        <w:tc>
-          <w:tcPr>
-            <w:tcW w:type="dxa" w:w="2200"/>
-            <w:shd w:val="clear" w:color="auto" w:fill="F2F2F2"/>
-            <w:tcBorders>
-              <w:top w:val="single" w:sz="8" w:space="0" w:color="000000"/>
-              <w:left w:val="single" w:sz="8" w:space="0" w:color="000000"/>
-              <w:bottom w:val="single" w:sz="8" w:space="0" w:color="000000"/>
-              <w:right w:val="single" w:sz="8" w:space="0" w:color="000000"/>
-            </w:tcBorders>
-          </w:tcPr>
-          <w:p>
-            <w:pPr>
-              <w:spacing w:after="40" w:before="0"/>
-            </w:pPr>
-            <w:r>
-              <w:rPr>
-                <w:rFonts w:ascii="맑은 고딕" w:hAnsi="맑은 고딕" w:eastAsia="맑은 고딕"/>
-                <w:b/>
-                <w:sz w:val="20"/>
-              </w:rPr>
-              <w:t>Post-Condition</w:t>
-            </w:r>
-          </w:p>
-        </w:tc>
-        <w:tc>
-          <w:tcPr>
-            <w:tcW w:type="dxa" w:w="7200"/>
-            <w:tcBorders>
-              <w:top w:val="single" w:sz="8" w:space="0" w:color="000000"/>
-              <w:left w:val="single" w:sz="8" w:space="0" w:color="000000"/>
-              <w:bottom w:val="single" w:sz="8" w:space="0" w:color="000000"/>
-              <w:right w:val="single" w:sz="8" w:space="0" w:color="000000"/>
-            </w:tcBorders>
-          </w:tcPr>
-          <w:p>
-            <w:pPr>
-              <w:spacing w:after="40" w:before="0"/>
-            </w:pPr>
-            <w:r>
-              <w:rPr>
-                <w:rFonts w:ascii="맑은 고딕" w:hAnsi="맑은 고딕" w:eastAsia="맑은 고딕"/>
-                <w:b w:val="0"/>
-                <w:sz w:val="20"/>
-              </w:rPr>
-              <w:t>신규 보안 Workload가 펌웨어 재배포 없이 격리 환경에서 실행 중이다</w:t>
-            </w:r>
-          </w:p>
-        </w:tc>
-      </w:tr>
-      <w:tr>
-        <w:tc>
-          <w:tcPr>
-            <w:tcW w:type="dxa" w:w="2200"/>
-            <w:shd w:val="clear" w:color="auto" w:fill="F2F2F2"/>
-            <w:tcBorders>
-              <w:top w:val="single" w:sz="8" w:space="0" w:color="000000"/>
-              <w:left w:val="single" w:sz="8" w:space="0" w:color="000000"/>
-              <w:bottom w:val="single" w:sz="8" w:space="0" w:color="000000"/>
-              <w:right w:val="single" w:sz="8" w:space="0" w:color="000000"/>
-            </w:tcBorders>
-          </w:tcPr>
-          <w:p>
-            <w:pPr>
-              <w:spacing w:after="40" w:before="0"/>
-            </w:pPr>
-            <w:r>
-              <w:rPr>
-                <w:rFonts w:ascii="맑은 고딕" w:hAnsi="맑은 고딕" w:eastAsia="맑은 고딕"/>
-                <w:b/>
-                <w:sz w:val="20"/>
-              </w:rPr>
-              <w:t>Main Flow</w:t>
-            </w:r>
-          </w:p>
-        </w:tc>
-        <w:tc>
-          <w:tcPr>
-            <w:tcW w:type="dxa" w:w="7200"/>
-            <w:tcBorders>
-              <w:top w:val="single" w:sz="8" w:space="0" w:color="000000"/>
-              <w:left w:val="single" w:sz="8" w:space="0" w:color="000000"/>
-              <w:bottom w:val="single" w:sz="8" w:space="0" w:color="000000"/>
-              <w:right w:val="single" w:sz="8" w:space="0" w:color="000000"/>
-            </w:tcBorders>
-          </w:tcPr>
-          <w:p>
-            <w:pPr>
-              <w:spacing w:after="40" w:before="0"/>
-            </w:pPr>
-            <w:r>
-              <w:rPr>
-                <w:rFonts w:ascii="맑은 고딕" w:hAnsi="맑은 고딕" w:eastAsia="맑은 고딕"/>
-                <w:b w:val="0"/>
-                <w:sz w:val="20"/>
-              </w:rPr>
-              <w:t>1. Host Application이 신규 보안 Workload 이미지를 pVM 관리 API에 전달한다</w:t>
-            </w:r>
-          </w:p>
-          <w:p>
-            <w:pPr>
-              <w:spacing w:after="40" w:before="0"/>
-            </w:pPr>
-            <w:r>
-              <w:rPr>
-                <w:rFonts w:ascii="맑은 고딕" w:hAnsi="맑은 고딕" w:eastAsia="맑은 고딕"/>
-                <w:b w:val="0"/>
-                <w:sz w:val="20"/>
-              </w:rPr>
-              <w:t>2. 시스템은 이미지 서명을 검증한다</w:t>
-            </w:r>
-          </w:p>
-          <w:p>
-            <w:pPr>
-              <w:spacing w:after="40" w:before="0"/>
-            </w:pPr>
-            <w:r>
-              <w:rPr>
-                <w:rFonts w:ascii="맑은 고딕" w:hAnsi="맑은 고딕" w:eastAsia="맑은 고딕"/>
-                <w:b w:val="0"/>
-                <w:sz w:val="20"/>
-              </w:rPr>
-              <w:t>3. 시스템은 새 pVM 인스턴스를 생성하고 Workload를 탑재한다</w:t>
-            </w:r>
-          </w:p>
-          <w:p>
-            <w:pPr>
-              <w:spacing w:after="40" w:before="0"/>
-            </w:pPr>
-            <w:r>
-              <w:rPr>
-                <w:rFonts w:ascii="맑은 고딕" w:hAnsi="맑은 고딕" w:eastAsia="맑은 고딕"/>
-                <w:b w:val="0"/>
-                <w:sz w:val="20"/>
-              </w:rPr>
-              <w:t>4. 시스템은 새 Workload를 기존 pVM들과 독립적으로 실행한다</w:t>
-            </w:r>
-          </w:p>
-        </w:tc>
-      </w:tr>
-      <w:tr>
-        <w:tc>
-          <w:tcPr>
-            <w:tcW w:type="dxa" w:w="2200"/>
-            <w:shd w:val="clear" w:color="auto" w:fill="F2F2F2"/>
-            <w:tcBorders>
-              <w:top w:val="single" w:sz="8" w:space="0" w:color="000000"/>
-              <w:left w:val="single" w:sz="8" w:space="0" w:color="000000"/>
-              <w:bottom w:val="single" w:sz="8" w:space="0" w:color="000000"/>
-              <w:right w:val="single" w:sz="8" w:space="0" w:color="000000"/>
-            </w:tcBorders>
-          </w:tcPr>
-          <w:p>
-            <w:pPr>
-              <w:spacing w:after="40" w:before="0"/>
-            </w:pPr>
-            <w:r>
-              <w:rPr>
-                <w:rFonts w:ascii="맑은 고딕" w:hAnsi="맑은 고딕" w:eastAsia="맑은 고딕"/>
-                <w:b/>
-                <w:sz w:val="20"/>
-              </w:rPr>
-              <w:t>Alternative Flow</w:t>
-            </w:r>
-          </w:p>
-        </w:tc>
-        <w:tc>
-          <w:tcPr>
-            <w:tcW w:type="dxa" w:w="7200"/>
-            <w:tcBorders>
-              <w:top w:val="single" w:sz="8" w:space="0" w:color="000000"/>
-              <w:left w:val="single" w:sz="8" w:space="0" w:color="000000"/>
-              <w:bottom w:val="single" w:sz="8" w:space="0" w:color="000000"/>
-              <w:right w:val="single" w:sz="8" w:space="0" w:color="000000"/>
-            </w:tcBorders>
-          </w:tcPr>
-          <w:p>
-            <w:pPr>
-              <w:spacing w:after="40" w:before="0"/>
-            </w:pPr>
-            <w:r>
-              <w:rPr>
-                <w:rFonts w:ascii="맑은 고딕" w:hAnsi="맑은 고딕" w:eastAsia="맑은 고딕"/>
-                <w:b w:val="0"/>
-                <w:sz w:val="20"/>
-              </w:rPr>
-              <w:t>1. 시스템은 서명 검증 실패 시 탑재를 중단하고 Host Application에 오류를 반환한다</w:t>
-            </w:r>
-          </w:p>
-          <w:p>
-            <w:pPr>
-              <w:spacing w:after="40" w:before="0"/>
-            </w:pPr>
-            <w:r>
-              <w:rPr>
-                <w:rFonts w:ascii="맑은 고딕" w:hAnsi="맑은 고딕" w:eastAsia="맑은 고딕"/>
-                <w:b w:val="0"/>
-                <w:sz w:val="20"/>
-              </w:rPr>
-              <w:t>2. 시스템은 Workload 이미지 형식이 지원되지 않으면 pVM 생성을 수행하지 않고 Host Application에 오류를 반환한다</w:t>
-            </w:r>
-          </w:p>
-          <w:p>
-            <w:pPr>
-              <w:spacing w:after="40" w:before="0"/>
-            </w:pPr>
-            <w:r>
-              <w:rPr>
-                <w:rFonts w:ascii="맑은 고딕" w:hAnsi="맑은 고딕" w:eastAsia="맑은 고딕"/>
-                <w:b w:val="0"/>
-                <w:sz w:val="20"/>
-              </w:rPr>
-              <w:t>3. 시스템은 신규 Workload에 필요한 자원이 부족하면 기존 pVM 상태를 유지하고 탑재 요청을 실패 처리한다</w:t>
-            </w:r>
-          </w:p>
-        </w:tc>
-      </w:tr>
-    </w:tbl>
-    <w:p/>
-    <w:tbl>
-      <w:tblPr>
-        <w:tblW w:type="auto" w:w="0"/>
-        <w:tblLayout w:type="fixed"/>
-        <w:tblLook w:firstColumn="1" w:firstRow="1" w:lastColumn="0" w:lastRow="0" w:noHBand="0" w:noVBand="1" w:val="04A0"/>
-      </w:tblPr>
-      <w:tblGrid>
-        <w:gridCol w:w="4320"/>
-        <w:gridCol w:w="4320"/>
-      </w:tblGrid>
-      <w:tr>
-        <w:tc>
-          <w:tcPr>
-            <w:tcW w:type="dxa" w:w="2200"/>
-            <w:shd w:val="clear" w:color="auto" w:fill="D9E2F3"/>
-            <w:tcBorders>
-              <w:top w:val="single" w:sz="8" w:space="0" w:color="000000"/>
-              <w:left w:val="single" w:sz="8" w:space="0" w:color="000000"/>
-              <w:bottom w:val="single" w:sz="8" w:space="0" w:color="000000"/>
-              <w:right w:val="single" w:sz="8" w:space="0" w:color="000000"/>
-            </w:tcBorders>
-          </w:tcPr>
-          <w:p>
-            <w:pPr>
-              <w:spacing w:after="40" w:before="0"/>
-            </w:pPr>
-            <w:r>
-              <w:rPr>
-                <w:rFonts w:ascii="맑은 고딕" w:hAnsi="맑은 고딕" w:eastAsia="맑은 고딕"/>
                 <w:b/>
                 <w:sz w:val="20"/>
               </w:rPr>
@@ -2050,22 +1720,17 @@
         </w:tc>
         <w:tc>
           <w:tcPr>
-            <w:tcW w:type="dxa" w:w="7200"/>
-            <w:shd w:val="clear" w:color="auto" w:fill="D9E2F3"/>
-            <w:tcBorders>
-              <w:top w:val="single" w:sz="8" w:space="0" w:color="000000"/>
-              <w:left w:val="single" w:sz="8" w:space="0" w:color="000000"/>
-              <w:bottom w:val="single" w:sz="8" w:space="0" w:color="000000"/>
-              <w:right w:val="single" w:sz="8" w:space="0" w:color="000000"/>
-            </w:tcBorders>
+            <w:tcW w:type="dxa" w:w="7937"/>
+            <w:vAlign w:val="center"/>
+            <w:shd w:fill="D9EAF7"/>
           </w:tcPr>
           <w:p>
             <w:pPr>
-              <w:spacing w:after="40" w:before="0"/>
+              <w:spacing w:after="0"/>
             </w:pPr>
+            <w:r/>
             <w:r>
               <w:rPr>
-                <w:rFonts w:ascii="맑은 고딕" w:hAnsi="맑은 고딕" w:eastAsia="맑은 고딕"/>
                 <w:b/>
                 <w:sz w:val="20"/>
               </w:rPr>
@@ -2077,22 +1742,17 @@
       <w:tr>
         <w:tc>
           <w:tcPr>
-            <w:tcW w:type="dxa" w:w="2200"/>
-            <w:shd w:val="clear" w:color="auto" w:fill="F2F2F2"/>
-            <w:tcBorders>
-              <w:top w:val="single" w:sz="8" w:space="0" w:color="000000"/>
-              <w:left w:val="single" w:sz="8" w:space="0" w:color="000000"/>
-              <w:bottom w:val="single" w:sz="8" w:space="0" w:color="000000"/>
-              <w:right w:val="single" w:sz="8" w:space="0" w:color="000000"/>
-            </w:tcBorders>
+            <w:tcW w:type="dxa" w:w="1871"/>
+            <w:vAlign w:val="center"/>
+            <w:shd w:fill="EDEDED"/>
           </w:tcPr>
           <w:p>
             <w:pPr>
-              <w:spacing w:after="40" w:before="0"/>
+              <w:spacing w:after="0"/>
             </w:pPr>
+            <w:r/>
             <w:r>
               <w:rPr>
-                <w:rFonts w:ascii="맑은 고딕" w:hAnsi="맑은 고딕" w:eastAsia="맑은 고딕"/>
                 <w:b/>
                 <w:sz w:val="20"/>
               </w:rPr>
@@ -2102,21 +1762,16 @@
         </w:tc>
         <w:tc>
           <w:tcPr>
-            <w:tcW w:type="dxa" w:w="7200"/>
-            <w:tcBorders>
-              <w:top w:val="single" w:sz="8" w:space="0" w:color="000000"/>
-              <w:left w:val="single" w:sz="8" w:space="0" w:color="000000"/>
-              <w:bottom w:val="single" w:sz="8" w:space="0" w:color="000000"/>
-              <w:right w:val="single" w:sz="8" w:space="0" w:color="000000"/>
-            </w:tcBorders>
+            <w:tcW w:type="dxa" w:w="7937"/>
+            <w:vAlign w:val="center"/>
           </w:tcPr>
           <w:p>
             <w:pPr>
-              <w:spacing w:after="40" w:before="0"/>
+              <w:spacing w:after="0"/>
             </w:pPr>
+            <w:r/>
             <w:r>
               <w:rPr>
-                <w:rFonts w:ascii="맑은 고딕" w:hAnsi="맑은 고딕" w:eastAsia="맑은 고딕"/>
                 <w:b w:val="0"/>
                 <w:sz w:val="20"/>
               </w:rPr>
@@ -2128,22 +1783,17 @@
       <w:tr>
         <w:tc>
           <w:tcPr>
-            <w:tcW w:type="dxa" w:w="2200"/>
-            <w:shd w:val="clear" w:color="auto" w:fill="F2F2F2"/>
-            <w:tcBorders>
-              <w:top w:val="single" w:sz="8" w:space="0" w:color="000000"/>
-              <w:left w:val="single" w:sz="8" w:space="0" w:color="000000"/>
-              <w:bottom w:val="single" w:sz="8" w:space="0" w:color="000000"/>
-              <w:right w:val="single" w:sz="8" w:space="0" w:color="000000"/>
-            </w:tcBorders>
+            <w:tcW w:type="dxa" w:w="1871"/>
+            <w:vAlign w:val="center"/>
+            <w:shd w:fill="EDEDED"/>
           </w:tcPr>
           <w:p>
             <w:pPr>
-              <w:spacing w:after="40" w:before="0"/>
+              <w:spacing w:after="0"/>
             </w:pPr>
+            <w:r/>
             <w:r>
               <w:rPr>
-                <w:rFonts w:ascii="맑은 고딕" w:hAnsi="맑은 고딕" w:eastAsia="맑은 고딕"/>
                 <w:b/>
                 <w:sz w:val="20"/>
               </w:rPr>
@@ -2153,21 +1803,16 @@
         </w:tc>
         <w:tc>
           <w:tcPr>
-            <w:tcW w:type="dxa" w:w="7200"/>
-            <w:tcBorders>
-              <w:top w:val="single" w:sz="8" w:space="0" w:color="000000"/>
-              <w:left w:val="single" w:sz="8" w:space="0" w:color="000000"/>
-              <w:bottom w:val="single" w:sz="8" w:space="0" w:color="000000"/>
-              <w:right w:val="single" w:sz="8" w:space="0" w:color="000000"/>
-            </w:tcBorders>
+            <w:tcW w:type="dxa" w:w="7937"/>
+            <w:vAlign w:val="center"/>
           </w:tcPr>
           <w:p>
             <w:pPr>
-              <w:spacing w:after="40" w:before="0"/>
+              <w:spacing w:after="0"/>
             </w:pPr>
+            <w:r/>
             <w:r>
               <w:rPr>
-                <w:rFonts w:ascii="맑은 고딕" w:hAnsi="맑은 고딕" w:eastAsia="맑은 고딕"/>
                 <w:b w:val="0"/>
                 <w:sz w:val="20"/>
               </w:rPr>
@@ -2179,22 +1824,17 @@
       <w:tr>
         <w:tc>
           <w:tcPr>
-            <w:tcW w:type="dxa" w:w="2200"/>
-            <w:shd w:val="clear" w:color="auto" w:fill="F2F2F2"/>
-            <w:tcBorders>
-              <w:top w:val="single" w:sz="8" w:space="0" w:color="000000"/>
-              <w:left w:val="single" w:sz="8" w:space="0" w:color="000000"/>
-              <w:bottom w:val="single" w:sz="8" w:space="0" w:color="000000"/>
-              <w:right w:val="single" w:sz="8" w:space="0" w:color="000000"/>
-            </w:tcBorders>
+            <w:tcW w:type="dxa" w:w="1871"/>
+            <w:vAlign w:val="center"/>
+            <w:shd w:fill="EDEDED"/>
           </w:tcPr>
           <w:p>
             <w:pPr>
-              <w:spacing w:after="40" w:before="0"/>
+              <w:spacing w:after="0"/>
             </w:pPr>
+            <w:r/>
             <w:r>
               <w:rPr>
-                <w:rFonts w:ascii="맑은 고딕" w:hAnsi="맑은 고딕" w:eastAsia="맑은 고딕"/>
                 <w:b/>
                 <w:sz w:val="20"/>
               </w:rPr>
@@ -2204,21 +1844,16 @@
         </w:tc>
         <w:tc>
           <w:tcPr>
-            <w:tcW w:type="dxa" w:w="7200"/>
-            <w:tcBorders>
-              <w:top w:val="single" w:sz="8" w:space="0" w:color="000000"/>
-              <w:left w:val="single" w:sz="8" w:space="0" w:color="000000"/>
-              <w:bottom w:val="single" w:sz="8" w:space="0" w:color="000000"/>
-              <w:right w:val="single" w:sz="8" w:space="0" w:color="000000"/>
-            </w:tcBorders>
+            <w:tcW w:type="dxa" w:w="7937"/>
+            <w:vAlign w:val="center"/>
           </w:tcPr>
           <w:p>
             <w:pPr>
-              <w:spacing w:after="40" w:before="0"/>
+              <w:spacing w:after="0"/>
             </w:pPr>
+            <w:r/>
             <w:r>
               <w:rPr>
-                <w:rFonts w:ascii="맑은 고딕" w:hAnsi="맑은 고딕" w:eastAsia="맑은 고딕"/>
                 <w:b w:val="0"/>
                 <w:sz w:val="20"/>
               </w:rPr>
@@ -2230,22 +1865,17 @@
       <w:tr>
         <w:tc>
           <w:tcPr>
-            <w:tcW w:type="dxa" w:w="2200"/>
-            <w:shd w:val="clear" w:color="auto" w:fill="F2F2F2"/>
-            <w:tcBorders>
-              <w:top w:val="single" w:sz="8" w:space="0" w:color="000000"/>
-              <w:left w:val="single" w:sz="8" w:space="0" w:color="000000"/>
-              <w:bottom w:val="single" w:sz="8" w:space="0" w:color="000000"/>
-              <w:right w:val="single" w:sz="8" w:space="0" w:color="000000"/>
-            </w:tcBorders>
+            <w:tcW w:type="dxa" w:w="1871"/>
+            <w:vAlign w:val="center"/>
+            <w:shd w:fill="EDEDED"/>
           </w:tcPr>
           <w:p>
             <w:pPr>
-              <w:spacing w:after="40" w:before="0"/>
+              <w:spacing w:after="0"/>
             </w:pPr>
+            <w:r/>
             <w:r>
               <w:rPr>
-                <w:rFonts w:ascii="맑은 고딕" w:hAnsi="맑은 고딕" w:eastAsia="맑은 고딕"/>
                 <w:b/>
                 <w:sz w:val="20"/>
               </w:rPr>
@@ -2255,60 +1885,46 @@
         </w:tc>
         <w:tc>
           <w:tcPr>
-            <w:tcW w:type="dxa" w:w="7200"/>
-            <w:tcBorders>
-              <w:top w:val="single" w:sz="8" w:space="0" w:color="000000"/>
-              <w:left w:val="single" w:sz="8" w:space="0" w:color="000000"/>
-              <w:bottom w:val="single" w:sz="8" w:space="0" w:color="000000"/>
-              <w:right w:val="single" w:sz="8" w:space="0" w:color="000000"/>
-            </w:tcBorders>
+            <w:tcW w:type="dxa" w:w="7937"/>
+            <w:vAlign w:val="center"/>
           </w:tcPr>
           <w:p>
             <w:pPr>
-              <w:spacing w:after="40" w:before="0"/>
+              <w:spacing w:after="0"/>
             </w:pPr>
+            <w:r/>
             <w:r>
               <w:rPr>
-                <w:rFonts w:ascii="맑은 고딕" w:hAnsi="맑은 고딕" w:eastAsia="맑은 고딕"/>
                 <w:b w:val="0"/>
                 <w:sz w:val="20"/>
               </w:rPr>
               <w:t>1. Workload(Camera/AI)가 Secure OS에 ENC/DEC 명령과 대상 데이터를 전달한다</w:t>
             </w:r>
-          </w:p>
-          <w:p>
-            <w:pPr>
-              <w:spacing w:after="40" w:before="0"/>
-            </w:pPr>
+            <w:r>
+              <w:br/>
+            </w:r>
             <w:r>
               <w:rPr>
-                <w:rFonts w:ascii="맑은 고딕" w:hAnsi="맑은 고딕" w:eastAsia="맑은 고딕"/>
                 <w:b w:val="0"/>
                 <w:sz w:val="20"/>
               </w:rPr>
               <w:t>2. 시스템은 Secure OS를 통해 데이터를 암호화 또는 복호화한다</w:t>
             </w:r>
-          </w:p>
-          <w:p>
-            <w:pPr>
-              <w:spacing w:after="40" w:before="0"/>
-            </w:pPr>
+            <w:r>
+              <w:br/>
+            </w:r>
             <w:r>
               <w:rPr>
-                <w:rFonts w:ascii="맑은 고딕" w:hAnsi="맑은 고딕" w:eastAsia="맑은 고딕"/>
                 <w:b w:val="0"/>
                 <w:sz w:val="20"/>
               </w:rPr>
               <w:t>3. 시스템은 처리된 데이터를 Workload(Camera/AI)에 반환한다</w:t>
             </w:r>
-          </w:p>
-          <w:p>
-            <w:pPr>
-              <w:spacing w:after="40" w:before="0"/>
-            </w:pPr>
+            <w:r>
+              <w:br/>
+            </w:r>
             <w:r>
               <w:rPr>
-                <w:rFonts w:ascii="맑은 고딕" w:hAnsi="맑은 고딕" w:eastAsia="맑은 고딕"/>
                 <w:b w:val="0"/>
                 <w:sz w:val="20"/>
               </w:rPr>
@@ -2320,22 +1936,17 @@
       <w:tr>
         <w:tc>
           <w:tcPr>
-            <w:tcW w:type="dxa" w:w="2200"/>
-            <w:shd w:val="clear" w:color="auto" w:fill="F2F2F2"/>
-            <w:tcBorders>
-              <w:top w:val="single" w:sz="8" w:space="0" w:color="000000"/>
-              <w:left w:val="single" w:sz="8" w:space="0" w:color="000000"/>
-              <w:bottom w:val="single" w:sz="8" w:space="0" w:color="000000"/>
-              <w:right w:val="single" w:sz="8" w:space="0" w:color="000000"/>
-            </w:tcBorders>
+            <w:tcW w:type="dxa" w:w="1871"/>
+            <w:vAlign w:val="center"/>
+            <w:shd w:fill="EDEDED"/>
           </w:tcPr>
           <w:p>
             <w:pPr>
-              <w:spacing w:after="40" w:before="0"/>
+              <w:spacing w:after="0"/>
             </w:pPr>
+            <w:r/>
             <w:r>
               <w:rPr>
-                <w:rFonts w:ascii="맑은 고딕" w:hAnsi="맑은 고딕" w:eastAsia="맑은 고딕"/>
                 <w:b/>
                 <w:sz w:val="20"/>
               </w:rPr>
@@ -2345,47 +1956,36 @@
         </w:tc>
         <w:tc>
           <w:tcPr>
-            <w:tcW w:type="dxa" w:w="7200"/>
-            <w:tcBorders>
-              <w:top w:val="single" w:sz="8" w:space="0" w:color="000000"/>
-              <w:left w:val="single" w:sz="8" w:space="0" w:color="000000"/>
-              <w:bottom w:val="single" w:sz="8" w:space="0" w:color="000000"/>
-              <w:right w:val="single" w:sz="8" w:space="0" w:color="000000"/>
-            </w:tcBorders>
+            <w:tcW w:type="dxa" w:w="7937"/>
+            <w:vAlign w:val="center"/>
           </w:tcPr>
           <w:p>
             <w:pPr>
-              <w:spacing w:after="40" w:before="0"/>
+              <w:spacing w:after="0"/>
             </w:pPr>
+            <w:r/>
             <w:r>
               <w:rPr>
-                <w:rFonts w:ascii="맑은 고딕" w:hAnsi="맑은 고딕" w:eastAsia="맑은 고딕"/>
                 <w:b w:val="0"/>
                 <w:sz w:val="20"/>
               </w:rPr>
               <w:t>1. 시스템은 ENC/DEC 실패 시 오류를 반환하고 평문 데이터는 pVM 외부로 유출하지 않는다</w:t>
             </w:r>
-          </w:p>
-          <w:p>
-            <w:pPr>
-              <w:spacing w:after="40" w:before="0"/>
-            </w:pPr>
+            <w:r>
+              <w:br/>
+            </w:r>
             <w:r>
               <w:rPr>
-                <w:rFonts w:ascii="맑은 고딕" w:hAnsi="맑은 고딕" w:eastAsia="맑은 고딕"/>
                 <w:b w:val="0"/>
                 <w:sz w:val="20"/>
               </w:rPr>
               <w:t>2. 시스템은 Secure OS가 응답하지 않으면 요청을 시간 초과 처리하고 세션을 정리한다</w:t>
             </w:r>
-          </w:p>
-          <w:p>
-            <w:pPr>
-              <w:spacing w:after="40" w:before="0"/>
-            </w:pPr>
+            <w:r>
+              <w:br/>
+            </w:r>
             <w:r>
               <w:rPr>
-                <w:rFonts w:ascii="맑은 고딕" w:hAnsi="맑은 고딕" w:eastAsia="맑은 고딕"/>
                 <w:b w:val="0"/>
                 <w:sz w:val="20"/>
               </w:rPr>
@@ -2397,7 +1997,7 @@
     </w:tbl>
     <w:sectPr>
       <w:pgSz w:w="12240" w:h="15840"/>
-      <w:pgMar w:top="1440" w:right="1800" w:bottom="1440" w:left="1800" w:header="720" w:footer="720" w:gutter="0"/>
+      <w:pgMar w:top="1020" w:right="1020" w:bottom="1020" w:left="1020" w:header="720" w:footer="720" w:gutter="0"/>
       <w:cols w:space="720"/>
       <w:docGrid w:linePitch="360"/>
     </w:sectPr>
@@ -2769,7 +2369,7 @@
     <w:qFormat/>
     <w:rsid w:val="00FC693F"/>
     <w:rPr>
-      <w:rFonts w:ascii="맑은 고딕" w:hAnsi="맑은 고딕" w:eastAsia="맑은 고딕"/>
+      <w:rFonts w:ascii="Malgun Gothic" w:hAnsi="Malgun Gothic" w:eastAsia="맑은 고딕"/>
       <w:sz w:val="20"/>
     </w:rPr>
   </w:style>

</xml_diff>